<commit_message>
Docs: guide and architecture note describe the independent admin, lawyer and client sign-ins (Gmail or mobile OTP, registered staff only), the Team page access panel, the Community page, the five home slides and the phone layouts
Co-Authored-By: Claude Opus 5.5 <noreply@anthropic.com>
</commit_message>
<xml_diff>
--- a/docs/ADOORA-System-Guide.docx
+++ b/docs/ADOORA-System-Guide.docx
@@ -62,7 +62,7 @@
         <w:spacing w:after="120"/>
       </w:pPr>
       <w:r>
-        <w:t>Status as of: 29 September 2026</w:t>
+        <w:t>Status as of: 1 October 2026</w:t>
       </w:r>
     </w:p>
     <w:p>
@@ -96,7 +96,7 @@
     <w:sdt>
       <w:sdtPr>
         <w:alias w:val="Contents"/>
-        <w:id w:val="465635144"/>
+        <w:id w:val="630220383"/>
       </w:sdtPr>
       <w:sdtEndPr/>
       <w:sdtContent>
@@ -125,7 +125,7 @@
           <w:r>
             <w:fldChar w:fldCharType="separate"/>
           </w:r>
-          <w:hyperlink w:anchor="_Toc241612361" w:history="1">
+          <w:hyperlink w:anchor="_Toc241788987" w:history="1">
             <w:r>
               <w:rPr>
                 <w:rStyle w:val="Hyperlink"/>
@@ -149,7 +149,7 @@
               <w:rPr>
                 <w:noProof/>
               </w:rPr>
-              <w:instrText xml:space="preserve"> PAGEREF _Toc241612361 \h </w:instrText>
+              <w:instrText xml:space="preserve"> PAGEREF _Toc241788987 \h </w:instrText>
             </w:r>
             <w:r>
               <w:rPr>
@@ -166,7 +166,7 @@
               <w:rPr>
                 <w:noProof/>
               </w:rPr>
-              <w:t>3</w:t>
+              <w:t>4</w:t>
             </w:r>
             <w:r>
               <w:rPr>
@@ -192,7 +192,7 @@
               <w14:ligatures w14:val="standardContextual"/>
             </w:rPr>
           </w:pPr>
-          <w:hyperlink w:anchor="_Toc241612362" w:history="1">
+          <w:hyperlink w:anchor="_Toc241788988" w:history="1">
             <w:r>
               <w:rPr>
                 <w:rStyle w:val="Hyperlink"/>
@@ -216,7 +216,7 @@
               <w:rPr>
                 <w:noProof/>
               </w:rPr>
-              <w:instrText xml:space="preserve"> PAGEREF _Toc241612362 \h </w:instrText>
+              <w:instrText xml:space="preserve"> PAGEREF _Toc241788988 \h </w:instrText>
             </w:r>
             <w:r>
               <w:rPr>
@@ -233,7 +233,7 @@
               <w:rPr>
                 <w:noProof/>
               </w:rPr>
-              <w:t>3</w:t>
+              <w:t>4</w:t>
             </w:r>
             <w:r>
               <w:rPr>
@@ -259,7 +259,7 @@
               <w14:ligatures w14:val="standardContextual"/>
             </w:rPr>
           </w:pPr>
-          <w:hyperlink w:anchor="_Toc241612363" w:history="1">
+          <w:hyperlink w:anchor="_Toc241788989" w:history="1">
             <w:r>
               <w:rPr>
                 <w:rStyle w:val="Hyperlink"/>
@@ -283,7 +283,7 @@
               <w:rPr>
                 <w:noProof/>
               </w:rPr>
-              <w:instrText xml:space="preserve"> PAGEREF _Toc241612363 \h </w:instrText>
+              <w:instrText xml:space="preserve"> PAGEREF _Toc241788989 \h </w:instrText>
             </w:r>
             <w:r>
               <w:rPr>
@@ -300,7 +300,7 @@
               <w:rPr>
                 <w:noProof/>
               </w:rPr>
-              <w:t>4</w:t>
+              <w:t>6</w:t>
             </w:r>
             <w:r>
               <w:rPr>
@@ -326,13 +326,13 @@
               <w14:ligatures w14:val="standardContextual"/>
             </w:rPr>
           </w:pPr>
-          <w:hyperlink w:anchor="_Toc241612364" w:history="1">
+          <w:hyperlink w:anchor="_Toc241788990" w:history="1">
             <w:r>
               <w:rPr>
                 <w:rStyle w:val="Hyperlink"/>
                 <w:noProof/>
               </w:rPr>
-              <w:t>Three separate doors</w:t>
+              <w:t>Three separate sign-ins</w:t>
             </w:r>
             <w:r>
               <w:rPr>
@@ -350,7 +350,7 @@
               <w:rPr>
                 <w:noProof/>
               </w:rPr>
-              <w:instrText xml:space="preserve"> PAGEREF _Toc241612364 \h </w:instrText>
+              <w:instrText xml:space="preserve"> PAGEREF _Toc241788990 \h </w:instrText>
             </w:r>
             <w:r>
               <w:rPr>
@@ -367,7 +367,7 @@
               <w:rPr>
                 <w:noProof/>
               </w:rPr>
-              <w:t>4</w:t>
+              <w:t>6</w:t>
             </w:r>
             <w:r>
               <w:rPr>
@@ -393,7 +393,7 @@
               <w14:ligatures w14:val="standardContextual"/>
             </w:rPr>
           </w:pPr>
-          <w:hyperlink w:anchor="_Toc241612365" w:history="1">
+          <w:hyperlink w:anchor="_Toc241788991" w:history="1">
             <w:r>
               <w:rPr>
                 <w:rStyle w:val="Hyperlink"/>
@@ -417,7 +417,7 @@
               <w:rPr>
                 <w:noProof/>
               </w:rPr>
-              <w:instrText xml:space="preserve"> PAGEREF _Toc241612365 \h </w:instrText>
+              <w:instrText xml:space="preserve"> PAGEREF _Toc241788991 \h </w:instrText>
             </w:r>
             <w:r>
               <w:rPr>
@@ -434,7 +434,7 @@
               <w:rPr>
                 <w:noProof/>
               </w:rPr>
-              <w:t>4</w:t>
+              <w:t>6</w:t>
             </w:r>
             <w:r>
               <w:rPr>
@@ -460,12 +460,79 @@
               <w14:ligatures w14:val="standardContextual"/>
             </w:rPr>
           </w:pPr>
-          <w:hyperlink w:anchor="_Toc241612366" w:history="1">
+          <w:hyperlink w:anchor="_Toc241788992" w:history="1">
             <w:r>
               <w:rPr>
                 <w:rStyle w:val="Hyperlink"/>
                 <w:noProof/>
               </w:rPr>
+              <w:t>Who can sign in: the Team page panel</w:t>
+            </w:r>
+            <w:r>
+              <w:rPr>
+                <w:noProof/>
+              </w:rPr>
+              <w:tab/>
+            </w:r>
+            <w:r>
+              <w:rPr>
+                <w:noProof/>
+              </w:rPr>
+              <w:fldChar w:fldCharType="begin"/>
+            </w:r>
+            <w:r>
+              <w:rPr>
+                <w:noProof/>
+              </w:rPr>
+              <w:instrText xml:space="preserve"> PAGEREF _Toc241788992 \h </w:instrText>
+            </w:r>
+            <w:r>
+              <w:rPr>
+                <w:noProof/>
+              </w:rPr>
+            </w:r>
+            <w:r>
+              <w:rPr>
+                <w:noProof/>
+              </w:rPr>
+              <w:fldChar w:fldCharType="separate"/>
+            </w:r>
+            <w:r>
+              <w:rPr>
+                <w:noProof/>
+              </w:rPr>
+              <w:t>7</w:t>
+            </w:r>
+            <w:r>
+              <w:rPr>
+                <w:noProof/>
+              </w:rPr>
+              <w:fldChar w:fldCharType="end"/>
+            </w:r>
+          </w:hyperlink>
+        </w:p>
+        <w:p>
+          <w:pPr>
+            <w:pStyle w:val="TOC2"/>
+            <w:tabs>
+              <w:tab w:val="right" w:leader="dot" w:pos="9296"/>
+            </w:tabs>
+            <w:rPr>
+              <w:rFonts w:asciiTheme="minorHAnsi" w:eastAsiaTheme="minorEastAsia" w:hAnsiTheme="minorHAnsi" w:cstheme="minorBidi"/>
+              <w:noProof/>
+              <w:color w:val="auto"/>
+              <w:kern w:val="2"/>
+              <w:sz w:val="24"/>
+              <w:szCs w:val="24"/>
+              <w14:ligatures w14:val="standardContextual"/>
+            </w:rPr>
+          </w:pPr>
+          <w:hyperlink w:anchor="_Toc241788993" w:history="1">
+            <w:r>
+              <w:rPr>
+                <w:rStyle w:val="Hyperlink"/>
+                <w:noProof/>
+              </w:rPr>
               <w:t>Staying signed in, and stopping access</w:t>
             </w:r>
             <w:r>
@@ -484,7 +551,7 @@
               <w:rPr>
                 <w:noProof/>
               </w:rPr>
-              <w:instrText xml:space="preserve"> PAGEREF _Toc241612366 \h </w:instrText>
+              <w:instrText xml:space="preserve"> PAGEREF _Toc241788993 \h </w:instrText>
             </w:r>
             <w:r>
               <w:rPr>
@@ -501,7 +568,7 @@
               <w:rPr>
                 <w:noProof/>
               </w:rPr>
-              <w:t>4</w:t>
+              <w:t>7</w:t>
             </w:r>
             <w:r>
               <w:rPr>
@@ -527,7 +594,7 @@
               <w14:ligatures w14:val="standardContextual"/>
             </w:rPr>
           </w:pPr>
-          <w:hyperlink w:anchor="_Toc241612367" w:history="1">
+          <w:hyperlink w:anchor="_Toc241788994" w:history="1">
             <w:r>
               <w:rPr>
                 <w:rStyle w:val="Hyperlink"/>
@@ -551,7 +618,7 @@
               <w:rPr>
                 <w:noProof/>
               </w:rPr>
-              <w:instrText xml:space="preserve"> PAGEREF _Toc241612367 \h </w:instrText>
+              <w:instrText xml:space="preserve"> PAGEREF _Toc241788994 \h </w:instrText>
             </w:r>
             <w:r>
               <w:rPr>
@@ -568,7 +635,7 @@
               <w:rPr>
                 <w:noProof/>
               </w:rPr>
-              <w:t>5</w:t>
+              <w:t>8</w:t>
             </w:r>
             <w:r>
               <w:rPr>
@@ -594,7 +661,7 @@
               <w14:ligatures w14:val="standardContextual"/>
             </w:rPr>
           </w:pPr>
-          <w:hyperlink w:anchor="_Toc241612368" w:history="1">
+          <w:hyperlink w:anchor="_Toc241788995" w:history="1">
             <w:r>
               <w:rPr>
                 <w:rStyle w:val="Hyperlink"/>
@@ -618,7 +685,7 @@
               <w:rPr>
                 <w:noProof/>
               </w:rPr>
-              <w:instrText xml:space="preserve"> PAGEREF _Toc241612368 \h </w:instrText>
+              <w:instrText xml:space="preserve"> PAGEREF _Toc241788995 \h </w:instrText>
             </w:r>
             <w:r>
               <w:rPr>
@@ -635,7 +702,7 @@
               <w:rPr>
                 <w:noProof/>
               </w:rPr>
-              <w:t>6</w:t>
+              <w:t>9</w:t>
             </w:r>
             <w:r>
               <w:rPr>
@@ -661,7 +728,7 @@
               <w14:ligatures w14:val="standardContextual"/>
             </w:rPr>
           </w:pPr>
-          <w:hyperlink w:anchor="_Toc241612369" w:history="1">
+          <w:hyperlink w:anchor="_Toc241788996" w:history="1">
             <w:r>
               <w:rPr>
                 <w:rStyle w:val="Hyperlink"/>
@@ -685,7 +752,7 @@
               <w:rPr>
                 <w:noProof/>
               </w:rPr>
-              <w:instrText xml:space="preserve"> PAGEREF _Toc241612369 \h </w:instrText>
+              <w:instrText xml:space="preserve"> PAGEREF _Toc241788996 \h </w:instrText>
             </w:r>
             <w:r>
               <w:rPr>
@@ -702,7 +769,7 @@
               <w:rPr>
                 <w:noProof/>
               </w:rPr>
-              <w:t>6</w:t>
+              <w:t>9</w:t>
             </w:r>
             <w:r>
               <w:rPr>
@@ -728,7 +795,7 @@
               <w14:ligatures w14:val="standardContextual"/>
             </w:rPr>
           </w:pPr>
-          <w:hyperlink w:anchor="_Toc241612370" w:history="1">
+          <w:hyperlink w:anchor="_Toc241788997" w:history="1">
             <w:r>
               <w:rPr>
                 <w:rStyle w:val="Hyperlink"/>
@@ -752,7 +819,7 @@
               <w:rPr>
                 <w:noProof/>
               </w:rPr>
-              <w:instrText xml:space="preserve"> PAGEREF _Toc241612370 \h </w:instrText>
+              <w:instrText xml:space="preserve"> PAGEREF _Toc241788997 \h </w:instrText>
             </w:r>
             <w:r>
               <w:rPr>
@@ -769,7 +836,7 @@
               <w:rPr>
                 <w:noProof/>
               </w:rPr>
-              <w:t>6</w:t>
+              <w:t>9</w:t>
             </w:r>
             <w:r>
               <w:rPr>
@@ -795,7 +862,7 @@
               <w14:ligatures w14:val="standardContextual"/>
             </w:rPr>
           </w:pPr>
-          <w:hyperlink w:anchor="_Toc241612371" w:history="1">
+          <w:hyperlink w:anchor="_Toc241788998" w:history="1">
             <w:r>
               <w:rPr>
                 <w:rStyle w:val="Hyperlink"/>
@@ -819,7 +886,7 @@
               <w:rPr>
                 <w:noProof/>
               </w:rPr>
-              <w:instrText xml:space="preserve"> PAGEREF _Toc241612371 \h </w:instrText>
+              <w:instrText xml:space="preserve"> PAGEREF _Toc241788998 \h </w:instrText>
             </w:r>
             <w:r>
               <w:rPr>
@@ -836,7 +903,7 @@
               <w:rPr>
                 <w:noProof/>
               </w:rPr>
-              <w:t>7</w:t>
+              <w:t>10</w:t>
             </w:r>
             <w:r>
               <w:rPr>
@@ -862,7 +929,7 @@
               <w14:ligatures w14:val="standardContextual"/>
             </w:rPr>
           </w:pPr>
-          <w:hyperlink w:anchor="_Toc241612372" w:history="1">
+          <w:hyperlink w:anchor="_Toc241788999" w:history="1">
             <w:r>
               <w:rPr>
                 <w:rStyle w:val="Hyperlink"/>
@@ -886,7 +953,7 @@
               <w:rPr>
                 <w:noProof/>
               </w:rPr>
-              <w:instrText xml:space="preserve"> PAGEREF _Toc241612372 \h </w:instrText>
+              <w:instrText xml:space="preserve"> PAGEREF _Toc241788999 \h </w:instrText>
             </w:r>
             <w:r>
               <w:rPr>
@@ -903,7 +970,7 @@
               <w:rPr>
                 <w:noProof/>
               </w:rPr>
-              <w:t>7</w:t>
+              <w:t>10</w:t>
             </w:r>
             <w:r>
               <w:rPr>
@@ -929,7 +996,7 @@
               <w14:ligatures w14:val="standardContextual"/>
             </w:rPr>
           </w:pPr>
-          <w:hyperlink w:anchor="_Toc241612373" w:history="1">
+          <w:hyperlink w:anchor="_Toc241789000" w:history="1">
             <w:r>
               <w:rPr>
                 <w:rStyle w:val="Hyperlink"/>
@@ -953,7 +1020,7 @@
               <w:rPr>
                 <w:noProof/>
               </w:rPr>
-              <w:instrText xml:space="preserve"> PAGEREF _Toc241612373 \h </w:instrText>
+              <w:instrText xml:space="preserve"> PAGEREF _Toc241789000 \h </w:instrText>
             </w:r>
             <w:r>
               <w:rPr>
@@ -970,7 +1037,7 @@
               <w:rPr>
                 <w:noProof/>
               </w:rPr>
-              <w:t>8</w:t>
+              <w:t>11</w:t>
             </w:r>
             <w:r>
               <w:rPr>
@@ -996,7 +1063,7 @@
               <w14:ligatures w14:val="standardContextual"/>
             </w:rPr>
           </w:pPr>
-          <w:hyperlink w:anchor="_Toc241612374" w:history="1">
+          <w:hyperlink w:anchor="_Toc241789001" w:history="1">
             <w:r>
               <w:rPr>
                 <w:rStyle w:val="Hyperlink"/>
@@ -1020,7 +1087,7 @@
               <w:rPr>
                 <w:noProof/>
               </w:rPr>
-              <w:instrText xml:space="preserve"> PAGEREF _Toc241612374 \h </w:instrText>
+              <w:instrText xml:space="preserve"> PAGEREF _Toc241789001 \h </w:instrText>
             </w:r>
             <w:r>
               <w:rPr>
@@ -1037,7 +1104,7 @@
               <w:rPr>
                 <w:noProof/>
               </w:rPr>
-              <w:t>9</w:t>
+              <w:t>12</w:t>
             </w:r>
             <w:r>
               <w:rPr>
@@ -1063,7 +1130,7 @@
               <w14:ligatures w14:val="standardContextual"/>
             </w:rPr>
           </w:pPr>
-          <w:hyperlink w:anchor="_Toc241612375" w:history="1">
+          <w:hyperlink w:anchor="_Toc241789002" w:history="1">
             <w:r>
               <w:rPr>
                 <w:rStyle w:val="Hyperlink"/>
@@ -1087,7 +1154,7 @@
               <w:rPr>
                 <w:noProof/>
               </w:rPr>
-              <w:instrText xml:space="preserve"> PAGEREF _Toc241612375 \h </w:instrText>
+              <w:instrText xml:space="preserve"> PAGEREF _Toc241789002 \h </w:instrText>
             </w:r>
             <w:r>
               <w:rPr>
@@ -1104,7 +1171,7 @@
               <w:rPr>
                 <w:noProof/>
               </w:rPr>
-              <w:t>9</w:t>
+              <w:t>12</w:t>
             </w:r>
             <w:r>
               <w:rPr>
@@ -1130,7 +1197,7 @@
               <w14:ligatures w14:val="standardContextual"/>
             </w:rPr>
           </w:pPr>
-          <w:hyperlink w:anchor="_Toc241612376" w:history="1">
+          <w:hyperlink w:anchor="_Toc241789003" w:history="1">
             <w:r>
               <w:rPr>
                 <w:rStyle w:val="Hyperlink"/>
@@ -1154,7 +1221,7 @@
               <w:rPr>
                 <w:noProof/>
               </w:rPr>
-              <w:instrText xml:space="preserve"> PAGEREF _Toc241612376 \h </w:instrText>
+              <w:instrText xml:space="preserve"> PAGEREF _Toc241789003 \h </w:instrText>
             </w:r>
             <w:r>
               <w:rPr>
@@ -1171,7 +1238,7 @@
               <w:rPr>
                 <w:noProof/>
               </w:rPr>
-              <w:t>9</w:t>
+              <w:t>12</w:t>
             </w:r>
             <w:r>
               <w:rPr>
@@ -1197,7 +1264,7 @@
               <w14:ligatures w14:val="standardContextual"/>
             </w:rPr>
           </w:pPr>
-          <w:hyperlink w:anchor="_Toc241612377" w:history="1">
+          <w:hyperlink w:anchor="_Toc241789004" w:history="1">
             <w:r>
               <w:rPr>
                 <w:rStyle w:val="Hyperlink"/>
@@ -1221,7 +1288,7 @@
               <w:rPr>
                 <w:noProof/>
               </w:rPr>
-              <w:instrText xml:space="preserve"> PAGEREF _Toc241612377 \h </w:instrText>
+              <w:instrText xml:space="preserve"> PAGEREF _Toc241789004 \h </w:instrText>
             </w:r>
             <w:r>
               <w:rPr>
@@ -1238,7 +1305,7 @@
               <w:rPr>
                 <w:noProof/>
               </w:rPr>
-              <w:t>10</w:t>
+              <w:t>13</w:t>
             </w:r>
             <w:r>
               <w:rPr>
@@ -1264,7 +1331,7 @@
               <w14:ligatures w14:val="standardContextual"/>
             </w:rPr>
           </w:pPr>
-          <w:hyperlink w:anchor="_Toc241612378" w:history="1">
+          <w:hyperlink w:anchor="_Toc241789005" w:history="1">
             <w:r>
               <w:rPr>
                 <w:rStyle w:val="Hyperlink"/>
@@ -1288,7 +1355,7 @@
               <w:rPr>
                 <w:noProof/>
               </w:rPr>
-              <w:instrText xml:space="preserve"> PAGEREF _Toc241612378 \h </w:instrText>
+              <w:instrText xml:space="preserve"> PAGEREF _Toc241789005 \h </w:instrText>
             </w:r>
             <w:r>
               <w:rPr>
@@ -1305,7 +1372,7 @@
               <w:rPr>
                 <w:noProof/>
               </w:rPr>
-              <w:t>10</w:t>
+              <w:t>13</w:t>
             </w:r>
             <w:r>
               <w:rPr>
@@ -1331,7 +1398,7 @@
               <w14:ligatures w14:val="standardContextual"/>
             </w:rPr>
           </w:pPr>
-          <w:hyperlink w:anchor="_Toc241612379" w:history="1">
+          <w:hyperlink w:anchor="_Toc241789006" w:history="1">
             <w:r>
               <w:rPr>
                 <w:rStyle w:val="Hyperlink"/>
@@ -1355,7 +1422,7 @@
               <w:rPr>
                 <w:noProof/>
               </w:rPr>
-              <w:instrText xml:space="preserve"> PAGEREF _Toc241612379 \h </w:instrText>
+              <w:instrText xml:space="preserve"> PAGEREF _Toc241789006 \h </w:instrText>
             </w:r>
             <w:r>
               <w:rPr>
@@ -1372,7 +1439,7 @@
               <w:rPr>
                 <w:noProof/>
               </w:rPr>
-              <w:t>10</w:t>
+              <w:t>13</w:t>
             </w:r>
             <w:r>
               <w:rPr>
@@ -1398,7 +1465,7 @@
               <w14:ligatures w14:val="standardContextual"/>
             </w:rPr>
           </w:pPr>
-          <w:hyperlink w:anchor="_Toc241612380" w:history="1">
+          <w:hyperlink w:anchor="_Toc241789007" w:history="1">
             <w:r>
               <w:rPr>
                 <w:rStyle w:val="Hyperlink"/>
@@ -1422,7 +1489,7 @@
               <w:rPr>
                 <w:noProof/>
               </w:rPr>
-              <w:instrText xml:space="preserve"> PAGEREF _Toc241612380 \h </w:instrText>
+              <w:instrText xml:space="preserve"> PAGEREF _Toc241789007 \h </w:instrText>
             </w:r>
             <w:r>
               <w:rPr>
@@ -1439,7 +1506,7 @@
               <w:rPr>
                 <w:noProof/>
               </w:rPr>
-              <w:t>11</w:t>
+              <w:t>14</w:t>
             </w:r>
             <w:r>
               <w:rPr>
@@ -1465,7 +1532,7 @@
               <w14:ligatures w14:val="standardContextual"/>
             </w:rPr>
           </w:pPr>
-          <w:hyperlink w:anchor="_Toc241612381" w:history="1">
+          <w:hyperlink w:anchor="_Toc241789008" w:history="1">
             <w:r>
               <w:rPr>
                 <w:rStyle w:val="Hyperlink"/>
@@ -1489,7 +1556,7 @@
               <w:rPr>
                 <w:noProof/>
               </w:rPr>
-              <w:instrText xml:space="preserve"> PAGEREF _Toc241612381 \h </w:instrText>
+              <w:instrText xml:space="preserve"> PAGEREF _Toc241789008 \h </w:instrText>
             </w:r>
             <w:r>
               <w:rPr>
@@ -1506,7 +1573,7 @@
               <w:rPr>
                 <w:noProof/>
               </w:rPr>
-              <w:t>12</w:t>
+              <w:t>15</w:t>
             </w:r>
             <w:r>
               <w:rPr>
@@ -1532,7 +1599,7 @@
               <w14:ligatures w14:val="standardContextual"/>
             </w:rPr>
           </w:pPr>
-          <w:hyperlink w:anchor="_Toc241612382" w:history="1">
+          <w:hyperlink w:anchor="_Toc241789009" w:history="1">
             <w:r>
               <w:rPr>
                 <w:rStyle w:val="Hyperlink"/>
@@ -1556,7 +1623,7 @@
               <w:rPr>
                 <w:noProof/>
               </w:rPr>
-              <w:instrText xml:space="preserve"> PAGEREF _Toc241612382 \h </w:instrText>
+              <w:instrText xml:space="preserve"> PAGEREF _Toc241789009 \h </w:instrText>
             </w:r>
             <w:r>
               <w:rPr>
@@ -1573,7 +1640,74 @@
               <w:rPr>
                 <w:noProof/>
               </w:rPr>
-              <w:t>12</w:t>
+              <w:t>15</w:t>
+            </w:r>
+            <w:r>
+              <w:rPr>
+                <w:noProof/>
+              </w:rPr>
+              <w:fldChar w:fldCharType="end"/>
+            </w:r>
+          </w:hyperlink>
+        </w:p>
+        <w:p>
+          <w:pPr>
+            <w:pStyle w:val="TOC2"/>
+            <w:tabs>
+              <w:tab w:val="right" w:leader="dot" w:pos="9296"/>
+            </w:tabs>
+            <w:rPr>
+              <w:rFonts w:asciiTheme="minorHAnsi" w:eastAsiaTheme="minorEastAsia" w:hAnsiTheme="minorHAnsi" w:cstheme="minorBidi"/>
+              <w:noProof/>
+              <w:color w:val="auto"/>
+              <w:kern w:val="2"/>
+              <w:sz w:val="24"/>
+              <w:szCs w:val="24"/>
+              <w14:ligatures w14:val="standardContextual"/>
+            </w:rPr>
+          </w:pPr>
+          <w:hyperlink w:anchor="_Toc241789010" w:history="1">
+            <w:r>
+              <w:rPr>
+                <w:rStyle w:val="Hyperlink"/>
+                <w:noProof/>
+              </w:rPr>
+              <w:t>On phones</w:t>
+            </w:r>
+            <w:r>
+              <w:rPr>
+                <w:noProof/>
+              </w:rPr>
+              <w:tab/>
+            </w:r>
+            <w:r>
+              <w:rPr>
+                <w:noProof/>
+              </w:rPr>
+              <w:fldChar w:fldCharType="begin"/>
+            </w:r>
+            <w:r>
+              <w:rPr>
+                <w:noProof/>
+              </w:rPr>
+              <w:instrText xml:space="preserve"> PAGEREF _Toc241789010 \h </w:instrText>
+            </w:r>
+            <w:r>
+              <w:rPr>
+                <w:noProof/>
+              </w:rPr>
+            </w:r>
+            <w:r>
+              <w:rPr>
+                <w:noProof/>
+              </w:rPr>
+              <w:fldChar w:fldCharType="separate"/>
+            </w:r>
+            <w:r>
+              <w:rPr>
+                <w:noProof/>
+              </w:rPr>
+              <w:t>15</w:t>
             </w:r>
             <w:r>
               <w:rPr>
@@ -1599,7 +1733,7 @@
               <w14:ligatures w14:val="standardContextual"/>
             </w:rPr>
           </w:pPr>
-          <w:hyperlink w:anchor="_Toc241612383" w:history="1">
+          <w:hyperlink w:anchor="_Toc241789011" w:history="1">
             <w:r>
               <w:rPr>
                 <w:rStyle w:val="Hyperlink"/>
@@ -1623,7 +1757,7 @@
               <w:rPr>
                 <w:noProof/>
               </w:rPr>
-              <w:instrText xml:space="preserve"> PAGEREF _Toc241612383 \h </w:instrText>
+              <w:instrText xml:space="preserve"> PAGEREF _Toc241789011 \h </w:instrText>
             </w:r>
             <w:r>
               <w:rPr>
@@ -1640,7 +1774,7 @@
               <w:rPr>
                 <w:noProof/>
               </w:rPr>
-              <w:t>13</w:t>
+              <w:t>16</w:t>
             </w:r>
             <w:r>
               <w:rPr>
@@ -1666,7 +1800,7 @@
               <w14:ligatures w14:val="standardContextual"/>
             </w:rPr>
           </w:pPr>
-          <w:hyperlink w:anchor="_Toc241612384" w:history="1">
+          <w:hyperlink w:anchor="_Toc241789012" w:history="1">
             <w:r>
               <w:rPr>
                 <w:rStyle w:val="Hyperlink"/>
@@ -1690,7 +1824,7 @@
               <w:rPr>
                 <w:noProof/>
               </w:rPr>
-              <w:instrText xml:space="preserve"> PAGEREF _Toc241612384 \h </w:instrText>
+              <w:instrText xml:space="preserve"> PAGEREF _Toc241789012 \h </w:instrText>
             </w:r>
             <w:r>
               <w:rPr>
@@ -1707,7 +1841,7 @@
               <w:rPr>
                 <w:noProof/>
               </w:rPr>
-              <w:t>13</w:t>
+              <w:t>16</w:t>
             </w:r>
             <w:r>
               <w:rPr>
@@ -1733,7 +1867,7 @@
               <w14:ligatures w14:val="standardContextual"/>
             </w:rPr>
           </w:pPr>
-          <w:hyperlink w:anchor="_Toc241612385" w:history="1">
+          <w:hyperlink w:anchor="_Toc241789013" w:history="1">
             <w:r>
               <w:rPr>
                 <w:rStyle w:val="Hyperlink"/>
@@ -1757,7 +1891,7 @@
               <w:rPr>
                 <w:noProof/>
               </w:rPr>
-              <w:instrText xml:space="preserve"> PAGEREF _Toc241612385 \h </w:instrText>
+              <w:instrText xml:space="preserve"> PAGEREF _Toc241789013 \h </w:instrText>
             </w:r>
             <w:r>
               <w:rPr>
@@ -1774,7 +1908,7 @@
               <w:rPr>
                 <w:noProof/>
               </w:rPr>
-              <w:t>13</w:t>
+              <w:t>16</w:t>
             </w:r>
             <w:r>
               <w:rPr>
@@ -1800,7 +1934,7 @@
               <w14:ligatures w14:val="standardContextual"/>
             </w:rPr>
           </w:pPr>
-          <w:hyperlink w:anchor="_Toc241612386" w:history="1">
+          <w:hyperlink w:anchor="_Toc241789014" w:history="1">
             <w:r>
               <w:rPr>
                 <w:rStyle w:val="Hyperlink"/>
@@ -1824,7 +1958,7 @@
               <w:rPr>
                 <w:noProof/>
               </w:rPr>
-              <w:instrText xml:space="preserve"> PAGEREF _Toc241612386 \h </w:instrText>
+              <w:instrText xml:space="preserve"> PAGEREF _Toc241789014 \h </w:instrText>
             </w:r>
             <w:r>
               <w:rPr>
@@ -1841,7 +1975,7 @@
               <w:rPr>
                 <w:noProof/>
               </w:rPr>
-              <w:t>13</w:t>
+              <w:t>16</w:t>
             </w:r>
             <w:r>
               <w:rPr>
@@ -1867,7 +2001,7 @@
               <w14:ligatures w14:val="standardContextual"/>
             </w:rPr>
           </w:pPr>
-          <w:hyperlink w:anchor="_Toc241612387" w:history="1">
+          <w:hyperlink w:anchor="_Toc241789015" w:history="1">
             <w:r>
               <w:rPr>
                 <w:rStyle w:val="Hyperlink"/>
@@ -1891,7 +2025,7 @@
               <w:rPr>
                 <w:noProof/>
               </w:rPr>
-              <w:instrText xml:space="preserve"> PAGEREF _Toc241612387 \h </w:instrText>
+              <w:instrText xml:space="preserve"> PAGEREF _Toc241789015 \h </w:instrText>
             </w:r>
             <w:r>
               <w:rPr>
@@ -1908,7 +2042,7 @@
               <w:rPr>
                 <w:noProof/>
               </w:rPr>
-              <w:t>14</w:t>
+              <w:t>17</w:t>
             </w:r>
             <w:r>
               <w:rPr>
@@ -1934,7 +2068,7 @@
               <w14:ligatures w14:val="standardContextual"/>
             </w:rPr>
           </w:pPr>
-          <w:hyperlink w:anchor="_Toc241612388" w:history="1">
+          <w:hyperlink w:anchor="_Toc241789016" w:history="1">
             <w:r>
               <w:rPr>
                 <w:rStyle w:val="Hyperlink"/>
@@ -1958,7 +2092,7 @@
               <w:rPr>
                 <w:noProof/>
               </w:rPr>
-              <w:instrText xml:space="preserve"> PAGEREF _Toc241612388 \h </w:instrText>
+              <w:instrText xml:space="preserve"> PAGEREF _Toc241789016 \h </w:instrText>
             </w:r>
             <w:r>
               <w:rPr>
@@ -1975,7 +2109,7 @@
               <w:rPr>
                 <w:noProof/>
               </w:rPr>
-              <w:t>15</w:t>
+              <w:t>18</w:t>
             </w:r>
             <w:r>
               <w:rPr>
@@ -2001,7 +2135,7 @@
               <w14:ligatures w14:val="standardContextual"/>
             </w:rPr>
           </w:pPr>
-          <w:hyperlink w:anchor="_Toc241612389" w:history="1">
+          <w:hyperlink w:anchor="_Toc241789017" w:history="1">
             <w:r>
               <w:rPr>
                 <w:rStyle w:val="Hyperlink"/>
@@ -2025,7 +2159,7 @@
               <w:rPr>
                 <w:noProof/>
               </w:rPr>
-              <w:instrText xml:space="preserve"> PAGEREF _Toc241612389 \h </w:instrText>
+              <w:instrText xml:space="preserve"> PAGEREF _Toc241789017 \h </w:instrText>
             </w:r>
             <w:r>
               <w:rPr>
@@ -2042,7 +2176,7 @@
               <w:rPr>
                 <w:noProof/>
               </w:rPr>
-              <w:t>15</w:t>
+              <w:t>18</w:t>
             </w:r>
             <w:r>
               <w:rPr>
@@ -2068,7 +2202,7 @@
               <w14:ligatures w14:val="standardContextual"/>
             </w:rPr>
           </w:pPr>
-          <w:hyperlink w:anchor="_Toc241612390" w:history="1">
+          <w:hyperlink w:anchor="_Toc241789018" w:history="1">
             <w:r>
               <w:rPr>
                 <w:rStyle w:val="Hyperlink"/>
@@ -2092,7 +2226,7 @@
               <w:rPr>
                 <w:noProof/>
               </w:rPr>
-              <w:instrText xml:space="preserve"> PAGEREF _Toc241612390 \h </w:instrText>
+              <w:instrText xml:space="preserve"> PAGEREF _Toc241789018 \h </w:instrText>
             </w:r>
             <w:r>
               <w:rPr>
@@ -2109,7 +2243,7 @@
               <w:rPr>
                 <w:noProof/>
               </w:rPr>
-              <w:t>15</w:t>
+              <w:t>18</w:t>
             </w:r>
             <w:r>
               <w:rPr>
@@ -2135,7 +2269,7 @@
               <w14:ligatures w14:val="standardContextual"/>
             </w:rPr>
           </w:pPr>
-          <w:hyperlink w:anchor="_Toc241612391" w:history="1">
+          <w:hyperlink w:anchor="_Toc241789019" w:history="1">
             <w:r>
               <w:rPr>
                 <w:rStyle w:val="Hyperlink"/>
@@ -2159,7 +2293,7 @@
               <w:rPr>
                 <w:noProof/>
               </w:rPr>
-              <w:instrText xml:space="preserve"> PAGEREF _Toc241612391 \h </w:instrText>
+              <w:instrText xml:space="preserve"> PAGEREF _Toc241789019 \h </w:instrText>
             </w:r>
             <w:r>
               <w:rPr>
@@ -2176,7 +2310,7 @@
               <w:rPr>
                 <w:noProof/>
               </w:rPr>
-              <w:t>15</w:t>
+              <w:t>18</w:t>
             </w:r>
             <w:r>
               <w:rPr>
@@ -2202,7 +2336,7 @@
               <w14:ligatures w14:val="standardContextual"/>
             </w:rPr>
           </w:pPr>
-          <w:hyperlink w:anchor="_Toc241612392" w:history="1">
+          <w:hyperlink w:anchor="_Toc241789020" w:history="1">
             <w:r>
               <w:rPr>
                 <w:rStyle w:val="Hyperlink"/>
@@ -2226,7 +2360,7 @@
               <w:rPr>
                 <w:noProof/>
               </w:rPr>
-              <w:instrText xml:space="preserve"> PAGEREF _Toc241612392 \h </w:instrText>
+              <w:instrText xml:space="preserve"> PAGEREF _Toc241789020 \h </w:instrText>
             </w:r>
             <w:r>
               <w:rPr>
@@ -2243,7 +2377,7 @@
               <w:rPr>
                 <w:noProof/>
               </w:rPr>
-              <w:t>16</w:t>
+              <w:t>19</w:t>
             </w:r>
             <w:r>
               <w:rPr>
@@ -2269,7 +2403,7 @@
               <w14:ligatures w14:val="standardContextual"/>
             </w:rPr>
           </w:pPr>
-          <w:hyperlink w:anchor="_Toc241612393" w:history="1">
+          <w:hyperlink w:anchor="_Toc241789021" w:history="1">
             <w:r>
               <w:rPr>
                 <w:rStyle w:val="Hyperlink"/>
@@ -2293,7 +2427,7 @@
               <w:rPr>
                 <w:noProof/>
               </w:rPr>
-              <w:instrText xml:space="preserve"> PAGEREF _Toc241612393 \h </w:instrText>
+              <w:instrText xml:space="preserve"> PAGEREF _Toc241789021 \h </w:instrText>
             </w:r>
             <w:r>
               <w:rPr>
@@ -2310,7 +2444,7 @@
               <w:rPr>
                 <w:noProof/>
               </w:rPr>
-              <w:t>17</w:t>
+              <w:t>20</w:t>
             </w:r>
             <w:r>
               <w:rPr>
@@ -2336,7 +2470,7 @@
               <w14:ligatures w14:val="standardContextual"/>
             </w:rPr>
           </w:pPr>
-          <w:hyperlink w:anchor="_Toc241612394" w:history="1">
+          <w:hyperlink w:anchor="_Toc241789022" w:history="1">
             <w:r>
               <w:rPr>
                 <w:rStyle w:val="Hyperlink"/>
@@ -2360,7 +2494,7 @@
               <w:rPr>
                 <w:noProof/>
               </w:rPr>
-              <w:instrText xml:space="preserve"> PAGEREF _Toc241612394 \h </w:instrText>
+              <w:instrText xml:space="preserve"> PAGEREF _Toc241789022 \h </w:instrText>
             </w:r>
             <w:r>
               <w:rPr>
@@ -2377,7 +2511,7 @@
               <w:rPr>
                 <w:noProof/>
               </w:rPr>
-              <w:t>17</w:t>
+              <w:t>20</w:t>
             </w:r>
             <w:r>
               <w:rPr>
@@ -2403,7 +2537,7 @@
               <w14:ligatures w14:val="standardContextual"/>
             </w:rPr>
           </w:pPr>
-          <w:hyperlink w:anchor="_Toc241612395" w:history="1">
+          <w:hyperlink w:anchor="_Toc241789023" w:history="1">
             <w:r>
               <w:rPr>
                 <w:rStyle w:val="Hyperlink"/>
@@ -2427,7 +2561,7 @@
               <w:rPr>
                 <w:noProof/>
               </w:rPr>
-              <w:instrText xml:space="preserve"> PAGEREF _Toc241612395 \h </w:instrText>
+              <w:instrText xml:space="preserve"> PAGEREF _Toc241789023 \h </w:instrText>
             </w:r>
             <w:r>
               <w:rPr>
@@ -2444,7 +2578,7 @@
               <w:rPr>
                 <w:noProof/>
               </w:rPr>
-              <w:t>18</w:t>
+              <w:t>21</w:t>
             </w:r>
             <w:r>
               <w:rPr>
@@ -2470,7 +2604,7 @@
               <w14:ligatures w14:val="standardContextual"/>
             </w:rPr>
           </w:pPr>
-          <w:hyperlink w:anchor="_Toc241612396" w:history="1">
+          <w:hyperlink w:anchor="_Toc241789024" w:history="1">
             <w:r>
               <w:rPr>
                 <w:rStyle w:val="Hyperlink"/>
@@ -2494,7 +2628,7 @@
               <w:rPr>
                 <w:noProof/>
               </w:rPr>
-              <w:instrText xml:space="preserve"> PAGEREF _Toc241612396 \h </w:instrText>
+              <w:instrText xml:space="preserve"> PAGEREF _Toc241789024 \h </w:instrText>
             </w:r>
             <w:r>
               <w:rPr>
@@ -2511,7 +2645,7 @@
               <w:rPr>
                 <w:noProof/>
               </w:rPr>
-              <w:t>19</w:t>
+              <w:t>22</w:t>
             </w:r>
             <w:r>
               <w:rPr>
@@ -2533,7 +2667,7 @@
         <w:pStyle w:val="Heading1"/>
         <w:pageBreakBefore/>
       </w:pPr>
-      <w:bookmarkStart w:id="0" w:name="_Toc241612361"/>
+      <w:bookmarkStart w:id="0" w:name="_Toc241788987"/>
       <w:r>
         <w:t>1. The system at a glance</w:t>
       </w:r>
@@ -2982,7 +3116,7 @@
               <w:spacing w:after="40" w:line="270" w:lineRule="auto"/>
             </w:pPr>
             <w:r>
-              <w:t>The firm's lawyers</w:t>
+              <w:t>The firm's lawyers (owners and administrators too, for cases assigned to them)</w:t>
             </w:r>
           </w:p>
         </w:tc>
@@ -3173,7 +3307,7 @@
         <w:keepNext/>
         <w:keepLines/>
       </w:pPr>
-      <w:bookmarkStart w:id="1" w:name="_Toc241612362"/>
+      <w:bookmarkStart w:id="1" w:name="_Toc241788988"/>
       <w:r>
         <w:t>How the pieces fit</w:t>
       </w:r>
@@ -3300,7 +3434,7 @@
         <w:pStyle w:val="Heading1"/>
         <w:pageBreakBefore/>
       </w:pPr>
-      <w:bookmarkStart w:id="2" w:name="_Toc241612363"/>
+      <w:bookmarkStart w:id="2" w:name="_Toc241788989"/>
       <w:r>
         <w:t>2. Signing in</w:t>
       </w:r>
@@ -3312,9 +3446,9 @@
         <w:keepNext/>
         <w:keepLines/>
       </w:pPr>
-      <w:bookmarkStart w:id="3" w:name="_Toc241612364"/>
-      <w:r>
-        <w:t>Three separate doors</w:t>
+      <w:bookmarkStart w:id="3" w:name="_Toc241788990"/>
+      <w:r>
+        <w:t>Three separate sign-ins</w:t>
       </w:r>
       <w:bookmarkEnd w:id="3"/>
     </w:p>
@@ -3323,7 +3457,7 @@
         <w:spacing w:after="140" w:line="300" w:lineRule="auto"/>
       </w:pPr>
       <w:r>
-        <w:t>There are three sign-in pages, and each opens only its own kind of account:</w:t>
+        <w:t>There are three sign-in pages. Each one works on its own: signing in or out of one never affects the other two.</w:t>
       </w:r>
     </w:p>
     <w:tbl>
@@ -3344,9 +3478,9 @@
         <w:tblLook w:val="04A0" w:firstRow="1" w:lastRow="0" w:firstColumn="1" w:lastColumn="0" w:noHBand="0" w:noVBand="1"/>
       </w:tblPr>
       <w:tblGrid>
-        <w:gridCol w:w="2792"/>
-        <w:gridCol w:w="2792"/>
-        <w:gridCol w:w="3722"/>
+        <w:gridCol w:w="2978"/>
+        <w:gridCol w:w="3164"/>
+        <w:gridCol w:w="3164"/>
       </w:tblGrid>
       <w:tr>
         <w:tblPrEx>
@@ -3360,7 +3494,7 @@
         </w:trPr>
         <w:tc>
           <w:tcPr>
-            <w:tcW w:w="2792" w:type="dxa"/>
+            <w:tcW w:w="2978" w:type="dxa"/>
             <w:tcBorders>
               <w:top w:val="single" w:sz="4" w:space="0" w:color="D5D9E0"/>
               <w:left w:val="single" w:sz="4" w:space="0" w:color="D5D9E0"/>
@@ -3391,7 +3525,7 @@
         </w:tc>
         <w:tc>
           <w:tcPr>
-            <w:tcW w:w="2792" w:type="dxa"/>
+            <w:tcW w:w="3164" w:type="dxa"/>
             <w:tcBorders>
               <w:top w:val="single" w:sz="4" w:space="0" w:color="D5D9E0"/>
               <w:left w:val="single" w:sz="4" w:space="0" w:color="D5D9E0"/>
@@ -3416,13 +3550,13 @@
                 <w:bCs/>
                 <w:color w:val="FFFFFF"/>
               </w:rPr>
-              <w:t>Accounts it opens</w:t>
-            </w:r>
-          </w:p>
-        </w:tc>
-        <w:tc>
-          <w:tcPr>
-            <w:tcW w:w="3722" w:type="dxa"/>
+              <w:t>Who can use it</w:t>
+            </w:r>
+          </w:p>
+        </w:tc>
+        <w:tc>
+          <w:tcPr>
+            <w:tcW w:w="3164" w:type="dxa"/>
             <w:tcBorders>
               <w:top w:val="single" w:sz="4" w:space="0" w:color="D5D9E0"/>
               <w:left w:val="single" w:sz="4" w:space="0" w:color="D5D9E0"/>
@@ -3461,76 +3595,84 @@
         </w:tblPrEx>
         <w:tc>
           <w:tcPr>
-            <w:tcW w:w="2792" w:type="dxa"/>
-            <w:tcBorders>
-              <w:top w:val="single" w:sz="4" w:space="0" w:color="D5D9E0"/>
-              <w:left w:val="single" w:sz="4" w:space="0" w:color="D5D9E0"/>
-              <w:bottom w:val="single" w:sz="4" w:space="0" w:color="D5D9E0"/>
-              <w:right w:val="single" w:sz="4" w:space="0" w:color="D5D9E0"/>
-            </w:tcBorders>
-            <w:tcMar>
-              <w:top w:w="80" w:type="dxa"/>
-              <w:left w:w="120" w:type="dxa"/>
-              <w:bottom w:w="80" w:type="dxa"/>
-              <w:right w:w="120" w:type="dxa"/>
-            </w:tcMar>
-          </w:tcPr>
-          <w:p>
-            <w:pPr>
-              <w:spacing w:after="40" w:line="270" w:lineRule="auto"/>
-            </w:pPr>
-            <w:r>
-              <w:t>/admin/login</w:t>
-            </w:r>
-          </w:p>
-        </w:tc>
-        <w:tc>
-          <w:tcPr>
-            <w:tcW w:w="2792" w:type="dxa"/>
-            <w:tcBorders>
-              <w:top w:val="single" w:sz="4" w:space="0" w:color="D5D9E0"/>
-              <w:left w:val="single" w:sz="4" w:space="0" w:color="D5D9E0"/>
-              <w:bottom w:val="single" w:sz="4" w:space="0" w:color="D5D9E0"/>
-              <w:right w:val="single" w:sz="4" w:space="0" w:color="D5D9E0"/>
-            </w:tcBorders>
-            <w:tcMar>
-              <w:top w:w="80" w:type="dxa"/>
-              <w:left w:w="120" w:type="dxa"/>
-              <w:bottom w:w="80" w:type="dxa"/>
-              <w:right w:w="120" w:type="dxa"/>
-            </w:tcMar>
-          </w:tcPr>
-          <w:p>
-            <w:pPr>
-              <w:spacing w:after="40" w:line="270" w:lineRule="auto"/>
-            </w:pPr>
-            <w:r>
-              <w:t>Owners and administrators</w:t>
-            </w:r>
-          </w:p>
-        </w:tc>
-        <w:tc>
-          <w:tcPr>
-            <w:tcW w:w="3722" w:type="dxa"/>
-            <w:tcBorders>
-              <w:top w:val="single" w:sz="4" w:space="0" w:color="D5D9E0"/>
-              <w:left w:val="single" w:sz="4" w:space="0" w:color="D5D9E0"/>
-              <w:bottom w:val="single" w:sz="4" w:space="0" w:color="D5D9E0"/>
-              <w:right w:val="single" w:sz="4" w:space="0" w:color="D5D9E0"/>
-            </w:tcBorders>
-            <w:tcMar>
-              <w:top w:w="80" w:type="dxa"/>
-              <w:left w:w="120" w:type="dxa"/>
-              <w:bottom w:w="80" w:type="dxa"/>
-              <w:right w:w="120" w:type="dxa"/>
-            </w:tcMar>
-          </w:tcPr>
-          <w:p>
-            <w:pPr>
-              <w:spacing w:after="40" w:line="270" w:lineRule="auto"/>
-            </w:pPr>
-            <w:r>
-              <w:t>The admin console</w:t>
+            <w:tcW w:w="2978" w:type="dxa"/>
+            <w:tcBorders>
+              <w:top w:val="single" w:sz="4" w:space="0" w:color="D5D9E0"/>
+              <w:left w:val="single" w:sz="4" w:space="0" w:color="D5D9E0"/>
+              <w:bottom w:val="single" w:sz="4" w:space="0" w:color="D5D9E0"/>
+              <w:right w:val="single" w:sz="4" w:space="0" w:color="D5D9E0"/>
+            </w:tcBorders>
+            <w:tcMar>
+              <w:top w:w="80" w:type="dxa"/>
+              <w:left w:w="120" w:type="dxa"/>
+              <w:bottom w:w="80" w:type="dxa"/>
+              <w:right w:w="120" w:type="dxa"/>
+            </w:tcMar>
+          </w:tcPr>
+          <w:p>
+            <w:pPr>
+              <w:spacing w:after="40" w:line="270" w:lineRule="auto"/>
+            </w:pPr>
+            <w:r>
+              <w:t>/login</w:t>
+            </w:r>
+          </w:p>
+          <w:p>
+            <w:pPr>
+              <w:spacing w:after="40" w:line="270" w:lineRule="auto"/>
+            </w:pPr>
+            <w:r>
+              <w:t>(the Login button on the website)</w:t>
+            </w:r>
+          </w:p>
+        </w:tc>
+        <w:tc>
+          <w:tcPr>
+            <w:tcW w:w="3164" w:type="dxa"/>
+            <w:tcBorders>
+              <w:top w:val="single" w:sz="4" w:space="0" w:color="D5D9E0"/>
+              <w:left w:val="single" w:sz="4" w:space="0" w:color="D5D9E0"/>
+              <w:bottom w:val="single" w:sz="4" w:space="0" w:color="D5D9E0"/>
+              <w:right w:val="single" w:sz="4" w:space="0" w:color="D5D9E0"/>
+            </w:tcBorders>
+            <w:tcMar>
+              <w:top w:w="80" w:type="dxa"/>
+              <w:left w:w="120" w:type="dxa"/>
+              <w:bottom w:w="80" w:type="dxa"/>
+              <w:right w:w="120" w:type="dxa"/>
+            </w:tcMar>
+          </w:tcPr>
+          <w:p>
+            <w:pPr>
+              <w:spacing w:after="40" w:line="270" w:lineRule="auto"/>
+            </w:pPr>
+            <w:r>
+              <w:t>Anyone, as a client</w:t>
+            </w:r>
+          </w:p>
+        </w:tc>
+        <w:tc>
+          <w:tcPr>
+            <w:tcW w:w="3164" w:type="dxa"/>
+            <w:tcBorders>
+              <w:top w:val="single" w:sz="4" w:space="0" w:color="D5D9E0"/>
+              <w:left w:val="single" w:sz="4" w:space="0" w:color="D5D9E0"/>
+              <w:bottom w:val="single" w:sz="4" w:space="0" w:color="D5D9E0"/>
+              <w:right w:val="single" w:sz="4" w:space="0" w:color="D5D9E0"/>
+            </w:tcBorders>
+            <w:tcMar>
+              <w:top w:w="80" w:type="dxa"/>
+              <w:left w:w="120" w:type="dxa"/>
+              <w:bottom w:w="80" w:type="dxa"/>
+              <w:right w:w="120" w:type="dxa"/>
+            </w:tcMar>
+          </w:tcPr>
+          <w:p>
+            <w:pPr>
+              <w:spacing w:after="40" w:line="270" w:lineRule="auto"/>
+            </w:pPr>
+            <w:r>
+              <w:t>The client dashboard</w:t>
             </w:r>
           </w:p>
         </w:tc>
@@ -3544,7 +3686,7 @@
         </w:tblPrEx>
         <w:tc>
           <w:tcPr>
-            <w:tcW w:w="2792" w:type="dxa"/>
+            <w:tcW w:w="2978" w:type="dxa"/>
             <w:tcBorders>
               <w:top w:val="single" w:sz="4" w:space="0" w:color="D5D9E0"/>
               <w:left w:val="single" w:sz="4" w:space="0" w:color="D5D9E0"/>
@@ -3566,54 +3708,62 @@
               <w:t>/lawyer/login</w:t>
             </w:r>
           </w:p>
-        </w:tc>
-        <w:tc>
-          <w:tcPr>
-            <w:tcW w:w="2792" w:type="dxa"/>
-            <w:tcBorders>
-              <w:top w:val="single" w:sz="4" w:space="0" w:color="D5D9E0"/>
-              <w:left w:val="single" w:sz="4" w:space="0" w:color="D5D9E0"/>
-              <w:bottom w:val="single" w:sz="4" w:space="0" w:color="D5D9E0"/>
-              <w:right w:val="single" w:sz="4" w:space="0" w:color="D5D9E0"/>
-            </w:tcBorders>
-            <w:tcMar>
-              <w:top w:w="80" w:type="dxa"/>
-              <w:left w:w="120" w:type="dxa"/>
-              <w:bottom w:w="80" w:type="dxa"/>
-              <w:right w:w="120" w:type="dxa"/>
-            </w:tcMar>
-          </w:tcPr>
-          <w:p>
-            <w:pPr>
-              <w:spacing w:after="40" w:line="270" w:lineRule="auto"/>
-            </w:pPr>
-            <w:r>
-              <w:t>Lawyers</w:t>
-            </w:r>
-          </w:p>
-        </w:tc>
-        <w:tc>
-          <w:tcPr>
-            <w:tcW w:w="3722" w:type="dxa"/>
-            <w:tcBorders>
-              <w:top w:val="single" w:sz="4" w:space="0" w:color="D5D9E0"/>
-              <w:left w:val="single" w:sz="4" w:space="0" w:color="D5D9E0"/>
-              <w:bottom w:val="single" w:sz="4" w:space="0" w:color="D5D9E0"/>
-              <w:right w:val="single" w:sz="4" w:space="0" w:color="D5D9E0"/>
-            </w:tcBorders>
-            <w:tcMar>
-              <w:top w:w="80" w:type="dxa"/>
-              <w:left w:w="120" w:type="dxa"/>
-              <w:bottom w:w="80" w:type="dxa"/>
-              <w:right w:w="120" w:type="dxa"/>
-            </w:tcMar>
-          </w:tcPr>
-          <w:p>
-            <w:pPr>
-              <w:spacing w:after="40" w:line="270" w:lineRule="auto"/>
-            </w:pPr>
-            <w:r>
-              <w:t>The lawyer workspace (their assigned cases only)</w:t>
+          <w:p>
+            <w:pPr>
+              <w:spacing w:after="40" w:line="270" w:lineRule="auto"/>
+            </w:pPr>
+            <w:r>
+              <w:t>('Lawyer login' in the website's Login box)</w:t>
+            </w:r>
+          </w:p>
+        </w:tc>
+        <w:tc>
+          <w:tcPr>
+            <w:tcW w:w="3164" w:type="dxa"/>
+            <w:tcBorders>
+              <w:top w:val="single" w:sz="4" w:space="0" w:color="D5D9E0"/>
+              <w:left w:val="single" w:sz="4" w:space="0" w:color="D5D9E0"/>
+              <w:bottom w:val="single" w:sz="4" w:space="0" w:color="D5D9E0"/>
+              <w:right w:val="single" w:sz="4" w:space="0" w:color="D5D9E0"/>
+            </w:tcBorders>
+            <w:tcMar>
+              <w:top w:w="80" w:type="dxa"/>
+              <w:left w:w="120" w:type="dxa"/>
+              <w:bottom w:w="80" w:type="dxa"/>
+              <w:right w:w="120" w:type="dxa"/>
+            </w:tcMar>
+          </w:tcPr>
+          <w:p>
+            <w:pPr>
+              <w:spacing w:after="40" w:line="270" w:lineRule="auto"/>
+            </w:pPr>
+            <w:r>
+              <w:t>People on the Team page with access Lawyer, Admin or Owner</w:t>
+            </w:r>
+          </w:p>
+        </w:tc>
+        <w:tc>
+          <w:tcPr>
+            <w:tcW w:w="3164" w:type="dxa"/>
+            <w:tcBorders>
+              <w:top w:val="single" w:sz="4" w:space="0" w:color="D5D9E0"/>
+              <w:left w:val="single" w:sz="4" w:space="0" w:color="D5D9E0"/>
+              <w:bottom w:val="single" w:sz="4" w:space="0" w:color="D5D9E0"/>
+              <w:right w:val="single" w:sz="4" w:space="0" w:color="D5D9E0"/>
+            </w:tcBorders>
+            <w:tcMar>
+              <w:top w:w="80" w:type="dxa"/>
+              <w:left w:w="120" w:type="dxa"/>
+              <w:bottom w:w="80" w:type="dxa"/>
+              <w:right w:w="120" w:type="dxa"/>
+            </w:tcMar>
+          </w:tcPr>
+          <w:p>
+            <w:pPr>
+              <w:spacing w:after="40" w:line="270" w:lineRule="auto"/>
+            </w:pPr>
+            <w:r>
+              <w:t>The lawyer workspace: only the cases assigned to that person</w:t>
             </w:r>
           </w:p>
         </w:tc>
@@ -3627,76 +3777,84 @@
         </w:tblPrEx>
         <w:tc>
           <w:tcPr>
-            <w:tcW w:w="2792" w:type="dxa"/>
-            <w:tcBorders>
-              <w:top w:val="single" w:sz="4" w:space="0" w:color="D5D9E0"/>
-              <w:left w:val="single" w:sz="4" w:space="0" w:color="D5D9E0"/>
-              <w:bottom w:val="single" w:sz="4" w:space="0" w:color="D5D9E0"/>
-              <w:right w:val="single" w:sz="4" w:space="0" w:color="D5D9E0"/>
-            </w:tcBorders>
-            <w:tcMar>
-              <w:top w:w="80" w:type="dxa"/>
-              <w:left w:w="120" w:type="dxa"/>
-              <w:bottom w:w="80" w:type="dxa"/>
-              <w:right w:w="120" w:type="dxa"/>
-            </w:tcMar>
-          </w:tcPr>
-          <w:p>
-            <w:pPr>
-              <w:spacing w:after="40" w:line="270" w:lineRule="auto"/>
-            </w:pPr>
-            <w:r>
-              <w:t>/login (also the Login button on the website)</w:t>
-            </w:r>
-          </w:p>
-        </w:tc>
-        <w:tc>
-          <w:tcPr>
-            <w:tcW w:w="2792" w:type="dxa"/>
-            <w:tcBorders>
-              <w:top w:val="single" w:sz="4" w:space="0" w:color="D5D9E0"/>
-              <w:left w:val="single" w:sz="4" w:space="0" w:color="D5D9E0"/>
-              <w:bottom w:val="single" w:sz="4" w:space="0" w:color="D5D9E0"/>
-              <w:right w:val="single" w:sz="4" w:space="0" w:color="D5D9E0"/>
-            </w:tcBorders>
-            <w:tcMar>
-              <w:top w:w="80" w:type="dxa"/>
-              <w:left w:w="120" w:type="dxa"/>
-              <w:bottom w:w="80" w:type="dxa"/>
-              <w:right w:w="120" w:type="dxa"/>
-            </w:tcMar>
-          </w:tcPr>
-          <w:p>
-            <w:pPr>
-              <w:spacing w:after="40" w:line="270" w:lineRule="auto"/>
-            </w:pPr>
-            <w:r>
-              <w:t>Clients</w:t>
-            </w:r>
-          </w:p>
-        </w:tc>
-        <w:tc>
-          <w:tcPr>
-            <w:tcW w:w="3722" w:type="dxa"/>
-            <w:tcBorders>
-              <w:top w:val="single" w:sz="4" w:space="0" w:color="D5D9E0"/>
-              <w:left w:val="single" w:sz="4" w:space="0" w:color="D5D9E0"/>
-              <w:bottom w:val="single" w:sz="4" w:space="0" w:color="D5D9E0"/>
-              <w:right w:val="single" w:sz="4" w:space="0" w:color="D5D9E0"/>
-            </w:tcBorders>
-            <w:tcMar>
-              <w:top w:w="80" w:type="dxa"/>
-              <w:left w:w="120" w:type="dxa"/>
-              <w:bottom w:w="80" w:type="dxa"/>
-              <w:right w:w="120" w:type="dxa"/>
-            </w:tcMar>
-          </w:tcPr>
-          <w:p>
-            <w:pPr>
-              <w:spacing w:after="40" w:line="270" w:lineRule="auto"/>
-            </w:pPr>
-            <w:r>
-              <w:t>The client dashboard</w:t>
+            <w:tcW w:w="2978" w:type="dxa"/>
+            <w:tcBorders>
+              <w:top w:val="single" w:sz="4" w:space="0" w:color="D5D9E0"/>
+              <w:left w:val="single" w:sz="4" w:space="0" w:color="D5D9E0"/>
+              <w:bottom w:val="single" w:sz="4" w:space="0" w:color="D5D9E0"/>
+              <w:right w:val="single" w:sz="4" w:space="0" w:color="D5D9E0"/>
+            </w:tcBorders>
+            <w:tcMar>
+              <w:top w:w="80" w:type="dxa"/>
+              <w:left w:w="120" w:type="dxa"/>
+              <w:bottom w:w="80" w:type="dxa"/>
+              <w:right w:w="120" w:type="dxa"/>
+            </w:tcMar>
+          </w:tcPr>
+          <w:p>
+            <w:pPr>
+              <w:spacing w:after="40" w:line="270" w:lineRule="auto"/>
+            </w:pPr>
+            <w:r>
+              <w:t>/admin/login</w:t>
+            </w:r>
+          </w:p>
+          <w:p>
+            <w:pPr>
+              <w:spacing w:after="40" w:line="270" w:lineRule="auto"/>
+            </w:pPr>
+            <w:r>
+              <w:t>(not linked anywhere on the website)</w:t>
+            </w:r>
+          </w:p>
+        </w:tc>
+        <w:tc>
+          <w:tcPr>
+            <w:tcW w:w="3164" w:type="dxa"/>
+            <w:tcBorders>
+              <w:top w:val="single" w:sz="4" w:space="0" w:color="D5D9E0"/>
+              <w:left w:val="single" w:sz="4" w:space="0" w:color="D5D9E0"/>
+              <w:bottom w:val="single" w:sz="4" w:space="0" w:color="D5D9E0"/>
+              <w:right w:val="single" w:sz="4" w:space="0" w:color="D5D9E0"/>
+            </w:tcBorders>
+            <w:tcMar>
+              <w:top w:w="80" w:type="dxa"/>
+              <w:left w:w="120" w:type="dxa"/>
+              <w:bottom w:w="80" w:type="dxa"/>
+              <w:right w:w="120" w:type="dxa"/>
+            </w:tcMar>
+          </w:tcPr>
+          <w:p>
+            <w:pPr>
+              <w:spacing w:after="40" w:line="270" w:lineRule="auto"/>
+            </w:pPr>
+            <w:r>
+              <w:t>People on the Team page with access Owner, Admin or Editor</w:t>
+            </w:r>
+          </w:p>
+        </w:tc>
+        <w:tc>
+          <w:tcPr>
+            <w:tcW w:w="3164" w:type="dxa"/>
+            <w:tcBorders>
+              <w:top w:val="single" w:sz="4" w:space="0" w:color="D5D9E0"/>
+              <w:left w:val="single" w:sz="4" w:space="0" w:color="D5D9E0"/>
+              <w:bottom w:val="single" w:sz="4" w:space="0" w:color="D5D9E0"/>
+              <w:right w:val="single" w:sz="4" w:space="0" w:color="D5D9E0"/>
+            </w:tcBorders>
+            <w:tcMar>
+              <w:top w:w="80" w:type="dxa"/>
+              <w:left w:w="120" w:type="dxa"/>
+              <w:bottom w:w="80" w:type="dxa"/>
+              <w:right w:w="120" w:type="dxa"/>
+            </w:tcMar>
+          </w:tcPr>
+          <w:p>
+            <w:pPr>
+              <w:spacing w:after="40" w:line="270" w:lineRule="auto"/>
+            </w:pPr>
+            <w:r>
+              <w:t>The admin console</w:t>
             </w:r>
           </w:p>
         </w:tc>
@@ -3721,10 +3879,10 @@
           <w:b/>
           <w:bCs/>
         </w:rPr>
-        <w:t>One email, two accounts.</w:t>
-      </w:r>
-      <w:r>
-        <w:t xml:space="preserve"> The same email can belong to a firm account and a client account. Which one opens depends only on the page used. For example, a partner can also be a client of the firm and sign in at /login to see only their own matters.</w:t>
+        <w:t>All three at once.</w:t>
+      </w:r>
+      <w:r>
+        <w:t xml:space="preserve"> Each area keeps its own sign-in, so one person, for example an owner, can be signed in to the admin console, the lawyer workspace and (with a client account) the client dashboard in the same browser at the same time.</w:t>
       </w:r>
     </w:p>
     <w:p>
@@ -3741,10 +3899,10 @@
           <w:b/>
           <w:bCs/>
         </w:rPr>
-        <w:t>Wrong door.</w:t>
-      </w:r>
-      <w:r>
-        <w:t xml:space="preserve"> A lawyer who uses the admin sign-in is pointed to the lawyer sign-in, and the other way round. Someone signed in to one area who opens another is offered 'Sign out and sign in here'.</w:t>
+        <w:t>Signing out</w:t>
+      </w:r>
+      <w:r>
+        <w:t xml:space="preserve"> of one area leaves the other two signed in.</w:t>
       </w:r>
     </w:p>
     <w:p>
@@ -3761,23 +3919,11 @@
           <w:b/>
           <w:bCs/>
         </w:rPr>
-        <w:t>One sign-in per browser.</w:t>
-      </w:r>
-      <w:r>
-        <w:t xml:space="preserve"> Signing in at one page signs the browser out of the other. Use a second browser (or a private window) to be in two areas at once.</w:t>
-      </w:r>
-    </w:p>
-    <w:p>
-      <w:pPr>
-        <w:pStyle w:val="Heading2"/>
-        <w:keepNext/>
-        <w:keepLines/>
-      </w:pPr>
-      <w:bookmarkStart w:id="4" w:name="_Toc241612365"/>
-      <w:r>
-        <w:t>How people prove who they are</w:t>
-      </w:r>
-      <w:bookmarkEnd w:id="4"/>
+        <w:t>Owners and administrators in the lawyer workspace</w:t>
+      </w:r>
+      <w:r>
+        <w:t xml:space="preserve"> work exactly as a lawyer does there: they see only the cases they are assigned to. They see every case in the admin console.</w:t>
+      </w:r>
     </w:p>
     <w:p>
       <w:pPr>
@@ -3793,50 +3939,10 @@
           <w:b/>
           <w:bCs/>
         </w:rPr>
-        <w:t>Firm members</w:t>
-      </w:r>
-      <w:r>
-        <w:t xml:space="preserve"> use 'Continue with Google' with the email an administrator added for them in Team (Lawyers). There are no passwords to send or reset.</w:t>
-      </w:r>
-    </w:p>
-    <w:p>
-      <w:pPr>
-        <w:pStyle w:val="ListParagraph"/>
-        <w:numPr>
-          <w:ilvl w:val="0"/>
-          <w:numId w:val="2"/>
-        </w:numPr>
-        <w:spacing w:after="80" w:line="290" w:lineRule="auto"/>
-      </w:pPr>
-      <w:r>
-        <w:rPr>
-          <w:b/>
-          <w:bCs/>
-        </w:rPr>
-        <w:t>Clients</w:t>
-      </w:r>
-      <w:r>
-        <w:t xml:space="preserve"> can use a one-time code sent to their mobile (via MSG91), or 'Continue with Google'. A client who signs in with Google is asked once to add and confirm their mobile number.</w:t>
-      </w:r>
-    </w:p>
-    <w:p>
-      <w:pPr>
-        <w:pStyle w:val="ListParagraph"/>
-        <w:numPr>
-          <w:ilvl w:val="0"/>
-          <w:numId w:val="2"/>
-        </w:numPr>
-        <w:spacing w:after="80" w:line="290" w:lineRule="auto"/>
-      </w:pPr>
-      <w:r>
-        <w:rPr>
-          <w:b/>
-          <w:bCs/>
-        </w:rPr>
-        <w:t>The first owner</w:t>
-      </w:r>
-      <w:r>
-        <w:t xml:space="preserve"> is created automatically the first time an email listed in the server setting ADMIN_EMAILS signs in at the admin page.</w:t>
+        <w:t>The admin page is not advertised.</w:t>
+      </w:r>
+      <w:r>
+        <w:t xml:space="preserve"> It is reached only by typing /admin/login; the website and the other sign-in pages do not link to it.</w:t>
       </w:r>
     </w:p>
     <w:p>
@@ -3845,48 +3951,11 @@
         <w:keepNext/>
         <w:keepLines/>
       </w:pPr>
-      <w:bookmarkStart w:id="5" w:name="_Toc241612366"/>
-      <w:r>
-        <w:t>Staying signed in, and stopping access</w:t>
-      </w:r>
-      <w:bookmarkEnd w:id="5"/>
-    </w:p>
-    <w:p>
-      <w:pPr>
-        <w:pStyle w:val="ListParagraph"/>
-        <w:numPr>
-          <w:ilvl w:val="0"/>
-          <w:numId w:val="2"/>
-        </w:numPr>
-        <w:spacing w:after="80" w:line="290" w:lineRule="auto"/>
-      </w:pPr>
-      <w:r>
-        <w:t>Firm sessions last 12 hours; client sessions last 7 days.</w:t>
-      </w:r>
-    </w:p>
-    <w:p>
-      <w:pPr>
-        <w:pStyle w:val="ListParagraph"/>
-        <w:numPr>
-          <w:ilvl w:val="0"/>
-          <w:numId w:val="2"/>
-        </w:numPr>
-        <w:spacing w:after="80" w:line="290" w:lineRule="auto"/>
-      </w:pPr>
-      <w:r>
-        <w:t>Deactivating an account (Team or Clients → Edit → Account → Deactivated) signs that person out everywhere at once. Their history is kept.</w:t>
-      </w:r>
-    </w:p>
-    <w:p>
-      <w:pPr>
-        <w:pStyle w:val="Heading1"/>
-        <w:pageBreakBefore/>
-      </w:pPr>
-      <w:bookmarkStart w:id="6" w:name="_Toc241612367"/>
-      <w:r>
-        <w:t>3. Who can do what</w:t>
-      </w:r>
-      <w:bookmarkEnd w:id="6"/>
+      <w:bookmarkStart w:id="4" w:name="_Toc241788991"/>
+      <w:r>
+        <w:t>How people prove who they are</w:t>
+      </w:r>
+      <w:bookmarkEnd w:id="4"/>
     </w:p>
     <w:tbl>
       <w:tblPr>
@@ -3906,10 +3975,9 @@
         <w:tblLook w:val="04A0" w:firstRow="1" w:lastRow="0" w:firstColumn="1" w:lastColumn="0" w:noHBand="0" w:noVBand="1"/>
       </w:tblPr>
       <w:tblGrid>
-        <w:gridCol w:w="1484"/>
-        <w:gridCol w:w="2360"/>
-        <w:gridCol w:w="2907"/>
-        <w:gridCol w:w="2555"/>
+        <w:gridCol w:w="1861"/>
+        <w:gridCol w:w="3722"/>
+        <w:gridCol w:w="3723"/>
       </w:tblGrid>
       <w:tr>
         <w:tblPrEx>
@@ -3923,7 +3991,7 @@
         </w:trPr>
         <w:tc>
           <w:tcPr>
-            <w:tcW w:w="1303" w:type="dxa"/>
+            <w:tcW w:w="1861" w:type="dxa"/>
             <w:tcBorders>
               <w:top w:val="single" w:sz="4" w:space="0" w:color="D5D9E0"/>
               <w:left w:val="single" w:sz="4" w:space="0" w:color="D5D9E0"/>
@@ -3948,13 +4016,13 @@
                 <w:bCs/>
                 <w:color w:val="FFFFFF"/>
               </w:rPr>
-              <w:t>Who</w:t>
-            </w:r>
-          </w:p>
-        </w:tc>
-        <w:tc>
-          <w:tcPr>
-            <w:tcW w:w="2420" w:type="dxa"/>
+              <w:t>Sign-in</w:t>
+            </w:r>
+          </w:p>
+        </w:tc>
+        <w:tc>
+          <w:tcPr>
+            <w:tcW w:w="3722" w:type="dxa"/>
             <w:tcBorders>
               <w:top w:val="single" w:sz="4" w:space="0" w:color="D5D9E0"/>
               <w:left w:val="single" w:sz="4" w:space="0" w:color="D5D9E0"/>
@@ -3979,13 +4047,13 @@
                 <w:bCs/>
                 <w:color w:val="FFFFFF"/>
               </w:rPr>
-              <w:t>Can see</w:t>
-            </w:r>
-          </w:p>
-        </w:tc>
-        <w:tc>
-          <w:tcPr>
-            <w:tcW w:w="2978" w:type="dxa"/>
+              <w:t>Mobile code (OTP)</w:t>
+            </w:r>
+          </w:p>
+        </w:tc>
+        <w:tc>
+          <w:tcPr>
+            <w:tcW w:w="3723" w:type="dxa"/>
             <w:tcBorders>
               <w:top w:val="single" w:sz="4" w:space="0" w:color="D5D9E0"/>
               <w:left w:val="single" w:sz="4" w:space="0" w:color="D5D9E0"/>
@@ -4010,38 +4078,7 @@
                 <w:bCs/>
                 <w:color w:val="FFFFFF"/>
               </w:rPr>
-              <w:t>Can do</w:t>
-            </w:r>
-          </w:p>
-        </w:tc>
-        <w:tc>
-          <w:tcPr>
-            <w:tcW w:w="2605" w:type="dxa"/>
-            <w:tcBorders>
-              <w:top w:val="single" w:sz="4" w:space="0" w:color="D5D9E0"/>
-              <w:left w:val="single" w:sz="4" w:space="0" w:color="D5D9E0"/>
-              <w:bottom w:val="single" w:sz="4" w:space="0" w:color="D5D9E0"/>
-              <w:right w:val="single" w:sz="4" w:space="0" w:color="D5D9E0"/>
-            </w:tcBorders>
-            <w:shd w:val="clear" w:color="auto" w:fill="14213D"/>
-            <w:tcMar>
-              <w:top w:w="80" w:type="dxa"/>
-              <w:left w:w="120" w:type="dxa"/>
-              <w:bottom w:w="80" w:type="dxa"/>
-              <w:right w:w="120" w:type="dxa"/>
-            </w:tcMar>
-          </w:tcPr>
-          <w:p>
-            <w:pPr>
-              <w:spacing w:after="40" w:line="270" w:lineRule="auto"/>
-            </w:pPr>
-            <w:r>
-              <w:rPr>
-                <w:b/>
-                <w:bCs/>
-                <w:color w:val="FFFFFF"/>
-              </w:rPr>
-              <w:t>Cannot do</w:t>
+              <w:t>Continue with Google</w:t>
             </w:r>
           </w:p>
         </w:tc>
@@ -4055,101 +4092,76 @@
         </w:tblPrEx>
         <w:tc>
           <w:tcPr>
-            <w:tcW w:w="1303" w:type="dxa"/>
-            <w:tcBorders>
-              <w:top w:val="single" w:sz="4" w:space="0" w:color="D5D9E0"/>
-              <w:left w:val="single" w:sz="4" w:space="0" w:color="D5D9E0"/>
-              <w:bottom w:val="single" w:sz="4" w:space="0" w:color="D5D9E0"/>
-              <w:right w:val="single" w:sz="4" w:space="0" w:color="D5D9E0"/>
-            </w:tcBorders>
-            <w:tcMar>
-              <w:top w:w="80" w:type="dxa"/>
-              <w:left w:w="120" w:type="dxa"/>
-              <w:bottom w:w="80" w:type="dxa"/>
-              <w:right w:w="120" w:type="dxa"/>
-            </w:tcMar>
-          </w:tcPr>
-          <w:p>
-            <w:pPr>
-              <w:spacing w:after="40" w:line="270" w:lineRule="auto"/>
-            </w:pPr>
-            <w:r>
-              <w:t>Owner</w:t>
-            </w:r>
-          </w:p>
-        </w:tc>
-        <w:tc>
-          <w:tcPr>
-            <w:tcW w:w="2420" w:type="dxa"/>
-            <w:tcBorders>
-              <w:top w:val="single" w:sz="4" w:space="0" w:color="D5D9E0"/>
-              <w:left w:val="single" w:sz="4" w:space="0" w:color="D5D9E0"/>
-              <w:bottom w:val="single" w:sz="4" w:space="0" w:color="D5D9E0"/>
-              <w:right w:val="single" w:sz="4" w:space="0" w:color="D5D9E0"/>
-            </w:tcBorders>
-            <w:tcMar>
-              <w:top w:w="80" w:type="dxa"/>
-              <w:left w:w="120" w:type="dxa"/>
-              <w:bottom w:w="80" w:type="dxa"/>
-              <w:right w:w="120" w:type="dxa"/>
-            </w:tcMar>
-          </w:tcPr>
-          <w:p>
-            <w:pPr>
-              <w:spacing w:after="40" w:line="270" w:lineRule="auto"/>
-            </w:pPr>
-            <w:r>
-              <w:t>Everything</w:t>
-            </w:r>
-          </w:p>
-        </w:tc>
-        <w:tc>
-          <w:tcPr>
-            <w:tcW w:w="2978" w:type="dxa"/>
-            <w:tcBorders>
-              <w:top w:val="single" w:sz="4" w:space="0" w:color="D5D9E0"/>
-              <w:left w:val="single" w:sz="4" w:space="0" w:color="D5D9E0"/>
-              <w:bottom w:val="single" w:sz="4" w:space="0" w:color="D5D9E0"/>
-              <w:right w:val="single" w:sz="4" w:space="0" w:color="D5D9E0"/>
-            </w:tcBorders>
-            <w:tcMar>
-              <w:top w:w="80" w:type="dxa"/>
-              <w:left w:w="120" w:type="dxa"/>
-              <w:bottom w:w="80" w:type="dxa"/>
-              <w:right w:w="120" w:type="dxa"/>
-            </w:tcMar>
-          </w:tcPr>
-          <w:p>
-            <w:pPr>
-              <w:spacing w:after="40" w:line="270" w:lineRule="auto"/>
-            </w:pPr>
-            <w:r>
-              <w:t>Everything, including adding or changing owners and administrators</w:t>
-            </w:r>
-          </w:p>
-        </w:tc>
-        <w:tc>
-          <w:tcPr>
-            <w:tcW w:w="2605" w:type="dxa"/>
-            <w:tcBorders>
-              <w:top w:val="single" w:sz="4" w:space="0" w:color="D5D9E0"/>
-              <w:left w:val="single" w:sz="4" w:space="0" w:color="D5D9E0"/>
-              <w:bottom w:val="single" w:sz="4" w:space="0" w:color="D5D9E0"/>
-              <w:right w:val="single" w:sz="4" w:space="0" w:color="D5D9E0"/>
-            </w:tcBorders>
-            <w:tcMar>
-              <w:top w:w="80" w:type="dxa"/>
-              <w:left w:w="120" w:type="dxa"/>
-              <w:bottom w:w="80" w:type="dxa"/>
-              <w:right w:w="120" w:type="dxa"/>
-            </w:tcMar>
-          </w:tcPr>
-          <w:p>
-            <w:pPr>
-              <w:spacing w:after="40" w:line="270" w:lineRule="auto"/>
-            </w:pPr>
-            <w:r>
-              <w:t>—</w:t>
+            <w:tcW w:w="1861" w:type="dxa"/>
+            <w:tcBorders>
+              <w:top w:val="single" w:sz="4" w:space="0" w:color="D5D9E0"/>
+              <w:left w:val="single" w:sz="4" w:space="0" w:color="D5D9E0"/>
+              <w:bottom w:val="single" w:sz="4" w:space="0" w:color="D5D9E0"/>
+              <w:right w:val="single" w:sz="4" w:space="0" w:color="D5D9E0"/>
+            </w:tcBorders>
+            <w:tcMar>
+              <w:top w:w="80" w:type="dxa"/>
+              <w:left w:w="120" w:type="dxa"/>
+              <w:bottom w:w="80" w:type="dxa"/>
+              <w:right w:w="120" w:type="dxa"/>
+            </w:tcMar>
+          </w:tcPr>
+          <w:p>
+            <w:pPr>
+              <w:spacing w:after="40" w:line="270" w:lineRule="auto"/>
+            </w:pPr>
+            <w:r>
+              <w:t>Client</w:t>
+            </w:r>
+          </w:p>
+        </w:tc>
+        <w:tc>
+          <w:tcPr>
+            <w:tcW w:w="3722" w:type="dxa"/>
+            <w:tcBorders>
+              <w:top w:val="single" w:sz="4" w:space="0" w:color="D5D9E0"/>
+              <w:left w:val="single" w:sz="4" w:space="0" w:color="D5D9E0"/>
+              <w:bottom w:val="single" w:sz="4" w:space="0" w:color="D5D9E0"/>
+              <w:right w:val="single" w:sz="4" w:space="0" w:color="D5D9E0"/>
+            </w:tcBorders>
+            <w:tcMar>
+              <w:top w:w="80" w:type="dxa"/>
+              <w:left w:w="120" w:type="dxa"/>
+              <w:bottom w:w="80" w:type="dxa"/>
+              <w:right w:w="120" w:type="dxa"/>
+            </w:tcMar>
+          </w:tcPr>
+          <w:p>
+            <w:pPr>
+              <w:spacing w:after="40" w:line="270" w:lineRule="auto"/>
+            </w:pPr>
+            <w:r>
+              <w:t>Any mobile number. A new number creates a new client account; a known one signs in.</w:t>
+            </w:r>
+          </w:p>
+        </w:tc>
+        <w:tc>
+          <w:tcPr>
+            <w:tcW w:w="3723" w:type="dxa"/>
+            <w:tcBorders>
+              <w:top w:val="single" w:sz="4" w:space="0" w:color="D5D9E0"/>
+              <w:left w:val="single" w:sz="4" w:space="0" w:color="D5D9E0"/>
+              <w:bottom w:val="single" w:sz="4" w:space="0" w:color="D5D9E0"/>
+              <w:right w:val="single" w:sz="4" w:space="0" w:color="D5D9E0"/>
+            </w:tcBorders>
+            <w:tcMar>
+              <w:top w:w="80" w:type="dxa"/>
+              <w:left w:w="120" w:type="dxa"/>
+              <w:bottom w:w="80" w:type="dxa"/>
+              <w:right w:w="120" w:type="dxa"/>
+            </w:tcMar>
+          </w:tcPr>
+          <w:p>
+            <w:pPr>
+              <w:spacing w:after="40" w:line="270" w:lineRule="auto"/>
+            </w:pPr>
+            <w:r>
+              <w:t>Any Google account. A new one creates a client account and is asked once to add and confirm a mobile number.</w:t>
             </w:r>
           </w:p>
         </w:tc>
@@ -4163,6 +4175,273 @@
         </w:tblPrEx>
         <w:tc>
           <w:tcPr>
+            <w:tcW w:w="1861" w:type="dxa"/>
+            <w:tcBorders>
+              <w:top w:val="single" w:sz="4" w:space="0" w:color="D5D9E0"/>
+              <w:left w:val="single" w:sz="4" w:space="0" w:color="D5D9E0"/>
+              <w:bottom w:val="single" w:sz="4" w:space="0" w:color="D5D9E0"/>
+              <w:right w:val="single" w:sz="4" w:space="0" w:color="D5D9E0"/>
+            </w:tcBorders>
+            <w:tcMar>
+              <w:top w:w="80" w:type="dxa"/>
+              <w:left w:w="120" w:type="dxa"/>
+              <w:bottom w:w="80" w:type="dxa"/>
+              <w:right w:w="120" w:type="dxa"/>
+            </w:tcMar>
+          </w:tcPr>
+          <w:p>
+            <w:pPr>
+              <w:spacing w:after="40" w:line="270" w:lineRule="auto"/>
+            </w:pPr>
+            <w:r>
+              <w:t>Lawyer and admin</w:t>
+            </w:r>
+          </w:p>
+        </w:tc>
+        <w:tc>
+          <w:tcPr>
+            <w:tcW w:w="3722" w:type="dxa"/>
+            <w:tcBorders>
+              <w:top w:val="single" w:sz="4" w:space="0" w:color="D5D9E0"/>
+              <w:left w:val="single" w:sz="4" w:space="0" w:color="D5D9E0"/>
+              <w:bottom w:val="single" w:sz="4" w:space="0" w:color="D5D9E0"/>
+              <w:right w:val="single" w:sz="4" w:space="0" w:color="D5D9E0"/>
+            </w:tcBorders>
+            <w:tcMar>
+              <w:top w:w="80" w:type="dxa"/>
+              <w:left w:w="120" w:type="dxa"/>
+              <w:bottom w:w="80" w:type="dxa"/>
+              <w:right w:w="120" w:type="dxa"/>
+            </w:tcMar>
+          </w:tcPr>
+          <w:p>
+            <w:pPr>
+              <w:spacing w:after="40" w:line="270" w:lineRule="auto"/>
+            </w:pPr>
+            <w:r>
+              <w:t>Only the mobile number saved for that person on the Team page.</w:t>
+            </w:r>
+          </w:p>
+        </w:tc>
+        <w:tc>
+          <w:tcPr>
+            <w:tcW w:w="3723" w:type="dxa"/>
+            <w:tcBorders>
+              <w:top w:val="single" w:sz="4" w:space="0" w:color="D5D9E0"/>
+              <w:left w:val="single" w:sz="4" w:space="0" w:color="D5D9E0"/>
+              <w:bottom w:val="single" w:sz="4" w:space="0" w:color="D5D9E0"/>
+              <w:right w:val="single" w:sz="4" w:space="0" w:color="D5D9E0"/>
+            </w:tcBorders>
+            <w:tcMar>
+              <w:top w:w="80" w:type="dxa"/>
+              <w:left w:w="120" w:type="dxa"/>
+              <w:bottom w:w="80" w:type="dxa"/>
+              <w:right w:w="120" w:type="dxa"/>
+            </w:tcMar>
+          </w:tcPr>
+          <w:p>
+            <w:pPr>
+              <w:spacing w:after="40" w:line="270" w:lineRule="auto"/>
+            </w:pPr>
+            <w:r>
+              <w:t>Only the email saved for that person on the Team page.</w:t>
+            </w:r>
+          </w:p>
+        </w:tc>
+      </w:tr>
+    </w:tbl>
+    <w:p>
+      <w:pPr>
+        <w:spacing w:after="120"/>
+      </w:pPr>
+    </w:p>
+    <w:p>
+      <w:pPr>
+        <w:pStyle w:val="ListParagraph"/>
+        <w:numPr>
+          <w:ilvl w:val="0"/>
+          <w:numId w:val="2"/>
+        </w:numPr>
+        <w:spacing w:after="80" w:line="290" w:lineRule="auto"/>
+      </w:pPr>
+      <w:r>
+        <w:rPr>
+          <w:b/>
+          <w:bCs/>
+        </w:rPr>
+        <w:t>Firm members are never created by signing in.</w:t>
+      </w:r>
+      <w:r>
+        <w:t xml:space="preserve"> An owner or administrator adds them first on the Team page, with their email and mobile number, and chooses their access (Owner, Admin, Lawyer, Editor or No sign-in).</w:t>
+      </w:r>
+    </w:p>
+    <w:p>
+      <w:pPr>
+        <w:pStyle w:val="ListParagraph"/>
+        <w:numPr>
+          <w:ilvl w:val="0"/>
+          <w:numId w:val="2"/>
+        </w:numPr>
+        <w:spacing w:after="80" w:line="290" w:lineRule="auto"/>
+      </w:pPr>
+      <w:r>
+        <w:rPr>
+          <w:b/>
+          <w:bCs/>
+        </w:rPr>
+        <w:t>Someone not on the Team page</w:t>
+      </w:r>
+      <w:r>
+        <w:t>, or whose access does not allow that page, is told the email or number is not registered with the firm and to ask the administrator.</w:t>
+      </w:r>
+    </w:p>
+    <w:p>
+      <w:pPr>
+        <w:pStyle w:val="ListParagraph"/>
+        <w:numPr>
+          <w:ilvl w:val="0"/>
+          <w:numId w:val="2"/>
+        </w:numPr>
+        <w:spacing w:after="80" w:line="290" w:lineRule="auto"/>
+      </w:pPr>
+      <w:r>
+        <w:rPr>
+          <w:b/>
+          <w:bCs/>
+        </w:rPr>
+        <w:t>The first owner</w:t>
+      </w:r>
+      <w:r>
+        <w:t xml:space="preserve"> is created automatically the first time an email listed in the server setting ADMIN_EMAILS signs in at the admin page.</w:t>
+      </w:r>
+    </w:p>
+    <w:p>
+      <w:pPr>
+        <w:pStyle w:val="ListParagraph"/>
+        <w:numPr>
+          <w:ilvl w:val="0"/>
+          <w:numId w:val="2"/>
+        </w:numPr>
+        <w:spacing w:after="80" w:line="290" w:lineRule="auto"/>
+      </w:pPr>
+      <w:r>
+        <w:t>There are no passwords to send, reset or leak.</w:t>
+      </w:r>
+    </w:p>
+    <w:p>
+      <w:pPr>
+        <w:pStyle w:val="Heading2"/>
+        <w:keepNext/>
+        <w:keepLines/>
+      </w:pPr>
+      <w:bookmarkStart w:id="5" w:name="_Toc241788992"/>
+      <w:r>
+        <w:t>Who can sign in: the Team page panel</w:t>
+      </w:r>
+      <w:bookmarkEnd w:id="5"/>
+    </w:p>
+    <w:p>
+      <w:pPr>
+        <w:spacing w:after="140" w:line="300" w:lineRule="auto"/>
+      </w:pPr>
+      <w:r>
+        <w:t xml:space="preserve">Admin console → Team (Lawyers) opens with a </w:t>
+      </w:r>
+      <w:r>
+        <w:rPr>
+          <w:b/>
+          <w:bCs/>
+        </w:rPr>
+        <w:t>Who can sign in</w:t>
+      </w:r>
+      <w:r>
+        <w:t xml:space="preserve"> panel. It lists every email that can open the admin console and every email that can open the lawyer workspace (lawyers, administrators and owners), with each person's access and when they last signed in, plus any ADMIN_EMAILS that have not signed in yet. To give or remove access, change the person's access with Edit; it applies on their next click, without them signing out.</w:t>
+      </w:r>
+    </w:p>
+    <w:p>
+      <w:pPr>
+        <w:pStyle w:val="Heading2"/>
+        <w:keepNext/>
+        <w:keepLines/>
+      </w:pPr>
+      <w:bookmarkStart w:id="6" w:name="_Toc241788993"/>
+      <w:r>
+        <w:t>Staying signed in, and stopping access</w:t>
+      </w:r>
+      <w:bookmarkEnd w:id="6"/>
+    </w:p>
+    <w:p>
+      <w:pPr>
+        <w:pStyle w:val="ListParagraph"/>
+        <w:numPr>
+          <w:ilvl w:val="0"/>
+          <w:numId w:val="2"/>
+        </w:numPr>
+        <w:spacing w:after="80" w:line="290" w:lineRule="auto"/>
+      </w:pPr>
+      <w:r>
+        <w:t>Firm sessions last 12 hours; client sessions last 7 days.</w:t>
+      </w:r>
+    </w:p>
+    <w:p>
+      <w:pPr>
+        <w:pStyle w:val="ListParagraph"/>
+        <w:numPr>
+          <w:ilvl w:val="0"/>
+          <w:numId w:val="2"/>
+        </w:numPr>
+        <w:spacing w:after="80" w:line="290" w:lineRule="auto"/>
+      </w:pPr>
+      <w:r>
+        <w:t>Deactivating an account (Team or Clients → Edit → Account → Deactivated) signs that person out of every area at once. Their history is kept.</w:t>
+      </w:r>
+    </w:p>
+    <w:p>
+      <w:pPr>
+        <w:pStyle w:val="Heading1"/>
+        <w:pageBreakBefore/>
+      </w:pPr>
+      <w:bookmarkStart w:id="7" w:name="_Toc241788994"/>
+      <w:r>
+        <w:t>3. Who can do what</w:t>
+      </w:r>
+      <w:bookmarkEnd w:id="7"/>
+    </w:p>
+    <w:tbl>
+      <w:tblPr>
+        <w:tblW w:w="9306" w:type="dxa"/>
+        <w:tblBorders>
+          <w:top w:val="single" w:sz="4" w:space="0" w:color="auto"/>
+          <w:left w:val="single" w:sz="4" w:space="0" w:color="auto"/>
+          <w:bottom w:val="single" w:sz="4" w:space="0" w:color="auto"/>
+          <w:right w:val="single" w:sz="4" w:space="0" w:color="auto"/>
+          <w:insideH w:val="single" w:sz="4" w:space="0" w:color="auto"/>
+          <w:insideV w:val="single" w:sz="4" w:space="0" w:color="auto"/>
+        </w:tblBorders>
+        <w:tblCellMar>
+          <w:left w:w="10" w:type="dxa"/>
+          <w:right w:w="10" w:type="dxa"/>
+        </w:tblCellMar>
+        <w:tblLook w:val="04A0" w:firstRow="1" w:lastRow="0" w:firstColumn="1" w:lastColumn="0" w:noHBand="0" w:noVBand="1"/>
+      </w:tblPr>
+      <w:tblGrid>
+        <w:gridCol w:w="1548"/>
+        <w:gridCol w:w="2339"/>
+        <w:gridCol w:w="2882"/>
+        <w:gridCol w:w="2537"/>
+      </w:tblGrid>
+      <w:tr>
+        <w:tblPrEx>
+          <w:tblCellMar>
+            <w:top w:w="0" w:type="dxa"/>
+            <w:bottom w:w="0" w:type="dxa"/>
+          </w:tblCellMar>
+        </w:tblPrEx>
+        <w:trPr>
+          <w:tblHeader/>
+        </w:trPr>
+        <w:tc>
+          <w:tcPr>
             <w:tcW w:w="1303" w:type="dxa"/>
             <w:tcBorders>
               <w:top w:val="single" w:sz="4" w:space="0" w:color="D5D9E0"/>
@@ -4170,19 +4449,25 @@
               <w:bottom w:val="single" w:sz="4" w:space="0" w:color="D5D9E0"/>
               <w:right w:val="single" w:sz="4" w:space="0" w:color="D5D9E0"/>
             </w:tcBorders>
-            <w:tcMar>
-              <w:top w:w="80" w:type="dxa"/>
-              <w:left w:w="120" w:type="dxa"/>
-              <w:bottom w:w="80" w:type="dxa"/>
-              <w:right w:w="120" w:type="dxa"/>
-            </w:tcMar>
-          </w:tcPr>
-          <w:p>
-            <w:pPr>
-              <w:spacing w:after="40" w:line="270" w:lineRule="auto"/>
-            </w:pPr>
-            <w:r>
-              <w:t>Administrator</w:t>
+            <w:shd w:val="clear" w:color="auto" w:fill="14213D"/>
+            <w:tcMar>
+              <w:top w:w="80" w:type="dxa"/>
+              <w:left w:w="120" w:type="dxa"/>
+              <w:bottom w:w="80" w:type="dxa"/>
+              <w:right w:w="120" w:type="dxa"/>
+            </w:tcMar>
+          </w:tcPr>
+          <w:p>
+            <w:pPr>
+              <w:spacing w:after="40" w:line="270" w:lineRule="auto"/>
+            </w:pPr>
+            <w:r>
+              <w:rPr>
+                <w:b/>
+                <w:bCs/>
+                <w:color w:val="FFFFFF"/>
+              </w:rPr>
+              <w:t>Who</w:t>
             </w:r>
           </w:p>
         </w:tc>
@@ -4195,19 +4480,25 @@
               <w:bottom w:val="single" w:sz="4" w:space="0" w:color="D5D9E0"/>
               <w:right w:val="single" w:sz="4" w:space="0" w:color="D5D9E0"/>
             </w:tcBorders>
-            <w:tcMar>
-              <w:top w:w="80" w:type="dxa"/>
-              <w:left w:w="120" w:type="dxa"/>
-              <w:bottom w:w="80" w:type="dxa"/>
-              <w:right w:w="120" w:type="dxa"/>
-            </w:tcMar>
-          </w:tcPr>
-          <w:p>
-            <w:pPr>
-              <w:spacing w:after="40" w:line="270" w:lineRule="auto"/>
-            </w:pPr>
-            <w:r>
-              <w:t>Every case, client, document, enquiry and article</w:t>
+            <w:shd w:val="clear" w:color="auto" w:fill="14213D"/>
+            <w:tcMar>
+              <w:top w:w="80" w:type="dxa"/>
+              <w:left w:w="120" w:type="dxa"/>
+              <w:bottom w:w="80" w:type="dxa"/>
+              <w:right w:w="120" w:type="dxa"/>
+            </w:tcMar>
+          </w:tcPr>
+          <w:p>
+            <w:pPr>
+              <w:spacing w:after="40" w:line="270" w:lineRule="auto"/>
+            </w:pPr>
+            <w:r>
+              <w:rPr>
+                <w:b/>
+                <w:bCs/>
+                <w:color w:val="FFFFFF"/>
+              </w:rPr>
+              <w:t>Can see</w:t>
             </w:r>
           </w:p>
         </w:tc>
@@ -4220,19 +4511,25 @@
               <w:bottom w:val="single" w:sz="4" w:space="0" w:color="D5D9E0"/>
               <w:right w:val="single" w:sz="4" w:space="0" w:color="D5D9E0"/>
             </w:tcBorders>
-            <w:tcMar>
-              <w:top w:w="80" w:type="dxa"/>
-              <w:left w:w="120" w:type="dxa"/>
-              <w:bottom w:w="80" w:type="dxa"/>
-              <w:right w:w="120" w:type="dxa"/>
-            </w:tcMar>
-          </w:tcPr>
-          <w:p>
-            <w:pPr>
-              <w:spacing w:after="40" w:line="270" w:lineRule="auto"/>
-            </w:pPr>
-            <w:r>
-              <w:t>Open cases, assign lawyers, link clients, manage lawyers and the website</w:t>
+            <w:shd w:val="clear" w:color="auto" w:fill="14213D"/>
+            <w:tcMar>
+              <w:top w:w="80" w:type="dxa"/>
+              <w:left w:w="120" w:type="dxa"/>
+              <w:bottom w:w="80" w:type="dxa"/>
+              <w:right w:w="120" w:type="dxa"/>
+            </w:tcMar>
+          </w:tcPr>
+          <w:p>
+            <w:pPr>
+              <w:spacing w:after="40" w:line="270" w:lineRule="auto"/>
+            </w:pPr>
+            <w:r>
+              <w:rPr>
+                <w:b/>
+                <w:bCs/>
+                <w:color w:val="FFFFFF"/>
+              </w:rPr>
+              <w:t>Can do</w:t>
             </w:r>
           </w:p>
         </w:tc>
@@ -4245,19 +4542,25 @@
               <w:bottom w:val="single" w:sz="4" w:space="0" w:color="D5D9E0"/>
               <w:right w:val="single" w:sz="4" w:space="0" w:color="D5D9E0"/>
             </w:tcBorders>
-            <w:tcMar>
-              <w:top w:w="80" w:type="dxa"/>
-              <w:left w:w="120" w:type="dxa"/>
-              <w:bottom w:w="80" w:type="dxa"/>
-              <w:right w:w="120" w:type="dxa"/>
-            </w:tcMar>
-          </w:tcPr>
-          <w:p>
-            <w:pPr>
-              <w:spacing w:after="40" w:line="270" w:lineRule="auto"/>
-            </w:pPr>
-            <w:r>
-              <w:t>Change an owner's or another administrator's account</w:t>
+            <w:shd w:val="clear" w:color="auto" w:fill="14213D"/>
+            <w:tcMar>
+              <w:top w:w="80" w:type="dxa"/>
+              <w:left w:w="120" w:type="dxa"/>
+              <w:bottom w:w="80" w:type="dxa"/>
+              <w:right w:w="120" w:type="dxa"/>
+            </w:tcMar>
+          </w:tcPr>
+          <w:p>
+            <w:pPr>
+              <w:spacing w:after="40" w:line="270" w:lineRule="auto"/>
+            </w:pPr>
+            <w:r>
+              <w:rPr>
+                <w:b/>
+                <w:bCs/>
+                <w:color w:val="FFFFFF"/>
+              </w:rPr>
+              <w:t>Cannot do</w:t>
             </w:r>
           </w:p>
         </w:tc>
@@ -4290,7 +4593,7 @@
               <w:spacing w:after="40" w:line="270" w:lineRule="auto"/>
             </w:pPr>
             <w:r>
-              <w:t>Lawyer</w:t>
+              <w:t>Owner</w:t>
             </w:r>
           </w:p>
         </w:tc>
@@ -4315,7 +4618,7 @@
               <w:spacing w:after="40" w:line="270" w:lineRule="auto"/>
             </w:pPr>
             <w:r>
-              <w:t>Only the cases they are assigned to, including internal files</w:t>
+              <w:t>Everything</w:t>
             </w:r>
           </w:p>
         </w:tc>
@@ -4340,7 +4643,7 @@
               <w:spacing w:after="40" w:line="270" w:lineRule="auto"/>
             </w:pPr>
             <w:r>
-              <w:t>Update a case from the court, edit its details, upload and organise documents, add timeline notes, answer client questions</w:t>
+              <w:t>Everything, including adding or changing owners and administrators</w:t>
             </w:r>
           </w:p>
         </w:tc>
@@ -4365,7 +4668,7 @@
               <w:spacing w:after="40" w:line="270" w:lineRule="auto"/>
             </w:pPr>
             <w:r>
-              <w:t>Open new cases, change who is on a case, link client accounts, see other lawyers' cases</w:t>
+              <w:t>—</w:t>
             </w:r>
           </w:p>
         </w:tc>
@@ -4398,7 +4701,7 @@
               <w:spacing w:after="40" w:line="270" w:lineRule="auto"/>
             </w:pPr>
             <w:r>
-              <w:t>Editor</w:t>
+              <w:t>Administrator</w:t>
             </w:r>
           </w:p>
         </w:tc>
@@ -4423,7 +4726,7 @@
               <w:spacing w:after="40" w:line="270" w:lineRule="auto"/>
             </w:pPr>
             <w:r>
-              <w:t>Website content</w:t>
+              <w:t>Every case, client, document, enquiry and article</w:t>
             </w:r>
           </w:p>
         </w:tc>
@@ -4448,7 +4751,7 @@
               <w:spacing w:after="40" w:line="270" w:lineRule="auto"/>
             </w:pPr>
             <w:r>
-              <w:t>Website content work</w:t>
+              <w:t>Open cases, assign lawyers, link clients, manage lawyers and the website</w:t>
             </w:r>
           </w:p>
         </w:tc>
@@ -4473,7 +4776,7 @@
               <w:spacing w:after="40" w:line="270" w:lineRule="auto"/>
             </w:pPr>
             <w:r>
-              <w:t>See any case or client</w:t>
+              <w:t>Change an owner's or another administrator's account</w:t>
             </w:r>
           </w:p>
         </w:tc>
@@ -4506,6 +4809,222 @@
               <w:spacing w:after="40" w:line="270" w:lineRule="auto"/>
             </w:pPr>
             <w:r>
+              <w:t>Lawyer (and owners or administrators in the lawyer workspace)</w:t>
+            </w:r>
+          </w:p>
+        </w:tc>
+        <w:tc>
+          <w:tcPr>
+            <w:tcW w:w="2420" w:type="dxa"/>
+            <w:tcBorders>
+              <w:top w:val="single" w:sz="4" w:space="0" w:color="D5D9E0"/>
+              <w:left w:val="single" w:sz="4" w:space="0" w:color="D5D9E0"/>
+              <w:bottom w:val="single" w:sz="4" w:space="0" w:color="D5D9E0"/>
+              <w:right w:val="single" w:sz="4" w:space="0" w:color="D5D9E0"/>
+            </w:tcBorders>
+            <w:tcMar>
+              <w:top w:w="80" w:type="dxa"/>
+              <w:left w:w="120" w:type="dxa"/>
+              <w:bottom w:w="80" w:type="dxa"/>
+              <w:right w:w="120" w:type="dxa"/>
+            </w:tcMar>
+          </w:tcPr>
+          <w:p>
+            <w:pPr>
+              <w:spacing w:after="40" w:line="270" w:lineRule="auto"/>
+            </w:pPr>
+            <w:r>
+              <w:t>Only the cases they are assigned to, including internal files</w:t>
+            </w:r>
+          </w:p>
+        </w:tc>
+        <w:tc>
+          <w:tcPr>
+            <w:tcW w:w="2978" w:type="dxa"/>
+            <w:tcBorders>
+              <w:top w:val="single" w:sz="4" w:space="0" w:color="D5D9E0"/>
+              <w:left w:val="single" w:sz="4" w:space="0" w:color="D5D9E0"/>
+              <w:bottom w:val="single" w:sz="4" w:space="0" w:color="D5D9E0"/>
+              <w:right w:val="single" w:sz="4" w:space="0" w:color="D5D9E0"/>
+            </w:tcBorders>
+            <w:tcMar>
+              <w:top w:w="80" w:type="dxa"/>
+              <w:left w:w="120" w:type="dxa"/>
+              <w:bottom w:w="80" w:type="dxa"/>
+              <w:right w:w="120" w:type="dxa"/>
+            </w:tcMar>
+          </w:tcPr>
+          <w:p>
+            <w:pPr>
+              <w:spacing w:after="40" w:line="270" w:lineRule="auto"/>
+            </w:pPr>
+            <w:r>
+              <w:t>Update a case from the court, edit its details, upload and organise documents, add timeline notes, answer client questions</w:t>
+            </w:r>
+          </w:p>
+        </w:tc>
+        <w:tc>
+          <w:tcPr>
+            <w:tcW w:w="2605" w:type="dxa"/>
+            <w:tcBorders>
+              <w:top w:val="single" w:sz="4" w:space="0" w:color="D5D9E0"/>
+              <w:left w:val="single" w:sz="4" w:space="0" w:color="D5D9E0"/>
+              <w:bottom w:val="single" w:sz="4" w:space="0" w:color="D5D9E0"/>
+              <w:right w:val="single" w:sz="4" w:space="0" w:color="D5D9E0"/>
+            </w:tcBorders>
+            <w:tcMar>
+              <w:top w:w="80" w:type="dxa"/>
+              <w:left w:w="120" w:type="dxa"/>
+              <w:bottom w:w="80" w:type="dxa"/>
+              <w:right w:w="120" w:type="dxa"/>
+            </w:tcMar>
+          </w:tcPr>
+          <w:p>
+            <w:pPr>
+              <w:spacing w:after="40" w:line="270" w:lineRule="auto"/>
+            </w:pPr>
+            <w:r>
+              <w:t>Open new cases, change who is on a case, link client accounts, see other lawyers' cases</w:t>
+            </w:r>
+          </w:p>
+        </w:tc>
+      </w:tr>
+      <w:tr>
+        <w:tblPrEx>
+          <w:tblCellMar>
+            <w:top w:w="0" w:type="dxa"/>
+            <w:bottom w:w="0" w:type="dxa"/>
+          </w:tblCellMar>
+        </w:tblPrEx>
+        <w:tc>
+          <w:tcPr>
+            <w:tcW w:w="1303" w:type="dxa"/>
+            <w:tcBorders>
+              <w:top w:val="single" w:sz="4" w:space="0" w:color="D5D9E0"/>
+              <w:left w:val="single" w:sz="4" w:space="0" w:color="D5D9E0"/>
+              <w:bottom w:val="single" w:sz="4" w:space="0" w:color="D5D9E0"/>
+              <w:right w:val="single" w:sz="4" w:space="0" w:color="D5D9E0"/>
+            </w:tcBorders>
+            <w:tcMar>
+              <w:top w:w="80" w:type="dxa"/>
+              <w:left w:w="120" w:type="dxa"/>
+              <w:bottom w:w="80" w:type="dxa"/>
+              <w:right w:w="120" w:type="dxa"/>
+            </w:tcMar>
+          </w:tcPr>
+          <w:p>
+            <w:pPr>
+              <w:spacing w:after="40" w:line="270" w:lineRule="auto"/>
+            </w:pPr>
+            <w:r>
+              <w:t>Editor</w:t>
+            </w:r>
+          </w:p>
+        </w:tc>
+        <w:tc>
+          <w:tcPr>
+            <w:tcW w:w="2420" w:type="dxa"/>
+            <w:tcBorders>
+              <w:top w:val="single" w:sz="4" w:space="0" w:color="D5D9E0"/>
+              <w:left w:val="single" w:sz="4" w:space="0" w:color="D5D9E0"/>
+              <w:bottom w:val="single" w:sz="4" w:space="0" w:color="D5D9E0"/>
+              <w:right w:val="single" w:sz="4" w:space="0" w:color="D5D9E0"/>
+            </w:tcBorders>
+            <w:tcMar>
+              <w:top w:w="80" w:type="dxa"/>
+              <w:left w:w="120" w:type="dxa"/>
+              <w:bottom w:w="80" w:type="dxa"/>
+              <w:right w:w="120" w:type="dxa"/>
+            </w:tcMar>
+          </w:tcPr>
+          <w:p>
+            <w:pPr>
+              <w:spacing w:after="40" w:line="270" w:lineRule="auto"/>
+            </w:pPr>
+            <w:r>
+              <w:t>Website content</w:t>
+            </w:r>
+          </w:p>
+        </w:tc>
+        <w:tc>
+          <w:tcPr>
+            <w:tcW w:w="2978" w:type="dxa"/>
+            <w:tcBorders>
+              <w:top w:val="single" w:sz="4" w:space="0" w:color="D5D9E0"/>
+              <w:left w:val="single" w:sz="4" w:space="0" w:color="D5D9E0"/>
+              <w:bottom w:val="single" w:sz="4" w:space="0" w:color="D5D9E0"/>
+              <w:right w:val="single" w:sz="4" w:space="0" w:color="D5D9E0"/>
+            </w:tcBorders>
+            <w:tcMar>
+              <w:top w:w="80" w:type="dxa"/>
+              <w:left w:w="120" w:type="dxa"/>
+              <w:bottom w:w="80" w:type="dxa"/>
+              <w:right w:w="120" w:type="dxa"/>
+            </w:tcMar>
+          </w:tcPr>
+          <w:p>
+            <w:pPr>
+              <w:spacing w:after="40" w:line="270" w:lineRule="auto"/>
+            </w:pPr>
+            <w:r>
+              <w:t>Website content work</w:t>
+            </w:r>
+          </w:p>
+        </w:tc>
+        <w:tc>
+          <w:tcPr>
+            <w:tcW w:w="2605" w:type="dxa"/>
+            <w:tcBorders>
+              <w:top w:val="single" w:sz="4" w:space="0" w:color="D5D9E0"/>
+              <w:left w:val="single" w:sz="4" w:space="0" w:color="D5D9E0"/>
+              <w:bottom w:val="single" w:sz="4" w:space="0" w:color="D5D9E0"/>
+              <w:right w:val="single" w:sz="4" w:space="0" w:color="D5D9E0"/>
+            </w:tcBorders>
+            <w:tcMar>
+              <w:top w:w="80" w:type="dxa"/>
+              <w:left w:w="120" w:type="dxa"/>
+              <w:bottom w:w="80" w:type="dxa"/>
+              <w:right w:w="120" w:type="dxa"/>
+            </w:tcMar>
+          </w:tcPr>
+          <w:p>
+            <w:pPr>
+              <w:spacing w:after="40" w:line="270" w:lineRule="auto"/>
+            </w:pPr>
+            <w:r>
+              <w:t>See any case or client</w:t>
+            </w:r>
+          </w:p>
+        </w:tc>
+      </w:tr>
+      <w:tr>
+        <w:tblPrEx>
+          <w:tblCellMar>
+            <w:top w:w="0" w:type="dxa"/>
+            <w:bottom w:w="0" w:type="dxa"/>
+          </w:tblCellMar>
+        </w:tblPrEx>
+        <w:tc>
+          <w:tcPr>
+            <w:tcW w:w="1303" w:type="dxa"/>
+            <w:tcBorders>
+              <w:top w:val="single" w:sz="4" w:space="0" w:color="D5D9E0"/>
+              <w:left w:val="single" w:sz="4" w:space="0" w:color="D5D9E0"/>
+              <w:bottom w:val="single" w:sz="4" w:space="0" w:color="D5D9E0"/>
+              <w:right w:val="single" w:sz="4" w:space="0" w:color="D5D9E0"/>
+            </w:tcBorders>
+            <w:tcMar>
+              <w:top w:w="80" w:type="dxa"/>
+              <w:left w:w="120" w:type="dxa"/>
+              <w:bottom w:w="80" w:type="dxa"/>
+              <w:right w:w="120" w:type="dxa"/>
+            </w:tcMar>
+          </w:tcPr>
+          <w:p>
+            <w:pPr>
+              <w:spacing w:after="40" w:line="270" w:lineRule="auto"/>
+            </w:pPr>
+            <w:r>
               <w:t>Client</w:t>
             </w:r>
           </w:p>
@@ -4614,11 +5133,11 @@
         <w:pStyle w:val="Heading1"/>
         <w:pageBreakBefore/>
       </w:pPr>
-      <w:bookmarkStart w:id="7" w:name="_Toc241612368"/>
+      <w:bookmarkStart w:id="8" w:name="_Toc241788995"/>
       <w:r>
         <w:t>4. The public website</w:t>
       </w:r>
-      <w:bookmarkEnd w:id="7"/>
+      <w:bookmarkEnd w:id="8"/>
     </w:p>
     <w:p>
       <w:pPr>
@@ -4626,11 +5145,11 @@
         <w:keepNext/>
         <w:keepLines/>
       </w:pPr>
-      <w:bookmarkStart w:id="8" w:name="_Toc241612369"/>
+      <w:bookmarkStart w:id="9" w:name="_Toc241788996"/>
       <w:r>
         <w:t>What visitors see</w:t>
       </w:r>
-      <w:bookmarkEnd w:id="8"/>
+      <w:bookmarkEnd w:id="9"/>
     </w:p>
     <w:tbl>
       <w:tblPr>
@@ -4894,7 +5413,7 @@
               <w:spacing w:after="40" w:line="270" w:lineRule="auto"/>
             </w:pPr>
             <w:r>
-              <w:t>A slideshow of four slides: Our people (team photograph), Our services, Why ADOORA, Careers. Then the firm's introduction, practice areas, featured people and latest articles.</w:t>
+              <w:t>A slideshow of five slides: Our people (team photograph, 'Experienced Minds, Trusted Counsels'), Pro bono, Our services, Counsel and Careers. On phones the team photograph is shown three people at a time, one slide each. Then the firm's introduction, practice areas, featured people and latest articles.</w:t>
             </w:r>
           </w:p>
         </w:tc>
@@ -4919,7 +5438,7 @@
               <w:spacing w:after="40" w:line="270" w:lineRule="auto"/>
             </w:pPr>
             <w:r>
-              <w:t>Slide text and images are set in the website's content; the team photograph can be replaced by a file of the same name.</w:t>
+              <w:t>Slide text and images are set in the website's content; the team photograph can be replaced by a file of the same name (with the number of people in it updated).</w:t>
             </w:r>
           </w:p>
         </w:tc>
@@ -5201,7 +5720,7 @@
               <w:spacing w:after="40" w:line="270" w:lineRule="auto"/>
             </w:pPr>
             <w:r>
-              <w:t>Careers</w:t>
+              <w:t>Community</w:t>
             </w:r>
           </w:p>
         </w:tc>
@@ -5226,7 +5745,7 @@
               <w:spacing w:after="40" w:line="270" w:lineRule="auto"/>
             </w:pPr>
             <w:r>
-              <w:t>Open roles and an application form.</w:t>
+              <w:t>The firm's pro bono and community work: legal aid, awareness camps, support for NGOs, and how organisations can work with the firm.</w:t>
             </w:r>
           </w:p>
         </w:tc>
@@ -5251,7 +5770,7 @@
               <w:spacing w:after="40" w:line="270" w:lineRule="auto"/>
             </w:pPr>
             <w:r>
-              <w:t>Admin console → Jobs.</w:t>
+              <w:t>Website content.</w:t>
             </w:r>
           </w:p>
         </w:tc>
@@ -5284,6 +5803,89 @@
               <w:spacing w:after="40" w:line="270" w:lineRule="auto"/>
             </w:pPr>
             <w:r>
+              <w:t>Careers</w:t>
+            </w:r>
+          </w:p>
+        </w:tc>
+        <w:tc>
+          <w:tcPr>
+            <w:tcW w:w="4653" w:type="dxa"/>
+            <w:tcBorders>
+              <w:top w:val="single" w:sz="4" w:space="0" w:color="D5D9E0"/>
+              <w:left w:val="single" w:sz="4" w:space="0" w:color="D5D9E0"/>
+              <w:bottom w:val="single" w:sz="4" w:space="0" w:color="D5D9E0"/>
+              <w:right w:val="single" w:sz="4" w:space="0" w:color="D5D9E0"/>
+            </w:tcBorders>
+            <w:tcMar>
+              <w:top w:w="80" w:type="dxa"/>
+              <w:left w:w="120" w:type="dxa"/>
+              <w:bottom w:w="80" w:type="dxa"/>
+              <w:right w:w="120" w:type="dxa"/>
+            </w:tcMar>
+          </w:tcPr>
+          <w:p>
+            <w:pPr>
+              <w:spacing w:after="40" w:line="270" w:lineRule="auto"/>
+            </w:pPr>
+            <w:r>
+              <w:t>What the work is like, open roles and an application form.</w:t>
+            </w:r>
+          </w:p>
+        </w:tc>
+        <w:tc>
+          <w:tcPr>
+            <w:tcW w:w="3164" w:type="dxa"/>
+            <w:tcBorders>
+              <w:top w:val="single" w:sz="4" w:space="0" w:color="D5D9E0"/>
+              <w:left w:val="single" w:sz="4" w:space="0" w:color="D5D9E0"/>
+              <w:bottom w:val="single" w:sz="4" w:space="0" w:color="D5D9E0"/>
+              <w:right w:val="single" w:sz="4" w:space="0" w:color="D5D9E0"/>
+            </w:tcBorders>
+            <w:tcMar>
+              <w:top w:w="80" w:type="dxa"/>
+              <w:left w:w="120" w:type="dxa"/>
+              <w:bottom w:w="80" w:type="dxa"/>
+              <w:right w:w="120" w:type="dxa"/>
+            </w:tcMar>
+          </w:tcPr>
+          <w:p>
+            <w:pPr>
+              <w:spacing w:after="40" w:line="270" w:lineRule="auto"/>
+            </w:pPr>
+            <w:r>
+              <w:t>Roles: Admin console → Jobs. Page text: website content.</w:t>
+            </w:r>
+          </w:p>
+        </w:tc>
+      </w:tr>
+      <w:tr>
+        <w:tblPrEx>
+          <w:tblCellMar>
+            <w:top w:w="0" w:type="dxa"/>
+            <w:bottom w:w="0" w:type="dxa"/>
+          </w:tblCellMar>
+        </w:tblPrEx>
+        <w:tc>
+          <w:tcPr>
+            <w:tcW w:w="1489" w:type="dxa"/>
+            <w:tcBorders>
+              <w:top w:val="single" w:sz="4" w:space="0" w:color="D5D9E0"/>
+              <w:left w:val="single" w:sz="4" w:space="0" w:color="D5D9E0"/>
+              <w:bottom w:val="single" w:sz="4" w:space="0" w:color="D5D9E0"/>
+              <w:right w:val="single" w:sz="4" w:space="0" w:color="D5D9E0"/>
+            </w:tcBorders>
+            <w:tcMar>
+              <w:top w:w="80" w:type="dxa"/>
+              <w:left w:w="120" w:type="dxa"/>
+              <w:bottom w:w="80" w:type="dxa"/>
+              <w:right w:w="120" w:type="dxa"/>
+            </w:tcMar>
+          </w:tcPr>
+          <w:p>
+            <w:pPr>
+              <w:spacing w:after="40" w:line="270" w:lineRule="auto"/>
+            </w:pPr>
+            <w:r>
               <w:t>Contact</w:t>
             </w:r>
           </w:p>
@@ -5351,11 +5953,11 @@
         <w:keepNext/>
         <w:keepLines/>
       </w:pPr>
-      <w:bookmarkStart w:id="9" w:name="_Toc241612370"/>
+      <w:bookmarkStart w:id="10" w:name="_Toc241788997"/>
       <w:r>
         <w:t>Rules the website follows</w:t>
       </w:r>
-      <w:bookmarkEnd w:id="9"/>
+      <w:bookmarkEnd w:id="10"/>
     </w:p>
     <w:p>
       <w:pPr>
@@ -5393,74 +5995,7 @@
         <w:spacing w:after="80" w:line="290" w:lineRule="auto"/>
       </w:pPr>
       <w:r>
-        <w:t>Cookies: only necessary cookies are set unless a visitor accepts optional ones.</w:t>
-      </w:r>
-    </w:p>
-    <w:p>
-      <w:pPr>
-        <w:pStyle w:val="Heading1"/>
-        <w:pageBreakBefore/>
-      </w:pPr>
-      <w:bookmarkStart w:id="10" w:name="_Toc241612371"/>
-      <w:r>
-        <w:t>5. The admin console, section by section</w:t>
-      </w:r>
-      <w:bookmarkEnd w:id="10"/>
-    </w:p>
-    <w:p>
-      <w:pPr>
-        <w:spacing w:after="140" w:line="300" w:lineRule="auto"/>
-      </w:pPr>
-      <w:r>
-        <w:t>The console has a menu on the left in two groups: the firm's work (clients and court cases) and the public website.</w:t>
-      </w:r>
-    </w:p>
-    <w:p>
-      <w:pPr>
-        <w:pStyle w:val="Heading2"/>
-        <w:keepNext/>
-        <w:keepLines/>
-      </w:pPr>
-      <w:bookmarkStart w:id="11" w:name="_Toc241612372"/>
-      <w:r>
-        <w:t>Clients &amp; court cases</w:t>
-      </w:r>
-      <w:bookmarkEnd w:id="11"/>
-    </w:p>
-    <w:p>
-      <w:pPr>
-        <w:pStyle w:val="Heading3"/>
-        <w:keepNext/>
-        <w:keepLines/>
-      </w:pPr>
-      <w:r>
-        <w:t>Overview</w:t>
-      </w:r>
-    </w:p>
-    <w:p>
-      <w:pPr>
-        <w:spacing w:after="140" w:line="300" w:lineRule="auto"/>
-      </w:pPr>
-      <w:r>
-        <w:t>Counts at a glance (open cases, new enquiries, new applications and so on), each linking to its section, and a button to open a case.</w:t>
-      </w:r>
-    </w:p>
-    <w:p>
-      <w:pPr>
-        <w:pStyle w:val="Heading3"/>
-        <w:keepNext/>
-        <w:keepLines/>
-      </w:pPr>
-      <w:r>
-        <w:t>Cases</w:t>
-      </w:r>
-    </w:p>
-    <w:p>
-      <w:pPr>
-        <w:spacing w:after="140" w:line="300" w:lineRule="auto"/>
-      </w:pPr>
-      <w:r>
-        <w:t>Every case the firm holds. Opening a case shows five tabs:</w:t>
+        <w:t>The firm's line, 'Legal Expertise. Trusted Guidance. Lasting Protection.', appears on the home page and in the footer.</w:t>
       </w:r>
     </w:p>
     <w:p>
@@ -5473,14 +6008,74 @@
         <w:spacing w:after="80" w:line="290" w:lineRule="auto"/>
       </w:pPr>
       <w:r>
-        <w:rPr>
-          <w:b/>
-          <w:bCs/>
-        </w:rPr>
-        <w:t>Overview:</w:t>
-      </w:r>
-      <w:r>
-        <w:t xml:space="preserve"> case details, parties, court status, the lawyers on the case and the client accounts that can see it (with Change buttons).</w:t>
+        <w:t>Cookies: only necessary cookies are set unless a visitor accepts optional ones.</w:t>
+      </w:r>
+    </w:p>
+    <w:p>
+      <w:pPr>
+        <w:pStyle w:val="Heading1"/>
+        <w:pageBreakBefore/>
+      </w:pPr>
+      <w:bookmarkStart w:id="11" w:name="_Toc241788998"/>
+      <w:r>
+        <w:t>5. The admin console, section by section</w:t>
+      </w:r>
+      <w:bookmarkEnd w:id="11"/>
+    </w:p>
+    <w:p>
+      <w:pPr>
+        <w:spacing w:after="140" w:line="300" w:lineRule="auto"/>
+      </w:pPr>
+      <w:r>
+        <w:t>The console has a menu on the left in two groups: the firm's work (clients and court cases) and the public website. On a phone the menu folds into a Menu button in a bar that stays at the top of the screen.</w:t>
+      </w:r>
+    </w:p>
+    <w:p>
+      <w:pPr>
+        <w:pStyle w:val="Heading2"/>
+        <w:keepNext/>
+        <w:keepLines/>
+      </w:pPr>
+      <w:bookmarkStart w:id="12" w:name="_Toc241788999"/>
+      <w:r>
+        <w:t>Clients &amp; court cases</w:t>
+      </w:r>
+      <w:bookmarkEnd w:id="12"/>
+    </w:p>
+    <w:p>
+      <w:pPr>
+        <w:pStyle w:val="Heading3"/>
+        <w:keepNext/>
+        <w:keepLines/>
+      </w:pPr>
+      <w:r>
+        <w:t>Overview</w:t>
+      </w:r>
+    </w:p>
+    <w:p>
+      <w:pPr>
+        <w:spacing w:after="140" w:line="300" w:lineRule="auto"/>
+      </w:pPr>
+      <w:r>
+        <w:t>Counts at a glance (open cases, new enquiries, new applications and so on), each linking to its section, and a button to open a case.</w:t>
+      </w:r>
+    </w:p>
+    <w:p>
+      <w:pPr>
+        <w:pStyle w:val="Heading3"/>
+        <w:keepNext/>
+        <w:keepLines/>
+      </w:pPr>
+      <w:r>
+        <w:t>Cases</w:t>
+      </w:r>
+    </w:p>
+    <w:p>
+      <w:pPr>
+        <w:spacing w:after="140" w:line="300" w:lineRule="auto"/>
+      </w:pPr>
+      <w:r>
+        <w:t>Every case the firm holds. Opening a case shows five tabs:</w:t>
       </w:r>
     </w:p>
     <w:p>
@@ -5497,10 +6092,10 @@
           <w:b/>
           <w:bCs/>
         </w:rPr>
-        <w:t>Court record:</w:t>
-      </w:r>
-      <w:r>
-        <w:t xml:space="preserve"> hearings and orders as one list, newest first. Each order sits on the hearing of the same date, with its PDF.</w:t>
+        <w:t>Overview:</w:t>
+      </w:r>
+      <w:r>
+        <w:t xml:space="preserve"> case details, parties, court status, the lawyers on the case and the client accounts that can see it (with Change buttons).</w:t>
       </w:r>
     </w:p>
     <w:p>
@@ -5517,10 +6112,10 @@
           <w:b/>
           <w:bCs/>
         </w:rPr>
-        <w:t>Documents:</w:t>
-      </w:r>
-      <w:r>
-        <w:t xml:space="preserve"> the case's folders (see section 7).</w:t>
+        <w:t>Court record:</w:t>
+      </w:r>
+      <w:r>
+        <w:t xml:space="preserve"> hearings and orders as one list, newest first. Each order sits on the hearing of the same date, with its PDF.</w:t>
       </w:r>
     </w:p>
     <w:p>
@@ -5537,10 +6132,10 @@
           <w:b/>
           <w:bCs/>
         </w:rPr>
-        <w:t>Timeline:</w:t>
-      </w:r>
-      <w:r>
-        <w:t xml:space="preserve"> every change and note, in order.</w:t>
+        <w:t>Documents:</w:t>
+      </w:r>
+      <w:r>
+        <w:t xml:space="preserve"> the case's folders (see section 7).</w:t>
       </w:r>
     </w:p>
     <w:p>
@@ -5557,97 +6152,10 @@
           <w:b/>
           <w:bCs/>
         </w:rPr>
-        <w:t>Edit details:</w:t>
-      </w:r>
-      <w:r>
-        <w:t xml:space="preserve"> the case form, with the lawyer and client-account cards beside it.</w:t>
-      </w:r>
-    </w:p>
-    <w:p>
-      <w:pPr>
-        <w:spacing w:after="140" w:line="300" w:lineRule="auto"/>
-      </w:pPr>
-      <w:r>
-        <w:rPr>
-          <w:b/>
-          <w:bCs/>
-        </w:rPr>
-        <w:t>Opening a case.</w:t>
-      </w:r>
-      <w:r>
-        <w:t xml:space="preserve"> Type the case's CNR number, then the court website's captcha. The court's own record fills in the form, and its order PDFs are saved when the case is created. The system allows only one case per CNR: adding one that exists already points you to it.</w:t>
-      </w:r>
-    </w:p>
-    <w:p>
-      <w:pPr>
-        <w:pStyle w:val="Heading3"/>
-        <w:keepNext/>
-        <w:keepLines/>
-      </w:pPr>
-      <w:r>
-        <w:t>Documents</w:t>
-      </w:r>
-    </w:p>
-    <w:p>
-      <w:pPr>
-        <w:spacing w:after="140" w:line="300" w:lineRule="auto"/>
-      </w:pPr>
-      <w:r>
-        <w:t>A drive of every case's folders, plus a 'Team shared' folder for templates, precedents and forms used across the firm.</w:t>
-      </w:r>
-    </w:p>
-    <w:p>
-      <w:pPr>
-        <w:pStyle w:val="Heading3"/>
-        <w:keepNext/>
-        <w:keepLines/>
-      </w:pPr>
-      <w:r>
-        <w:t>Clients</w:t>
-      </w:r>
-    </w:p>
-    <w:p>
-      <w:pPr>
-        <w:spacing w:after="140" w:line="300" w:lineRule="auto"/>
-      </w:pPr>
-      <w:r>
-        <w:t>Client accounts. 'Add client' asks whether the client is an individual (name, phone, email) or an organisation (organisation name, contact person, phone, email, office address), and which cases to link. Clients sign in with that email or their mobile.</w:t>
-      </w:r>
-    </w:p>
-    <w:p>
-      <w:pPr>
-        <w:pStyle w:val="Heading3"/>
-        <w:keepNext/>
-        <w:keepLines/>
-      </w:pPr>
-      <w:r>
-        <w:t>Client queries</w:t>
-      </w:r>
-    </w:p>
-    <w:p>
-      <w:pPr>
-        <w:spacing w:after="140" w:line="300" w:lineRule="auto"/>
-      </w:pPr>
-      <w:r>
-        <w:t>Questions clients raise from their dashboard, for the firm to answer.</w:t>
-      </w:r>
-    </w:p>
-    <w:p>
-      <w:pPr>
-        <w:pStyle w:val="Heading3"/>
-        <w:keepNext/>
-        <w:keepLines/>
-      </w:pPr>
-      <w:r>
-        <w:t>Team (Lawyers)</w:t>
-      </w:r>
-    </w:p>
-    <w:p>
-      <w:pPr>
-        <w:spacing w:after="140" w:line="300" w:lineRule="auto"/>
-      </w:pPr>
-      <w:r>
-        <w:t>Everyone at the firm, in one list, and the only place people are added or edited. One form covers:</w:t>
+        <w:t>Timeline:</w:t>
+      </w:r>
+      <w:r>
+        <w:t xml:space="preserve"> every change and note, in order.</w:t>
       </w:r>
     </w:p>
     <w:p>
@@ -5660,7 +6168,101 @@
         <w:spacing w:after="80" w:line="290" w:lineRule="auto"/>
       </w:pPr>
       <w:r>
-        <w:t>Photo, name, position, email, phone, Bar Council enrolment number.</w:t>
+        <w:rPr>
+          <w:b/>
+          <w:bCs/>
+        </w:rPr>
+        <w:t>Edit details:</w:t>
+      </w:r>
+      <w:r>
+        <w:t xml:space="preserve"> the case form, with the lawyer and client-account cards beside it.</w:t>
+      </w:r>
+    </w:p>
+    <w:p>
+      <w:pPr>
+        <w:spacing w:after="140" w:line="300" w:lineRule="auto"/>
+      </w:pPr>
+      <w:r>
+        <w:rPr>
+          <w:b/>
+          <w:bCs/>
+        </w:rPr>
+        <w:t>Opening a case.</w:t>
+      </w:r>
+      <w:r>
+        <w:t xml:space="preserve"> Type the case's CNR number, then the court website's captcha. The court's own record fills in the form, and its order PDFs are saved when the case is created. The system allows only one case per CNR: adding one that exists already points you to it.</w:t>
+      </w:r>
+    </w:p>
+    <w:p>
+      <w:pPr>
+        <w:pStyle w:val="Heading3"/>
+        <w:keepNext/>
+        <w:keepLines/>
+      </w:pPr>
+      <w:r>
+        <w:t>Documents</w:t>
+      </w:r>
+    </w:p>
+    <w:p>
+      <w:pPr>
+        <w:spacing w:after="140" w:line="300" w:lineRule="auto"/>
+      </w:pPr>
+      <w:r>
+        <w:t>A drive of every case's folders, plus a 'Team shared' folder for templates, precedents and forms used across the firm.</w:t>
+      </w:r>
+    </w:p>
+    <w:p>
+      <w:pPr>
+        <w:pStyle w:val="Heading3"/>
+        <w:keepNext/>
+        <w:keepLines/>
+      </w:pPr>
+      <w:r>
+        <w:t>Clients</w:t>
+      </w:r>
+    </w:p>
+    <w:p>
+      <w:pPr>
+        <w:spacing w:after="140" w:line="300" w:lineRule="auto"/>
+      </w:pPr>
+      <w:r>
+        <w:t>Client accounts. 'Add client' asks whether the client is an individual (name, phone, email) or an organisation (organisation name, contact person, phone, email, office address), and which cases to link. Clients sign in with that email or their mobile.</w:t>
+      </w:r>
+    </w:p>
+    <w:p>
+      <w:pPr>
+        <w:pStyle w:val="Heading3"/>
+        <w:keepNext/>
+        <w:keepLines/>
+      </w:pPr>
+      <w:r>
+        <w:t>Client queries</w:t>
+      </w:r>
+    </w:p>
+    <w:p>
+      <w:pPr>
+        <w:spacing w:after="140" w:line="300" w:lineRule="auto"/>
+      </w:pPr>
+      <w:r>
+        <w:t>Questions clients raise from their dashboard, for the firm to answer.</w:t>
+      </w:r>
+    </w:p>
+    <w:p>
+      <w:pPr>
+        <w:pStyle w:val="Heading3"/>
+        <w:keepNext/>
+        <w:keepLines/>
+      </w:pPr>
+      <w:r>
+        <w:t>Team (Lawyers)</w:t>
+      </w:r>
+    </w:p>
+    <w:p>
+      <w:pPr>
+        <w:spacing w:after="140" w:line="300" w:lineRule="auto"/>
+      </w:pPr>
+      <w:r>
+        <w:t>Everyone at the firm, in one list, and the only place people are added or edited. It opens with the Who can sign in panel (section 2). One form covers:</w:t>
       </w:r>
     </w:p>
     <w:p>
@@ -5673,7 +6275,7 @@
         <w:spacing w:after="80" w:line="290" w:lineRule="auto"/>
       </w:pPr>
       <w:r>
-        <w:t>Access: Owner, Admin, Lawyer, Editor, or No sign-in (for someone who only appears on the website).</w:t>
+        <w:t>Photo, name, position, email, phone, Bar Council enrolment number. The email and phone are what the person signs in with.</w:t>
       </w:r>
     </w:p>
     <w:p>
@@ -5686,6 +6288,19 @@
         <w:spacing w:after="80" w:line="290" w:lineRule="auto"/>
       </w:pPr>
       <w:r>
+        <w:t>Access: Owner, Admin, Lawyer, Editor, or No sign-in (for someone who only appears on the website).</w:t>
+      </w:r>
+    </w:p>
+    <w:p>
+      <w:pPr>
+        <w:pStyle w:val="ListParagraph"/>
+        <w:numPr>
+          <w:ilvl w:val="0"/>
+          <w:numId w:val="2"/>
+        </w:numPr>
+        <w:spacing w:after="80" w:line="290" w:lineRule="auto"/>
+      </w:pPr>
+      <w:r>
         <w:t>'Show on the website', which opens their public profile: practice areas, qualification, experience, office, biography, education, memberships, display order and whether they feature on the home page.</w:t>
       </w:r>
     </w:p>
@@ -5695,11 +6310,11 @@
         <w:keepNext/>
         <w:keepLines/>
       </w:pPr>
-      <w:bookmarkStart w:id="12" w:name="_Toc241612373"/>
+      <w:bookmarkStart w:id="13" w:name="_Toc241789000"/>
       <w:r>
         <w:t>Website</w:t>
       </w:r>
-      <w:bookmarkEnd w:id="12"/>
+      <w:bookmarkEnd w:id="13"/>
     </w:p>
     <w:tbl>
       <w:tblPr>
@@ -6149,11 +6764,11 @@
         <w:pStyle w:val="Heading1"/>
         <w:pageBreakBefore/>
       </w:pPr>
-      <w:bookmarkStart w:id="13" w:name="_Toc241612374"/>
+      <w:bookmarkStart w:id="14" w:name="_Toc241789001"/>
       <w:r>
         <w:t>6. Cases and the court's own record</w:t>
       </w:r>
-      <w:bookmarkEnd w:id="13"/>
+      <w:bookmarkEnd w:id="14"/>
     </w:p>
     <w:p>
       <w:pPr>
@@ -6161,11 +6776,11 @@
         <w:keepNext/>
         <w:keepLines/>
       </w:pPr>
-      <w:bookmarkStart w:id="14" w:name="_Toc241612375"/>
+      <w:bookmarkStart w:id="15" w:name="_Toc241789002"/>
       <w:r>
         <w:t>How 'Update from court' works</w:t>
       </w:r>
-      <w:bookmarkEnd w:id="14"/>
+      <w:bookmarkEnd w:id="15"/>
     </w:p>
     <w:p>
       <w:pPr>
@@ -6271,11 +6886,11 @@
         <w:keepNext/>
         <w:keepLines/>
       </w:pPr>
-      <w:bookmarkStart w:id="15" w:name="_Toc241612376"/>
+      <w:bookmarkStart w:id="16" w:name="_Toc241789003"/>
       <w:r>
         <w:t>Things worth knowing</w:t>
       </w:r>
-      <w:bookmarkEnd w:id="15"/>
+      <w:bookmarkEnd w:id="16"/>
     </w:p>
     <w:p>
       <w:pPr>
@@ -6382,11 +6997,11 @@
         <w:pStyle w:val="Heading1"/>
         <w:pageBreakBefore/>
       </w:pPr>
-      <w:bookmarkStart w:id="16" w:name="_Toc241612377"/>
+      <w:bookmarkStart w:id="17" w:name="_Toc241789004"/>
       <w:r>
         <w:t>7. Documents</w:t>
       </w:r>
-      <w:bookmarkEnd w:id="16"/>
+      <w:bookmarkEnd w:id="17"/>
     </w:p>
     <w:p>
       <w:pPr>
@@ -6394,11 +7009,11 @@
         <w:keepNext/>
         <w:keepLines/>
       </w:pPr>
-      <w:bookmarkStart w:id="17" w:name="_Toc241612378"/>
+      <w:bookmarkStart w:id="18" w:name="_Toc241789005"/>
       <w:r>
         <w:t>Folders</w:t>
       </w:r>
-      <w:bookmarkEnd w:id="17"/>
+      <w:bookmarkEnd w:id="18"/>
     </w:p>
     <w:p>
       <w:pPr>
@@ -6844,11 +7459,11 @@
         <w:keepNext/>
         <w:keepLines/>
       </w:pPr>
-      <w:bookmarkStart w:id="18" w:name="_Toc241612379"/>
+      <w:bookmarkStart w:id="19" w:name="_Toc241789006"/>
       <w:r>
         <w:t>Safety</w:t>
       </w:r>
-      <w:bookmarkEnd w:id="18"/>
+      <w:bookmarkEnd w:id="19"/>
     </w:p>
     <w:p>
       <w:pPr>
@@ -6894,18 +7509,18 @@
         <w:pStyle w:val="Heading1"/>
         <w:pageBreakBefore/>
       </w:pPr>
-      <w:bookmarkStart w:id="19" w:name="_Toc241612380"/>
+      <w:bookmarkStart w:id="20" w:name="_Toc241789007"/>
       <w:r>
         <w:t>8. The lawyer workspace</w:t>
       </w:r>
-      <w:bookmarkEnd w:id="19"/>
+      <w:bookmarkEnd w:id="20"/>
     </w:p>
     <w:p>
       <w:pPr>
         <w:spacing w:after="140" w:line="300" w:lineRule="auto"/>
       </w:pPr>
       <w:r>
-        <w:t>A lawyer signs in at /lawyer/login and sees four tabs:</w:t>
+        <w:t>A lawyer signs in at /lawyer/login (with the Gmail or mobile number saved on the Team page) and sees four tabs. Owners and administrators can sign in here too, to work on the cases assigned to them.</w:t>
       </w:r>
     </w:p>
     <w:p>
@@ -7010,11 +7625,11 @@
         <w:pStyle w:val="Heading1"/>
         <w:pageBreakBefore/>
       </w:pPr>
-      <w:bookmarkStart w:id="20" w:name="_Toc241612381"/>
+      <w:bookmarkStart w:id="21" w:name="_Toc241789008"/>
       <w:r>
         <w:t>9. The client dashboard</w:t>
       </w:r>
-      <w:bookmarkEnd w:id="20"/>
+      <w:bookmarkEnd w:id="21"/>
     </w:p>
     <w:p>
       <w:pPr>
@@ -7110,11 +7725,11 @@
         <w:keepNext/>
         <w:keepLines/>
       </w:pPr>
-      <w:bookmarkStart w:id="21" w:name="_Toc241612382"/>
+      <w:bookmarkStart w:id="22" w:name="_Toc241789009"/>
       <w:r>
         <w:t>What a client cannot do</w:t>
       </w:r>
-      <w:bookmarkEnd w:id="21"/>
+      <w:bookmarkEnd w:id="22"/>
     </w:p>
     <w:p>
       <w:pPr>
@@ -7152,7 +7767,7 @@
         <w:spacing w:after="80" w:line="290" w:lineRule="auto"/>
       </w:pPr>
       <w:r>
-        <w:t>See Internal files, firm prices or other clients' matters.</w:t>
+        <w:t>See Internal files, firm prices or other clients' cases.</w:t>
       </w:r>
     </w:p>
     <w:p>
@@ -7162,17 +7777,6 @@
       <w:r>
         <w:t>A client with no linked case sees: 'No case is linked to your account yet. Please contact us to set up a meeting with the team', with buttons to set up a meeting or call the firm.</w:t>
       </w:r>
-    </w:p>
-    <w:p>
-      <w:pPr>
-        <w:pStyle w:val="Heading1"/>
-        <w:pageBreakBefore/>
-      </w:pPr>
-      <w:bookmarkStart w:id="22" w:name="_Toc241612383"/>
-      <w:r>
-        <w:t>10. Articles and AI</w:t>
-      </w:r>
-      <w:bookmarkEnd w:id="22"/>
     </w:p>
     <w:p>
       <w:pPr>
@@ -7180,9 +7784,9 @@
         <w:keepNext/>
         <w:keepLines/>
       </w:pPr>
-      <w:bookmarkStart w:id="23" w:name="_Toc241612384"/>
-      <w:r>
-        <w:t>Finding topics: trending leads</w:t>
+      <w:bookmarkStart w:id="23" w:name="_Toc241789010"/>
+      <w:r>
+        <w:t>On phones</w:t>
       </w:r>
       <w:bookmarkEnd w:id="23"/>
     </w:p>
@@ -7191,8 +7795,19 @@
         <w:spacing w:after="140" w:line="300" w:lineRule="auto"/>
       </w:pPr>
       <w:r>
-        <w:t>Every 3 hours the system reads the headlines of legal news sources (LiveLaw, Bar &amp; Bench, Verdictum and Google News searches for Supreme Court and High Court judgments). It reads headlines and links only, never the articles themselves, and groups stories about the same judgment into 'leads', ranked by how widely they are being reported.</w:t>
-      </w:r>
+        <w:t>The website, the admin console, the lawyer workspace and the client dashboard all work on a phone. Lists that are tables on a computer (clients, team, enquiries, jobs, documents) become one card per row, each value labelled; numbers sit two to a row; a case's sections (Overview, Court record, Documents, Timeline) wrap as buttons so none is hidden off the screen.</w:t>
+      </w:r>
+    </w:p>
+    <w:p>
+      <w:pPr>
+        <w:pStyle w:val="Heading1"/>
+        <w:pageBreakBefore/>
+      </w:pPr>
+      <w:bookmarkStart w:id="24" w:name="_Toc241789011"/>
+      <w:r>
+        <w:t>10. Articles and AI</w:t>
+      </w:r>
+      <w:bookmarkEnd w:id="24"/>
     </w:p>
     <w:p>
       <w:pPr>
@@ -7200,11 +7815,31 @@
         <w:keepNext/>
         <w:keepLines/>
       </w:pPr>
-      <w:bookmarkStart w:id="24" w:name="_Toc241612385"/>
+      <w:bookmarkStart w:id="25" w:name="_Toc241789012"/>
+      <w:r>
+        <w:t>Finding topics: trending leads</w:t>
+      </w:r>
+      <w:bookmarkEnd w:id="25"/>
+    </w:p>
+    <w:p>
+      <w:pPr>
+        <w:spacing w:after="140" w:line="300" w:lineRule="auto"/>
+      </w:pPr>
+      <w:r>
+        <w:t>Every 3 hours the system reads the headlines of legal news sources (LiveLaw, Bar &amp; Bench, Verdictum and Google News searches for Supreme Court and High Court judgments). It reads headlines and links only, never the articles themselves, and groups stories about the same judgment into 'leads', ranked by how widely they are being reported.</w:t>
+      </w:r>
+    </w:p>
+    <w:p>
+      <w:pPr>
+        <w:pStyle w:val="Heading2"/>
+        <w:keepNext/>
+        <w:keepLines/>
+      </w:pPr>
+      <w:bookmarkStart w:id="26" w:name="_Toc241789013"/>
       <w:r>
         <w:t>Drafts</w:t>
       </w:r>
-      <w:bookmarkEnd w:id="24"/>
+      <w:bookmarkEnd w:id="26"/>
     </w:p>
     <w:p>
       <w:pPr>
@@ -7285,11 +7920,11 @@
         <w:keepNext/>
         <w:keepLines/>
       </w:pPr>
-      <w:bookmarkStart w:id="25" w:name="_Toc241612386"/>
+      <w:bookmarkStart w:id="27" w:name="_Toc241789014"/>
       <w:r>
         <w:t>Cover images</w:t>
       </w:r>
-      <w:bookmarkEnd w:id="25"/>
+      <w:bookmarkEnd w:id="27"/>
     </w:p>
     <w:p>
       <w:pPr>
@@ -7388,11 +8023,11 @@
         <w:pStyle w:val="Heading1"/>
         <w:pageBreakBefore/>
       </w:pPr>
-      <w:bookmarkStart w:id="26" w:name="_Toc241612387"/>
+      <w:bookmarkStart w:id="28" w:name="_Toc241789015"/>
       <w:r>
         <w:t>11. What it costs to run</w:t>
       </w:r>
-      <w:bookmarkEnd w:id="26"/>
+      <w:bookmarkEnd w:id="28"/>
     </w:p>
     <w:p>
       <w:pPr>
@@ -8317,7 +8952,7 @@
               <w:spacing w:after="40" w:line="270" w:lineRule="auto"/>
             </w:pPr>
             <w:r>
-              <w:t>Each client mobile sign-in</w:t>
+              <w:t>Each mobile sign-in (clients, lawyers and admins)</w:t>
             </w:r>
           </w:p>
         </w:tc>
@@ -8458,11 +9093,11 @@
         <w:pStyle w:val="Heading1"/>
         <w:pageBreakBefore/>
       </w:pPr>
-      <w:bookmarkStart w:id="27" w:name="_Toc241612388"/>
+      <w:bookmarkStart w:id="29" w:name="_Toc241789016"/>
       <w:r>
         <w:t>12. Behind the scenes, in plain terms</w:t>
       </w:r>
-      <w:bookmarkEnd w:id="27"/>
+      <w:bookmarkEnd w:id="29"/>
     </w:p>
     <w:p>
       <w:pPr>
@@ -8470,11 +9105,11 @@
         <w:keepNext/>
         <w:keepLines/>
       </w:pPr>
-      <w:bookmarkStart w:id="28" w:name="_Toc241612389"/>
+      <w:bookmarkStart w:id="30" w:name="_Toc241789017"/>
       <w:r>
         <w:t>What happens when someone presses a button</w:t>
       </w:r>
-      <w:bookmarkEnd w:id="28"/>
+      <w:bookmarkEnd w:id="30"/>
     </w:p>
     <w:p>
       <w:pPr>
@@ -8534,11 +9169,11 @@
         <w:keepNext/>
         <w:keepLines/>
       </w:pPr>
-      <w:bookmarkStart w:id="29" w:name="_Toc241612390"/>
+      <w:bookmarkStart w:id="31" w:name="_Toc241789018"/>
       <w:r>
         <w:t>Jobs that run by themselves</w:t>
       </w:r>
-      <w:bookmarkEnd w:id="29"/>
+      <w:bookmarkEnd w:id="31"/>
     </w:p>
     <w:tbl>
       <w:tblPr>
@@ -8770,11 +9405,11 @@
         <w:keepNext/>
         <w:keepLines/>
       </w:pPr>
-      <w:bookmarkStart w:id="30" w:name="_Toc241612391"/>
+      <w:bookmarkStart w:id="32" w:name="_Toc241789019"/>
       <w:r>
         <w:t>Settings that change behaviour</w:t>
       </w:r>
-      <w:bookmarkEnd w:id="30"/>
+      <w:bookmarkEnd w:id="32"/>
     </w:p>
     <w:p>
       <w:pPr>
@@ -9255,11 +9890,11 @@
         <w:keepNext/>
         <w:keepLines/>
       </w:pPr>
-      <w:bookmarkStart w:id="31" w:name="_Toc241612392"/>
+      <w:bookmarkStart w:id="33" w:name="_Toc241789020"/>
       <w:r>
         <w:t>Safeguards</w:t>
       </w:r>
-      <w:bookmarkEnd w:id="31"/>
+      <w:bookmarkEnd w:id="33"/>
     </w:p>
     <w:p>
       <w:pPr>
@@ -9331,11 +9966,11 @@
         <w:pStyle w:val="Heading1"/>
         <w:pageBreakBefore/>
       </w:pPr>
-      <w:bookmarkStart w:id="32" w:name="_Toc241612393"/>
+      <w:bookmarkStart w:id="34" w:name="_Toc241789021"/>
       <w:r>
         <w:t>13. Where things are kept in the project</w:t>
       </w:r>
-      <w:bookmarkEnd w:id="32"/>
+      <w:bookmarkEnd w:id="34"/>
     </w:p>
     <w:p>
       <w:pPr>
@@ -9799,11 +10434,11 @@
         <w:keepNext/>
         <w:keepLines/>
       </w:pPr>
-      <w:bookmarkStart w:id="33" w:name="_Toc241612394"/>
+      <w:bookmarkStart w:id="35" w:name="_Toc241789022"/>
       <w:r>
         <w:t>How changes are published</w:t>
       </w:r>
-      <w:bookmarkEnd w:id="33"/>
+      <w:bookmarkEnd w:id="35"/>
     </w:p>
     <w:p>
       <w:pPr>
@@ -9849,11 +10484,11 @@
         <w:pStyle w:val="Heading1"/>
         <w:pageBreakBefore/>
       </w:pPr>
-      <w:bookmarkStart w:id="34" w:name="_Toc241612395"/>
+      <w:bookmarkStart w:id="36" w:name="_Toc241789023"/>
       <w:r>
         <w:t>14. Current limits and next steps</w:t>
       </w:r>
-      <w:bookmarkEnd w:id="34"/>
+      <w:bookmarkEnd w:id="36"/>
     </w:p>
     <w:p>
       <w:pPr>
@@ -9912,7 +10547,7 @@
         <w:t>Editors.</w:t>
       </w:r>
       <w:r>
-        <w:t xml:space="preserve"> The Editor role cannot open the admin console at present. If editors should manage website sections, access needs to be added.</w:t>
+        <w:t xml:space="preserve"> Editors can sign in at the admin page, but the console's sections are built for owners and administrators. If editors should manage website sections only, that access needs to be added.</w:t>
       </w:r>
     </w:p>
     <w:p>
@@ -9937,34 +10572,14 @@
     </w:p>
     <w:p>
       <w:pPr>
-        <w:pStyle w:val="ListParagraph"/>
-        <w:numPr>
-          <w:ilvl w:val="0"/>
-          <w:numId w:val="2"/>
-        </w:numPr>
-        <w:spacing w:after="80" w:line="290" w:lineRule="auto"/>
-      </w:pPr>
-      <w:r>
-        <w:rPr>
-          <w:b/>
-          <w:bCs/>
-        </w:rPr>
-        <w:t>One sign-in per browser.</w:t>
-      </w:r>
-      <w:r>
-        <w:t xml:space="preserve"> Use separate browsers to be signed in as a firm member and as a client at the same time.</w:t>
-      </w:r>
-    </w:p>
-    <w:p>
-      <w:pPr>
         <w:pStyle w:val="Heading1"/>
         <w:pageBreakBefore/>
       </w:pPr>
-      <w:bookmarkStart w:id="35" w:name="_Toc241612396"/>
+      <w:bookmarkStart w:id="37" w:name="_Toc241789024"/>
       <w:r>
         <w:t>15. Glossary</w:t>
       </w:r>
-      <w:bookmarkEnd w:id="35"/>
+      <w:bookmarkEnd w:id="37"/>
     </w:p>
     <w:tbl>
       <w:tblPr>
@@ -10578,6 +11193,64 @@
             </w:pPr>
             <w:r>
               <w:t>The service that sends mobile sign-in codes.</w:t>
+            </w:r>
+          </w:p>
+        </w:tc>
+      </w:tr>
+      <w:tr>
+        <w:tblPrEx>
+          <w:tblCellMar>
+            <w:top w:w="0" w:type="dxa"/>
+            <w:bottom w:w="0" w:type="dxa"/>
+          </w:tblCellMar>
+        </w:tblPrEx>
+        <w:tc>
+          <w:tcPr>
+            <w:tcW w:w="2327" w:type="dxa"/>
+            <w:tcBorders>
+              <w:top w:val="single" w:sz="4" w:space="0" w:color="D5D9E0"/>
+              <w:left w:val="single" w:sz="4" w:space="0" w:color="D5D9E0"/>
+              <w:bottom w:val="single" w:sz="4" w:space="0" w:color="D5D9E0"/>
+              <w:right w:val="single" w:sz="4" w:space="0" w:color="D5D9E0"/>
+            </w:tcBorders>
+            <w:tcMar>
+              <w:top w:w="80" w:type="dxa"/>
+              <w:left w:w="120" w:type="dxa"/>
+              <w:bottom w:w="80" w:type="dxa"/>
+              <w:right w:w="120" w:type="dxa"/>
+            </w:tcMar>
+          </w:tcPr>
+          <w:p>
+            <w:pPr>
+              <w:spacing w:after="40" w:line="270" w:lineRule="auto"/>
+            </w:pPr>
+            <w:r>
+              <w:t>OTP</w:t>
+            </w:r>
+          </w:p>
+        </w:tc>
+        <w:tc>
+          <w:tcPr>
+            <w:tcW w:w="6979" w:type="dxa"/>
+            <w:tcBorders>
+              <w:top w:val="single" w:sz="4" w:space="0" w:color="D5D9E0"/>
+              <w:left w:val="single" w:sz="4" w:space="0" w:color="D5D9E0"/>
+              <w:bottom w:val="single" w:sz="4" w:space="0" w:color="D5D9E0"/>
+              <w:right w:val="single" w:sz="4" w:space="0" w:color="D5D9E0"/>
+            </w:tcBorders>
+            <w:tcMar>
+              <w:top w:w="80" w:type="dxa"/>
+              <w:left w:w="120" w:type="dxa"/>
+              <w:bottom w:w="80" w:type="dxa"/>
+              <w:right w:w="120" w:type="dxa"/>
+            </w:tcMar>
+          </w:tcPr>
+          <w:p>
+            <w:pPr>
+              <w:spacing w:after="40" w:line="270" w:lineRule="auto"/>
+            </w:pPr>
+            <w:r>
+              <w:t>One-time password: the code sent by SMS to sign in with a mobile number.</w:t>
             </w:r>
           </w:p>
         </w:tc>
@@ -10714,64 +11387,68 @@
 <file path=word/numbering.xml><?xml version="1.0" encoding="utf-8"?>
 <w:numbering xmlns:wpc="http://schemas.microsoft.com/office/word/2010/wordprocessingCanvas" xmlns:cx="http://schemas.microsoft.com/office/drawing/2014/chartex" xmlns:cx1="http://schemas.microsoft.com/office/drawing/2015/9/8/chartex" xmlns:cx2="http://schemas.microsoft.com/office/drawing/2015/10/21/chartex" xmlns:cx3="http://schemas.microsoft.com/office/drawing/2016/5/9/chartex" xmlns:cx4="http://schemas.microsoft.com/office/drawing/2016/5/10/chartex" xmlns:cx5="http://schemas.microsoft.com/office/drawing/2016/5/11/chartex" xmlns:cx6="http://schemas.microsoft.com/office/drawing/2016/5/12/chartex" xmlns:cx7="http://schemas.microsoft.com/office/drawing/2016/5/13/chartex" xmlns:cx8="http://schemas.microsoft.com/office/drawing/2016/5/14/chartex" xmlns:mc="http://schemas.openxmlformats.org/markup-compatibility/2006" xmlns:aink="http://schemas.microsoft.com/office/drawing/2016/ink" xmlns:am3d="http://schemas.microsoft.com/office/drawing/2017/model3d" xmlns:o="urn:schemas-microsoft-com:office:office" xmlns:oel="http://schemas.microsoft.com/office/2019/extlst" xmlns:r="http://schemas.openxmlformats.org/officeDocument/2006/relationships" xmlns:m="http://schemas.openxmlformats.org/officeDocument/2006/math" xmlns:v="urn:schemas-microsoft-com:vml" xmlns:wp14="http://schemas.microsoft.com/office/word/2010/wordprocessingDrawing" xmlns:wp="http://schemas.openxmlformats.org/drawingml/2006/wordprocessingDrawing" xmlns:w10="urn:schemas-microsoft-com:office:word" xmlns:w="http://schemas.openxmlformats.org/wordprocessingml/2006/main" xmlns:w14="http://schemas.microsoft.com/office/word/2010/wordml" xmlns:w15="http://schemas.microsoft.com/office/word/2012/wordml" xmlns:w16cex="http://schemas.microsoft.com/office/word/2018/wordml/cex" xmlns:w16cid="http://schemas.microsoft.com/office/word/2016/wordml/cid" xmlns:w16="http://schemas.microsoft.com/office/word/2018/wordml" xmlns:w16du="http://schemas.microsoft.com/office/word/2023/wordml/word16du" xmlns:w16sdtdh="http://schemas.microsoft.com/office/word/2020/wordml/sdtdatahash" xmlns:w16sdtfl="http://schemas.microsoft.com/office/word/2024/wordml/sdtformatlock" xmlns:w16se="http://schemas.microsoft.com/office/word/2015/wordml/symex" xmlns:wpg="http://schemas.microsoft.com/office/word/2010/wordprocessingGroup" xmlns:wpi="http://schemas.microsoft.com/office/word/2010/wordprocessingInk" xmlns:wne="http://schemas.microsoft.com/office/word/2006/wordml" xmlns:wps="http://schemas.microsoft.com/office/word/2010/wordprocessingShape" mc:Ignorable="w14 w15 w16se w16cid w16 w16cex w16sdtdh w16sdtfl w16du wp14">
   <w:abstractNum w:abstractNumId="0" w15:restartNumberingAfterBreak="0">
-    <w:nsid w:val="054011E5"/>
+    <w:nsid w:val="044571D9"/>
     <w:multiLevelType w:val="hybridMultilevel"/>
-    <w:tmpl w:val="45F89366"/>
-    <w:lvl w:ilvl="0" w:tplc="1452E8A8">
+    <w:tmpl w:val="D0529896"/>
+    <w:lvl w:ilvl="0" w:tplc="4376552E">
       <w:start w:val="1"/>
-      <w:numFmt w:val="decimal"/>
-      <w:lvlText w:val="%1."/>
+      <w:numFmt w:val="bullet"/>
+      <w:lvlText w:val="•"/>
       <w:lvlJc w:val="left"/>
       <w:pPr>
         <w:ind w:left="540" w:hanging="300"/>
       </w:pPr>
     </w:lvl>
-    <w:lvl w:ilvl="1" w:tplc="2354A9F8">
+    <w:lvl w:ilvl="1" w:tplc="51AA74AC">
+      <w:start w:val="1"/>
+      <w:numFmt w:val="bullet"/>
+      <w:lvlText w:val="–"/>
+      <w:lvlJc w:val="left"/>
+      <w:pPr>
+        <w:ind w:left="1000" w:hanging="300"/>
+      </w:pPr>
+    </w:lvl>
+    <w:lvl w:ilvl="2" w:tplc="4AC6E894">
       <w:numFmt w:val="decimal"/>
       <w:lvlText w:val=""/>
       <w:lvlJc w:val="left"/>
     </w:lvl>
-    <w:lvl w:ilvl="2" w:tplc="3D0EB224">
+    <w:lvl w:ilvl="3" w:tplc="FBB8604E">
       <w:numFmt w:val="decimal"/>
       <w:lvlText w:val=""/>
       <w:lvlJc w:val="left"/>
     </w:lvl>
-    <w:lvl w:ilvl="3" w:tplc="B57CE49C">
+    <w:lvl w:ilvl="4" w:tplc="25B89030">
       <w:numFmt w:val="decimal"/>
       <w:lvlText w:val=""/>
       <w:lvlJc w:val="left"/>
     </w:lvl>
-    <w:lvl w:ilvl="4" w:tplc="E2D6E58E">
+    <w:lvl w:ilvl="5" w:tplc="258A7BAC">
       <w:numFmt w:val="decimal"/>
       <w:lvlText w:val=""/>
       <w:lvlJc w:val="left"/>
     </w:lvl>
-    <w:lvl w:ilvl="5" w:tplc="1C4E3FDE">
+    <w:lvl w:ilvl="6" w:tplc="D0B8B942">
       <w:numFmt w:val="decimal"/>
       <w:lvlText w:val=""/>
       <w:lvlJc w:val="left"/>
     </w:lvl>
-    <w:lvl w:ilvl="6" w:tplc="8FAE7BBE">
+    <w:lvl w:ilvl="7" w:tplc="B212012A">
       <w:numFmt w:val="decimal"/>
       <w:lvlText w:val=""/>
       <w:lvlJc w:val="left"/>
     </w:lvl>
-    <w:lvl w:ilvl="7" w:tplc="A8E86800">
-      <w:numFmt w:val="decimal"/>
-      <w:lvlText w:val=""/>
-      <w:lvlJc w:val="left"/>
-    </w:lvl>
-    <w:lvl w:ilvl="8" w:tplc="2286B9AC">
+    <w:lvl w:ilvl="8" w:tplc="F4980780">
       <w:numFmt w:val="decimal"/>
       <w:lvlText w:val=""/>
       <w:lvlJc w:val="left"/>
     </w:lvl>
   </w:abstractNum>
   <w:abstractNum w:abstractNumId="1" w15:restartNumberingAfterBreak="0">
-    <w:nsid w:val="17500984"/>
+    <w:nsid w:val="174A1E7D"/>
     <w:multiLevelType w:val="hybridMultilevel"/>
-    <w:tmpl w:val="7F4AA6EA"/>
-    <w:lvl w:ilvl="0" w:tplc="E400992C">
+    <w:tmpl w:val="8C9499D4"/>
+    <w:lvl w:ilvl="0" w:tplc="C87E03A8">
       <w:start w:val="1"/>
       <w:numFmt w:val="decimal"/>
       <w:lvlText w:val="%1."/>
@@ -10780,211 +11457,207 @@
         <w:ind w:left="540" w:hanging="300"/>
       </w:pPr>
     </w:lvl>
-    <w:lvl w:ilvl="1" w:tplc="CFEADAFA">
+    <w:lvl w:ilvl="1" w:tplc="B7F270AC">
       <w:numFmt w:val="decimal"/>
       <w:lvlText w:val=""/>
       <w:lvlJc w:val="left"/>
     </w:lvl>
-    <w:lvl w:ilvl="2" w:tplc="30EE78FE">
+    <w:lvl w:ilvl="2" w:tplc="F9C49370">
       <w:numFmt w:val="decimal"/>
       <w:lvlText w:val=""/>
       <w:lvlJc w:val="left"/>
     </w:lvl>
-    <w:lvl w:ilvl="3" w:tplc="4C224038">
+    <w:lvl w:ilvl="3" w:tplc="B5F87A76">
       <w:numFmt w:val="decimal"/>
       <w:lvlText w:val=""/>
       <w:lvlJc w:val="left"/>
     </w:lvl>
-    <w:lvl w:ilvl="4" w:tplc="17D6EFF4">
+    <w:lvl w:ilvl="4" w:tplc="80FCA7B2">
       <w:numFmt w:val="decimal"/>
       <w:lvlText w:val=""/>
       <w:lvlJc w:val="left"/>
     </w:lvl>
-    <w:lvl w:ilvl="5" w:tplc="03C4B81E">
+    <w:lvl w:ilvl="5" w:tplc="00A2ADDA">
       <w:numFmt w:val="decimal"/>
       <w:lvlText w:val=""/>
       <w:lvlJc w:val="left"/>
     </w:lvl>
-    <w:lvl w:ilvl="6" w:tplc="D8F6E774">
+    <w:lvl w:ilvl="6" w:tplc="037615D8">
       <w:numFmt w:val="decimal"/>
       <w:lvlText w:val=""/>
       <w:lvlJc w:val="left"/>
     </w:lvl>
-    <w:lvl w:ilvl="7" w:tplc="EF1823AE">
+    <w:lvl w:ilvl="7" w:tplc="66BA7AC8">
       <w:numFmt w:val="decimal"/>
       <w:lvlText w:val=""/>
       <w:lvlJc w:val="left"/>
     </w:lvl>
-    <w:lvl w:ilvl="8" w:tplc="3FB8E112">
+    <w:lvl w:ilvl="8" w:tplc="CFD0EB24">
       <w:numFmt w:val="decimal"/>
       <w:lvlText w:val=""/>
       <w:lvlJc w:val="left"/>
     </w:lvl>
   </w:abstractNum>
   <w:abstractNum w:abstractNumId="2" w15:restartNumberingAfterBreak="0">
-    <w:nsid w:val="71603F88"/>
+    <w:nsid w:val="1DD06748"/>
     <w:multiLevelType w:val="hybridMultilevel"/>
-    <w:tmpl w:val="F538248E"/>
-    <w:lvl w:ilvl="0" w:tplc="C2666676">
+    <w:tmpl w:val="5BF08C34"/>
+    <w:lvl w:ilvl="0" w:tplc="2D9AD090" w:tentative="1">
       <w:start w:val="1"/>
       <w:numFmt w:val="bullet"/>
-      <w:lvlText w:val="•"/>
+      <w:lvlText w:val="●"/>
       <w:lvlJc w:val="left"/>
       <w:pPr>
-        <w:ind w:left="540" w:hanging="300"/>
+        <w:ind w:left="720" w:hanging="360"/>
       </w:pPr>
     </w:lvl>
-    <w:lvl w:ilvl="1" w:tplc="1EF0545C">
+    <w:lvl w:ilvl="1" w:tplc="C55E419A" w:tentative="1">
       <w:start w:val="1"/>
       <w:numFmt w:val="bullet"/>
-      <w:lvlText w:val="–"/>
+      <w:lvlText w:val="○"/>
       <w:lvlJc w:val="left"/>
       <w:pPr>
-        <w:ind w:left="1000" w:hanging="300"/>
+        <w:ind w:left="1440" w:hanging="360"/>
       </w:pPr>
     </w:lvl>
-    <w:lvl w:ilvl="2" w:tplc="D0086860">
+    <w:lvl w:ilvl="2" w:tplc="289AE38E" w:tentative="1">
+      <w:start w:val="1"/>
+      <w:numFmt w:val="bullet"/>
+      <w:lvlText w:val="■"/>
+      <w:lvlJc w:val="left"/>
+      <w:pPr>
+        <w:ind w:left="2160" w:hanging="360"/>
+      </w:pPr>
+    </w:lvl>
+    <w:lvl w:ilvl="3" w:tplc="6914BD40" w:tentative="1">
+      <w:start w:val="1"/>
+      <w:numFmt w:val="bullet"/>
+      <w:lvlText w:val="●"/>
+      <w:lvlJc w:val="left"/>
+      <w:pPr>
+        <w:ind w:left="2880" w:hanging="360"/>
+      </w:pPr>
+    </w:lvl>
+    <w:lvl w:ilvl="4" w:tplc="E09C5A7C" w:tentative="1">
+      <w:start w:val="1"/>
+      <w:numFmt w:val="bullet"/>
+      <w:lvlText w:val="○"/>
+      <w:lvlJc w:val="left"/>
+      <w:pPr>
+        <w:ind w:left="3600" w:hanging="360"/>
+      </w:pPr>
+    </w:lvl>
+    <w:lvl w:ilvl="5" w:tplc="B5563802" w:tentative="1">
+      <w:start w:val="1"/>
+      <w:numFmt w:val="bullet"/>
+      <w:lvlText w:val="■"/>
+      <w:lvlJc w:val="left"/>
+      <w:pPr>
+        <w:ind w:left="4320" w:hanging="360"/>
+      </w:pPr>
+    </w:lvl>
+    <w:lvl w:ilvl="6" w:tplc="F95035A4" w:tentative="1">
+      <w:start w:val="1"/>
+      <w:numFmt w:val="bullet"/>
+      <w:lvlText w:val="●"/>
+      <w:lvlJc w:val="left"/>
+      <w:pPr>
+        <w:ind w:left="5040" w:hanging="360"/>
+      </w:pPr>
+    </w:lvl>
+    <w:lvl w:ilvl="7" w:tplc="3870AFC4" w:tentative="1">
+      <w:start w:val="1"/>
+      <w:numFmt w:val="bullet"/>
+      <w:lvlText w:val="●"/>
+      <w:lvlJc w:val="left"/>
+      <w:pPr>
+        <w:ind w:left="5760" w:hanging="360"/>
+      </w:pPr>
+    </w:lvl>
+    <w:lvl w:ilvl="8" w:tplc="71B2277A" w:tentative="1">
+      <w:start w:val="1"/>
+      <w:numFmt w:val="bullet"/>
+      <w:lvlText w:val="●"/>
+      <w:lvlJc w:val="left"/>
+      <w:pPr>
+        <w:ind w:left="6480" w:hanging="360"/>
+      </w:pPr>
+    </w:lvl>
+  </w:abstractNum>
+  <w:abstractNum w:abstractNumId="3" w15:restartNumberingAfterBreak="0">
+    <w:nsid w:val="746D3D09"/>
+    <w:multiLevelType w:val="hybridMultilevel"/>
+    <w:tmpl w:val="8B06D3FE"/>
+    <w:lvl w:ilvl="0" w:tplc="3F8EA4E4">
+      <w:start w:val="1"/>
+      <w:numFmt w:val="decimal"/>
+      <w:lvlText w:val="%1."/>
+      <w:lvlJc w:val="left"/>
+      <w:pPr>
+        <w:ind w:left="540" w:hanging="300"/>
+      </w:pPr>
+    </w:lvl>
+    <w:lvl w:ilvl="1" w:tplc="6E6EE69E">
       <w:numFmt w:val="decimal"/>
       <w:lvlText w:val=""/>
       <w:lvlJc w:val="left"/>
     </w:lvl>
-    <w:lvl w:ilvl="3" w:tplc="A8BCBBBE">
+    <w:lvl w:ilvl="2" w:tplc="E69802F0">
       <w:numFmt w:val="decimal"/>
       <w:lvlText w:val=""/>
       <w:lvlJc w:val="left"/>
     </w:lvl>
-    <w:lvl w:ilvl="4" w:tplc="D8E2E0CC">
+    <w:lvl w:ilvl="3" w:tplc="0A28F296">
       <w:numFmt w:val="decimal"/>
       <w:lvlText w:val=""/>
       <w:lvlJc w:val="left"/>
     </w:lvl>
-    <w:lvl w:ilvl="5" w:tplc="9B34C8C2">
+    <w:lvl w:ilvl="4" w:tplc="16A2AB5E">
       <w:numFmt w:val="decimal"/>
       <w:lvlText w:val=""/>
       <w:lvlJc w:val="left"/>
     </w:lvl>
-    <w:lvl w:ilvl="6" w:tplc="61740630">
+    <w:lvl w:ilvl="5" w:tplc="E09088D6">
       <w:numFmt w:val="decimal"/>
       <w:lvlText w:val=""/>
       <w:lvlJc w:val="left"/>
     </w:lvl>
-    <w:lvl w:ilvl="7" w:tplc="DEE80814">
+    <w:lvl w:ilvl="6" w:tplc="EE98FF18">
       <w:numFmt w:val="decimal"/>
       <w:lvlText w:val=""/>
       <w:lvlJc w:val="left"/>
     </w:lvl>
-    <w:lvl w:ilvl="8" w:tplc="5D48F982">
+    <w:lvl w:ilvl="7" w:tplc="F9EA4D76">
+      <w:numFmt w:val="decimal"/>
+      <w:lvlText w:val=""/>
+      <w:lvlJc w:val="left"/>
+    </w:lvl>
+    <w:lvl w:ilvl="8" w:tplc="04B6F7CA">
       <w:numFmt w:val="decimal"/>
       <w:lvlText w:val=""/>
       <w:lvlJc w:val="left"/>
     </w:lvl>
   </w:abstractNum>
-  <w:abstractNum w:abstractNumId="3" w15:restartNumberingAfterBreak="0">
-    <w:nsid w:val="74CC1A58"/>
-    <w:multiLevelType w:val="hybridMultilevel"/>
-    <w:tmpl w:val="E02A2CCC"/>
-    <w:lvl w:ilvl="0" w:tplc="0BA89F20" w:tentative="1">
-      <w:start w:val="1"/>
-      <w:numFmt w:val="bullet"/>
-      <w:lvlText w:val="●"/>
-      <w:lvlJc w:val="left"/>
-      <w:pPr>
-        <w:ind w:left="720" w:hanging="360"/>
-      </w:pPr>
-    </w:lvl>
-    <w:lvl w:ilvl="1" w:tplc="38D80212" w:tentative="1">
-      <w:start w:val="1"/>
-      <w:numFmt w:val="bullet"/>
-      <w:lvlText w:val="○"/>
-      <w:lvlJc w:val="left"/>
-      <w:pPr>
-        <w:ind w:left="1440" w:hanging="360"/>
-      </w:pPr>
-    </w:lvl>
-    <w:lvl w:ilvl="2" w:tplc="E8824448" w:tentative="1">
-      <w:start w:val="1"/>
-      <w:numFmt w:val="bullet"/>
-      <w:lvlText w:val="■"/>
-      <w:lvlJc w:val="left"/>
-      <w:pPr>
-        <w:ind w:left="2160" w:hanging="360"/>
-      </w:pPr>
-    </w:lvl>
-    <w:lvl w:ilvl="3" w:tplc="CF268C5C" w:tentative="1">
-      <w:start w:val="1"/>
-      <w:numFmt w:val="bullet"/>
-      <w:lvlText w:val="●"/>
-      <w:lvlJc w:val="left"/>
-      <w:pPr>
-        <w:ind w:left="2880" w:hanging="360"/>
-      </w:pPr>
-    </w:lvl>
-    <w:lvl w:ilvl="4" w:tplc="100E5136" w:tentative="1">
-      <w:start w:val="1"/>
-      <w:numFmt w:val="bullet"/>
-      <w:lvlText w:val="○"/>
-      <w:lvlJc w:val="left"/>
-      <w:pPr>
-        <w:ind w:left="3600" w:hanging="360"/>
-      </w:pPr>
-    </w:lvl>
-    <w:lvl w:ilvl="5" w:tplc="128E51A2" w:tentative="1">
-      <w:start w:val="1"/>
-      <w:numFmt w:val="bullet"/>
-      <w:lvlText w:val="■"/>
-      <w:lvlJc w:val="left"/>
-      <w:pPr>
-        <w:ind w:left="4320" w:hanging="360"/>
-      </w:pPr>
-    </w:lvl>
-    <w:lvl w:ilvl="6" w:tplc="16C27B12" w:tentative="1">
-      <w:start w:val="1"/>
-      <w:numFmt w:val="bullet"/>
-      <w:lvlText w:val="●"/>
-      <w:lvlJc w:val="left"/>
-      <w:pPr>
-        <w:ind w:left="5040" w:hanging="360"/>
-      </w:pPr>
-    </w:lvl>
-    <w:lvl w:ilvl="7" w:tplc="C59440F6" w:tentative="1">
-      <w:start w:val="1"/>
-      <w:numFmt w:val="bullet"/>
-      <w:lvlText w:val="●"/>
-      <w:lvlJc w:val="left"/>
-      <w:pPr>
-        <w:ind w:left="5760" w:hanging="360"/>
-      </w:pPr>
-    </w:lvl>
-    <w:lvl w:ilvl="8" w:tplc="7D8E1476" w:tentative="1">
-      <w:start w:val="1"/>
-      <w:numFmt w:val="bullet"/>
-      <w:lvlText w:val="●"/>
-      <w:lvlJc w:val="left"/>
-      <w:pPr>
-        <w:ind w:left="6480" w:hanging="360"/>
-      </w:pPr>
-    </w:lvl>
-  </w:abstractNum>
-  <w:num w:numId="1" w16cid:durableId="1044980852">
-    <w:abstractNumId w:val="3"/>
-    <w:lvlOverride w:ilvl="0">
-      <w:startOverride w:val="1"/>
-    </w:lvlOverride>
-  </w:num>
-  <w:num w:numId="2" w16cid:durableId="822967536">
+  <w:num w:numId="1" w16cid:durableId="322240694">
     <w:abstractNumId w:val="2"/>
     <w:lvlOverride w:ilvl="0">
       <w:startOverride w:val="1"/>
     </w:lvlOverride>
   </w:num>
-  <w:num w:numId="3" w16cid:durableId="677125491">
+  <w:num w:numId="2" w16cid:durableId="1954314729">
+    <w:abstractNumId w:val="0"/>
+    <w:lvlOverride w:ilvl="0">
+      <w:startOverride w:val="1"/>
+    </w:lvlOverride>
+  </w:num>
+  <w:num w:numId="3" w16cid:durableId="1781486346">
     <w:abstractNumId w:val="1"/>
     <w:lvlOverride w:ilvl="0">
       <w:startOverride w:val="1"/>
     </w:lvlOverride>
   </w:num>
-  <w:num w:numId="4" w16cid:durableId="1979874511">
-    <w:abstractNumId w:val="0"/>
+  <w:num w:numId="4" w16cid:durableId="2096003057">
+    <w:abstractNumId w:val="3"/>
     <w:lvlOverride w:ilvl="0">
       <w:startOverride w:val="1"/>
     </w:lvlOverride>
@@ -11624,7 +12297,7 @@
     <w:autoRedefine/>
     <w:uiPriority w:val="39"/>
     <w:unhideWhenUsed/>
-    <w:rsid w:val="001010ED"/>
+    <w:rsid w:val="00163E86"/>
     <w:pPr>
       <w:spacing w:after="100"/>
     </w:pPr>
@@ -11636,7 +12309,7 @@
     <w:autoRedefine/>
     <w:uiPriority w:val="39"/>
     <w:unhideWhenUsed/>
-    <w:rsid w:val="001010ED"/>
+    <w:rsid w:val="00163E86"/>
     <w:pPr>
       <w:spacing w:after="100"/>
       <w:ind w:left="220"/>

</xml_diff>

<commit_message>
Client sign-in only for clients the firm has added
An unknown mobile number or Google account no longer creates a client
account: the sign-in says they are not registered as a client yet, to
contact the firm first, and takes them to the Contact page. The mobile
sign-up step, its endpoint and ALLOW_CLIENT_SIGNUP are gone; lawyers and
clients now both come only from the admin console. Guide, seeded
documentation and architecture note updated to match.

Co-Authored-By: Claude Opus 5.5 <noreply@anthropic.com>
</commit_message>
<xml_diff>
--- a/docs/ADOORA-System-Guide.docx
+++ b/docs/ADOORA-System-Guide.docx
@@ -96,7 +96,7 @@
     <w:sdt>
       <w:sdtPr>
         <w:alias w:val="Contents"/>
-        <w:id w:val="1198664049"/>
+        <w:id w:val="-1270310852"/>
       </w:sdtPr>
       <w:sdtEndPr/>
       <w:sdtContent>
@@ -125,7 +125,7 @@
           <w:r>
             <w:fldChar w:fldCharType="separate"/>
           </w:r>
-          <w:hyperlink w:anchor="_Toc241789736" w:history="1">
+          <w:hyperlink w:anchor="_Toc241791358" w:history="1">
             <w:r>
               <w:rPr>
                 <w:rStyle w:val="Hyperlink"/>
@@ -149,7 +149,7 @@
               <w:rPr>
                 <w:noProof/>
               </w:rPr>
-              <w:instrText xml:space="preserve"> PAGEREF _Toc241789736 \h </w:instrText>
+              <w:instrText xml:space="preserve"> PAGEREF _Toc241791358 \h </w:instrText>
             </w:r>
             <w:r>
               <w:rPr>
@@ -192,7 +192,7 @@
               <w14:ligatures w14:val="standardContextual"/>
             </w:rPr>
           </w:pPr>
-          <w:hyperlink w:anchor="_Toc241789737" w:history="1">
+          <w:hyperlink w:anchor="_Toc241791359" w:history="1">
             <w:r>
               <w:rPr>
                 <w:rStyle w:val="Hyperlink"/>
@@ -216,7 +216,7 @@
               <w:rPr>
                 <w:noProof/>
               </w:rPr>
-              <w:instrText xml:space="preserve"> PAGEREF _Toc241789737 \h </w:instrText>
+              <w:instrText xml:space="preserve"> PAGEREF _Toc241791359 \h </w:instrText>
             </w:r>
             <w:r>
               <w:rPr>
@@ -259,7 +259,7 @@
               <w14:ligatures w14:val="standardContextual"/>
             </w:rPr>
           </w:pPr>
-          <w:hyperlink w:anchor="_Toc241789738" w:history="1">
+          <w:hyperlink w:anchor="_Toc241791360" w:history="1">
             <w:r>
               <w:rPr>
                 <w:rStyle w:val="Hyperlink"/>
@@ -283,7 +283,7 @@
               <w:rPr>
                 <w:noProof/>
               </w:rPr>
-              <w:instrText xml:space="preserve"> PAGEREF _Toc241789738 \h </w:instrText>
+              <w:instrText xml:space="preserve"> PAGEREF _Toc241791360 \h </w:instrText>
             </w:r>
             <w:r>
               <w:rPr>
@@ -326,7 +326,7 @@
               <w14:ligatures w14:val="standardContextual"/>
             </w:rPr>
           </w:pPr>
-          <w:hyperlink w:anchor="_Toc241789739" w:history="1">
+          <w:hyperlink w:anchor="_Toc241791361" w:history="1">
             <w:r>
               <w:rPr>
                 <w:rStyle w:val="Hyperlink"/>
@@ -350,7 +350,7 @@
               <w:rPr>
                 <w:noProof/>
               </w:rPr>
-              <w:instrText xml:space="preserve"> PAGEREF _Toc241789739 \h </w:instrText>
+              <w:instrText xml:space="preserve"> PAGEREF _Toc241791361 \h </w:instrText>
             </w:r>
             <w:r>
               <w:rPr>
@@ -393,7 +393,7 @@
               <w14:ligatures w14:val="standardContextual"/>
             </w:rPr>
           </w:pPr>
-          <w:hyperlink w:anchor="_Toc241789740" w:history="1">
+          <w:hyperlink w:anchor="_Toc241791362" w:history="1">
             <w:r>
               <w:rPr>
                 <w:rStyle w:val="Hyperlink"/>
@@ -417,7 +417,7 @@
               <w:rPr>
                 <w:noProof/>
               </w:rPr>
-              <w:instrText xml:space="preserve"> PAGEREF _Toc241789740 \h </w:instrText>
+              <w:instrText xml:space="preserve"> PAGEREF _Toc241791362 \h </w:instrText>
             </w:r>
             <w:r>
               <w:rPr>
@@ -460,7 +460,7 @@
               <w14:ligatures w14:val="standardContextual"/>
             </w:rPr>
           </w:pPr>
-          <w:hyperlink w:anchor="_Toc241789741" w:history="1">
+          <w:hyperlink w:anchor="_Toc241791363" w:history="1">
             <w:r>
               <w:rPr>
                 <w:rStyle w:val="Hyperlink"/>
@@ -484,7 +484,7 @@
               <w:rPr>
                 <w:noProof/>
               </w:rPr>
-              <w:instrText xml:space="preserve"> PAGEREF _Toc241789741 \h </w:instrText>
+              <w:instrText xml:space="preserve"> PAGEREF _Toc241791363 \h </w:instrText>
             </w:r>
             <w:r>
               <w:rPr>
@@ -527,7 +527,7 @@
               <w14:ligatures w14:val="standardContextual"/>
             </w:rPr>
           </w:pPr>
-          <w:hyperlink w:anchor="_Toc241789742" w:history="1">
+          <w:hyperlink w:anchor="_Toc241791364" w:history="1">
             <w:r>
               <w:rPr>
                 <w:rStyle w:val="Hyperlink"/>
@@ -551,7 +551,7 @@
               <w:rPr>
                 <w:noProof/>
               </w:rPr>
-              <w:instrText xml:space="preserve"> PAGEREF _Toc241789742 \h </w:instrText>
+              <w:instrText xml:space="preserve"> PAGEREF _Toc241791364 \h </w:instrText>
             </w:r>
             <w:r>
               <w:rPr>
@@ -594,7 +594,7 @@
               <w14:ligatures w14:val="standardContextual"/>
             </w:rPr>
           </w:pPr>
-          <w:hyperlink w:anchor="_Toc241789743" w:history="1">
+          <w:hyperlink w:anchor="_Toc241791365" w:history="1">
             <w:r>
               <w:rPr>
                 <w:rStyle w:val="Hyperlink"/>
@@ -618,7 +618,7 @@
               <w:rPr>
                 <w:noProof/>
               </w:rPr>
-              <w:instrText xml:space="preserve"> PAGEREF _Toc241789743 \h </w:instrText>
+              <w:instrText xml:space="preserve"> PAGEREF _Toc241791365 \h </w:instrText>
             </w:r>
             <w:r>
               <w:rPr>
@@ -661,7 +661,7 @@
               <w14:ligatures w14:val="standardContextual"/>
             </w:rPr>
           </w:pPr>
-          <w:hyperlink w:anchor="_Toc241789744" w:history="1">
+          <w:hyperlink w:anchor="_Toc241791366" w:history="1">
             <w:r>
               <w:rPr>
                 <w:rStyle w:val="Hyperlink"/>
@@ -685,7 +685,7 @@
               <w:rPr>
                 <w:noProof/>
               </w:rPr>
-              <w:instrText xml:space="preserve"> PAGEREF _Toc241789744 \h </w:instrText>
+              <w:instrText xml:space="preserve"> PAGEREF _Toc241791366 \h </w:instrText>
             </w:r>
             <w:r>
               <w:rPr>
@@ -728,7 +728,7 @@
               <w14:ligatures w14:val="standardContextual"/>
             </w:rPr>
           </w:pPr>
-          <w:hyperlink w:anchor="_Toc241789745" w:history="1">
+          <w:hyperlink w:anchor="_Toc241791367" w:history="1">
             <w:r>
               <w:rPr>
                 <w:rStyle w:val="Hyperlink"/>
@@ -752,7 +752,7 @@
               <w:rPr>
                 <w:noProof/>
               </w:rPr>
-              <w:instrText xml:space="preserve"> PAGEREF _Toc241789745 \h </w:instrText>
+              <w:instrText xml:space="preserve"> PAGEREF _Toc241791367 \h </w:instrText>
             </w:r>
             <w:r>
               <w:rPr>
@@ -795,7 +795,7 @@
               <w14:ligatures w14:val="standardContextual"/>
             </w:rPr>
           </w:pPr>
-          <w:hyperlink w:anchor="_Toc241789746" w:history="1">
+          <w:hyperlink w:anchor="_Toc241791368" w:history="1">
             <w:r>
               <w:rPr>
                 <w:rStyle w:val="Hyperlink"/>
@@ -819,7 +819,7 @@
               <w:rPr>
                 <w:noProof/>
               </w:rPr>
-              <w:instrText xml:space="preserve"> PAGEREF _Toc241789746 \h </w:instrText>
+              <w:instrText xml:space="preserve"> PAGEREF _Toc241791368 \h </w:instrText>
             </w:r>
             <w:r>
               <w:rPr>
@@ -862,7 +862,7 @@
               <w14:ligatures w14:val="standardContextual"/>
             </w:rPr>
           </w:pPr>
-          <w:hyperlink w:anchor="_Toc241789747" w:history="1">
+          <w:hyperlink w:anchor="_Toc241791369" w:history="1">
             <w:r>
               <w:rPr>
                 <w:rStyle w:val="Hyperlink"/>
@@ -886,7 +886,7 @@
               <w:rPr>
                 <w:noProof/>
               </w:rPr>
-              <w:instrText xml:space="preserve"> PAGEREF _Toc241789747 \h </w:instrText>
+              <w:instrText xml:space="preserve"> PAGEREF _Toc241791369 \h </w:instrText>
             </w:r>
             <w:r>
               <w:rPr>
@@ -929,7 +929,7 @@
               <w14:ligatures w14:val="standardContextual"/>
             </w:rPr>
           </w:pPr>
-          <w:hyperlink w:anchor="_Toc241789748" w:history="1">
+          <w:hyperlink w:anchor="_Toc241791370" w:history="1">
             <w:r>
               <w:rPr>
                 <w:rStyle w:val="Hyperlink"/>
@@ -953,7 +953,7 @@
               <w:rPr>
                 <w:noProof/>
               </w:rPr>
-              <w:instrText xml:space="preserve"> PAGEREF _Toc241789748 \h </w:instrText>
+              <w:instrText xml:space="preserve"> PAGEREF _Toc241791370 \h </w:instrText>
             </w:r>
             <w:r>
               <w:rPr>
@@ -996,7 +996,7 @@
               <w14:ligatures w14:val="standardContextual"/>
             </w:rPr>
           </w:pPr>
-          <w:hyperlink w:anchor="_Toc241789749" w:history="1">
+          <w:hyperlink w:anchor="_Toc241791371" w:history="1">
             <w:r>
               <w:rPr>
                 <w:rStyle w:val="Hyperlink"/>
@@ -1020,7 +1020,7 @@
               <w:rPr>
                 <w:noProof/>
               </w:rPr>
-              <w:instrText xml:space="preserve"> PAGEREF _Toc241789749 \h </w:instrText>
+              <w:instrText xml:space="preserve"> PAGEREF _Toc241791371 \h </w:instrText>
             </w:r>
             <w:r>
               <w:rPr>
@@ -1063,7 +1063,7 @@
               <w14:ligatures w14:val="standardContextual"/>
             </w:rPr>
           </w:pPr>
-          <w:hyperlink w:anchor="_Toc241789750" w:history="1">
+          <w:hyperlink w:anchor="_Toc241791372" w:history="1">
             <w:r>
               <w:rPr>
                 <w:rStyle w:val="Hyperlink"/>
@@ -1087,7 +1087,7 @@
               <w:rPr>
                 <w:noProof/>
               </w:rPr>
-              <w:instrText xml:space="preserve"> PAGEREF _Toc241789750 \h </w:instrText>
+              <w:instrText xml:space="preserve"> PAGEREF _Toc241791372 \h </w:instrText>
             </w:r>
             <w:r>
               <w:rPr>
@@ -1130,7 +1130,7 @@
               <w14:ligatures w14:val="standardContextual"/>
             </w:rPr>
           </w:pPr>
-          <w:hyperlink w:anchor="_Toc241789751" w:history="1">
+          <w:hyperlink w:anchor="_Toc241791373" w:history="1">
             <w:r>
               <w:rPr>
                 <w:rStyle w:val="Hyperlink"/>
@@ -1154,7 +1154,7 @@
               <w:rPr>
                 <w:noProof/>
               </w:rPr>
-              <w:instrText xml:space="preserve"> PAGEREF _Toc241789751 \h </w:instrText>
+              <w:instrText xml:space="preserve"> PAGEREF _Toc241791373 \h </w:instrText>
             </w:r>
             <w:r>
               <w:rPr>
@@ -1197,7 +1197,7 @@
               <w14:ligatures w14:val="standardContextual"/>
             </w:rPr>
           </w:pPr>
-          <w:hyperlink w:anchor="_Toc241789752" w:history="1">
+          <w:hyperlink w:anchor="_Toc241791374" w:history="1">
             <w:r>
               <w:rPr>
                 <w:rStyle w:val="Hyperlink"/>
@@ -1221,7 +1221,7 @@
               <w:rPr>
                 <w:noProof/>
               </w:rPr>
-              <w:instrText xml:space="preserve"> PAGEREF _Toc241789752 \h </w:instrText>
+              <w:instrText xml:space="preserve"> PAGEREF _Toc241791374 \h </w:instrText>
             </w:r>
             <w:r>
               <w:rPr>
@@ -1264,7 +1264,7 @@
               <w14:ligatures w14:val="standardContextual"/>
             </w:rPr>
           </w:pPr>
-          <w:hyperlink w:anchor="_Toc241789753" w:history="1">
+          <w:hyperlink w:anchor="_Toc241791375" w:history="1">
             <w:r>
               <w:rPr>
                 <w:rStyle w:val="Hyperlink"/>
@@ -1288,7 +1288,7 @@
               <w:rPr>
                 <w:noProof/>
               </w:rPr>
-              <w:instrText xml:space="preserve"> PAGEREF _Toc241789753 \h </w:instrText>
+              <w:instrText xml:space="preserve"> PAGEREF _Toc241791375 \h </w:instrText>
             </w:r>
             <w:r>
               <w:rPr>
@@ -1331,7 +1331,7 @@
               <w14:ligatures w14:val="standardContextual"/>
             </w:rPr>
           </w:pPr>
-          <w:hyperlink w:anchor="_Toc241789754" w:history="1">
+          <w:hyperlink w:anchor="_Toc241791376" w:history="1">
             <w:r>
               <w:rPr>
                 <w:rStyle w:val="Hyperlink"/>
@@ -1355,7 +1355,7 @@
               <w:rPr>
                 <w:noProof/>
               </w:rPr>
-              <w:instrText xml:space="preserve"> PAGEREF _Toc241789754 \h </w:instrText>
+              <w:instrText xml:space="preserve"> PAGEREF _Toc241791376 \h </w:instrText>
             </w:r>
             <w:r>
               <w:rPr>
@@ -1398,7 +1398,7 @@
               <w14:ligatures w14:val="standardContextual"/>
             </w:rPr>
           </w:pPr>
-          <w:hyperlink w:anchor="_Toc241789755" w:history="1">
+          <w:hyperlink w:anchor="_Toc241791377" w:history="1">
             <w:r>
               <w:rPr>
                 <w:rStyle w:val="Hyperlink"/>
@@ -1422,7 +1422,7 @@
               <w:rPr>
                 <w:noProof/>
               </w:rPr>
-              <w:instrText xml:space="preserve"> PAGEREF _Toc241789755 \h </w:instrText>
+              <w:instrText xml:space="preserve"> PAGEREF _Toc241791377 \h </w:instrText>
             </w:r>
             <w:r>
               <w:rPr>
@@ -1465,7 +1465,7 @@
               <w14:ligatures w14:val="standardContextual"/>
             </w:rPr>
           </w:pPr>
-          <w:hyperlink w:anchor="_Toc241789756" w:history="1">
+          <w:hyperlink w:anchor="_Toc241791378" w:history="1">
             <w:r>
               <w:rPr>
                 <w:rStyle w:val="Hyperlink"/>
@@ -1489,7 +1489,7 @@
               <w:rPr>
                 <w:noProof/>
               </w:rPr>
-              <w:instrText xml:space="preserve"> PAGEREF _Toc241789756 \h </w:instrText>
+              <w:instrText xml:space="preserve"> PAGEREF _Toc241791378 \h </w:instrText>
             </w:r>
             <w:r>
               <w:rPr>
@@ -1532,7 +1532,7 @@
               <w14:ligatures w14:val="standardContextual"/>
             </w:rPr>
           </w:pPr>
-          <w:hyperlink w:anchor="_Toc241789757" w:history="1">
+          <w:hyperlink w:anchor="_Toc241791379" w:history="1">
             <w:r>
               <w:rPr>
                 <w:rStyle w:val="Hyperlink"/>
@@ -1556,7 +1556,7 @@
               <w:rPr>
                 <w:noProof/>
               </w:rPr>
-              <w:instrText xml:space="preserve"> PAGEREF _Toc241789757 \h </w:instrText>
+              <w:instrText xml:space="preserve"> PAGEREF _Toc241791379 \h </w:instrText>
             </w:r>
             <w:r>
               <w:rPr>
@@ -1599,7 +1599,7 @@
               <w14:ligatures w14:val="standardContextual"/>
             </w:rPr>
           </w:pPr>
-          <w:hyperlink w:anchor="_Toc241789758" w:history="1">
+          <w:hyperlink w:anchor="_Toc241791380" w:history="1">
             <w:r>
               <w:rPr>
                 <w:rStyle w:val="Hyperlink"/>
@@ -1623,7 +1623,7 @@
               <w:rPr>
                 <w:noProof/>
               </w:rPr>
-              <w:instrText xml:space="preserve"> PAGEREF _Toc241789758 \h </w:instrText>
+              <w:instrText xml:space="preserve"> PAGEREF _Toc241791380 \h </w:instrText>
             </w:r>
             <w:r>
               <w:rPr>
@@ -1666,7 +1666,7 @@
               <w14:ligatures w14:val="standardContextual"/>
             </w:rPr>
           </w:pPr>
-          <w:hyperlink w:anchor="_Toc241789759" w:history="1">
+          <w:hyperlink w:anchor="_Toc241791381" w:history="1">
             <w:r>
               <w:rPr>
                 <w:rStyle w:val="Hyperlink"/>
@@ -1690,7 +1690,7 @@
               <w:rPr>
                 <w:noProof/>
               </w:rPr>
-              <w:instrText xml:space="preserve"> PAGEREF _Toc241789759 \h </w:instrText>
+              <w:instrText xml:space="preserve"> PAGEREF _Toc241791381 \h </w:instrText>
             </w:r>
             <w:r>
               <w:rPr>
@@ -1733,7 +1733,7 @@
               <w14:ligatures w14:val="standardContextual"/>
             </w:rPr>
           </w:pPr>
-          <w:hyperlink w:anchor="_Toc241789760" w:history="1">
+          <w:hyperlink w:anchor="_Toc241791382" w:history="1">
             <w:r>
               <w:rPr>
                 <w:rStyle w:val="Hyperlink"/>
@@ -1757,7 +1757,7 @@
               <w:rPr>
                 <w:noProof/>
               </w:rPr>
-              <w:instrText xml:space="preserve"> PAGEREF _Toc241789760 \h </w:instrText>
+              <w:instrText xml:space="preserve"> PAGEREF _Toc241791382 \h </w:instrText>
             </w:r>
             <w:r>
               <w:rPr>
@@ -1800,7 +1800,7 @@
               <w14:ligatures w14:val="standardContextual"/>
             </w:rPr>
           </w:pPr>
-          <w:hyperlink w:anchor="_Toc241789761" w:history="1">
+          <w:hyperlink w:anchor="_Toc241791383" w:history="1">
             <w:r>
               <w:rPr>
                 <w:rStyle w:val="Hyperlink"/>
@@ -1824,7 +1824,7 @@
               <w:rPr>
                 <w:noProof/>
               </w:rPr>
-              <w:instrText xml:space="preserve"> PAGEREF _Toc241789761 \h </w:instrText>
+              <w:instrText xml:space="preserve"> PAGEREF _Toc241791383 \h </w:instrText>
             </w:r>
             <w:r>
               <w:rPr>
@@ -1867,7 +1867,7 @@
               <w14:ligatures w14:val="standardContextual"/>
             </w:rPr>
           </w:pPr>
-          <w:hyperlink w:anchor="_Toc241789762" w:history="1">
+          <w:hyperlink w:anchor="_Toc241791384" w:history="1">
             <w:r>
               <w:rPr>
                 <w:rStyle w:val="Hyperlink"/>
@@ -1891,7 +1891,7 @@
               <w:rPr>
                 <w:noProof/>
               </w:rPr>
-              <w:instrText xml:space="preserve"> PAGEREF _Toc241789762 \h </w:instrText>
+              <w:instrText xml:space="preserve"> PAGEREF _Toc241791384 \h </w:instrText>
             </w:r>
             <w:r>
               <w:rPr>
@@ -1934,7 +1934,7 @@
               <w14:ligatures w14:val="standardContextual"/>
             </w:rPr>
           </w:pPr>
-          <w:hyperlink w:anchor="_Toc241789763" w:history="1">
+          <w:hyperlink w:anchor="_Toc241791385" w:history="1">
             <w:r>
               <w:rPr>
                 <w:rStyle w:val="Hyperlink"/>
@@ -1958,7 +1958,7 @@
               <w:rPr>
                 <w:noProof/>
               </w:rPr>
-              <w:instrText xml:space="preserve"> PAGEREF _Toc241789763 \h </w:instrText>
+              <w:instrText xml:space="preserve"> PAGEREF _Toc241791385 \h </w:instrText>
             </w:r>
             <w:r>
               <w:rPr>
@@ -2001,7 +2001,7 @@
               <w14:ligatures w14:val="standardContextual"/>
             </w:rPr>
           </w:pPr>
-          <w:hyperlink w:anchor="_Toc241789764" w:history="1">
+          <w:hyperlink w:anchor="_Toc241791386" w:history="1">
             <w:r>
               <w:rPr>
                 <w:rStyle w:val="Hyperlink"/>
@@ -2025,7 +2025,7 @@
               <w:rPr>
                 <w:noProof/>
               </w:rPr>
-              <w:instrText xml:space="preserve"> PAGEREF _Toc241789764 \h </w:instrText>
+              <w:instrText xml:space="preserve"> PAGEREF _Toc241791386 \h </w:instrText>
             </w:r>
             <w:r>
               <w:rPr>
@@ -2068,7 +2068,7 @@
               <w14:ligatures w14:val="standardContextual"/>
             </w:rPr>
           </w:pPr>
-          <w:hyperlink w:anchor="_Toc241789765" w:history="1">
+          <w:hyperlink w:anchor="_Toc241791387" w:history="1">
             <w:r>
               <w:rPr>
                 <w:rStyle w:val="Hyperlink"/>
@@ -2092,7 +2092,7 @@
               <w:rPr>
                 <w:noProof/>
               </w:rPr>
-              <w:instrText xml:space="preserve"> PAGEREF _Toc241789765 \h </w:instrText>
+              <w:instrText xml:space="preserve"> PAGEREF _Toc241791387 \h </w:instrText>
             </w:r>
             <w:r>
               <w:rPr>
@@ -2135,7 +2135,7 @@
               <w14:ligatures w14:val="standardContextual"/>
             </w:rPr>
           </w:pPr>
-          <w:hyperlink w:anchor="_Toc241789766" w:history="1">
+          <w:hyperlink w:anchor="_Toc241791388" w:history="1">
             <w:r>
               <w:rPr>
                 <w:rStyle w:val="Hyperlink"/>
@@ -2159,7 +2159,7 @@
               <w:rPr>
                 <w:noProof/>
               </w:rPr>
-              <w:instrText xml:space="preserve"> PAGEREF _Toc241789766 \h </w:instrText>
+              <w:instrText xml:space="preserve"> PAGEREF _Toc241791388 \h </w:instrText>
             </w:r>
             <w:r>
               <w:rPr>
@@ -2202,7 +2202,7 @@
               <w14:ligatures w14:val="standardContextual"/>
             </w:rPr>
           </w:pPr>
-          <w:hyperlink w:anchor="_Toc241789767" w:history="1">
+          <w:hyperlink w:anchor="_Toc241791389" w:history="1">
             <w:r>
               <w:rPr>
                 <w:rStyle w:val="Hyperlink"/>
@@ -2226,7 +2226,7 @@
               <w:rPr>
                 <w:noProof/>
               </w:rPr>
-              <w:instrText xml:space="preserve"> PAGEREF _Toc241789767 \h </w:instrText>
+              <w:instrText xml:space="preserve"> PAGEREF _Toc241791389 \h </w:instrText>
             </w:r>
             <w:r>
               <w:rPr>
@@ -2269,7 +2269,7 @@
               <w14:ligatures w14:val="standardContextual"/>
             </w:rPr>
           </w:pPr>
-          <w:hyperlink w:anchor="_Toc241789768" w:history="1">
+          <w:hyperlink w:anchor="_Toc241791390" w:history="1">
             <w:r>
               <w:rPr>
                 <w:rStyle w:val="Hyperlink"/>
@@ -2293,7 +2293,7 @@
               <w:rPr>
                 <w:noProof/>
               </w:rPr>
-              <w:instrText xml:space="preserve"> PAGEREF _Toc241789768 \h </w:instrText>
+              <w:instrText xml:space="preserve"> PAGEREF _Toc241791390 \h </w:instrText>
             </w:r>
             <w:r>
               <w:rPr>
@@ -2336,7 +2336,7 @@
               <w14:ligatures w14:val="standardContextual"/>
             </w:rPr>
           </w:pPr>
-          <w:hyperlink w:anchor="_Toc241789769" w:history="1">
+          <w:hyperlink w:anchor="_Toc241791391" w:history="1">
             <w:r>
               <w:rPr>
                 <w:rStyle w:val="Hyperlink"/>
@@ -2360,7 +2360,7 @@
               <w:rPr>
                 <w:noProof/>
               </w:rPr>
-              <w:instrText xml:space="preserve"> PAGEREF _Toc241789769 \h </w:instrText>
+              <w:instrText xml:space="preserve"> PAGEREF _Toc241791391 \h </w:instrText>
             </w:r>
             <w:r>
               <w:rPr>
@@ -2403,7 +2403,7 @@
               <w14:ligatures w14:val="standardContextual"/>
             </w:rPr>
           </w:pPr>
-          <w:hyperlink w:anchor="_Toc241789770" w:history="1">
+          <w:hyperlink w:anchor="_Toc241791392" w:history="1">
             <w:r>
               <w:rPr>
                 <w:rStyle w:val="Hyperlink"/>
@@ -2427,7 +2427,7 @@
               <w:rPr>
                 <w:noProof/>
               </w:rPr>
-              <w:instrText xml:space="preserve"> PAGEREF _Toc241789770 \h </w:instrText>
+              <w:instrText xml:space="preserve"> PAGEREF _Toc241791392 \h </w:instrText>
             </w:r>
             <w:r>
               <w:rPr>
@@ -2470,7 +2470,7 @@
               <w14:ligatures w14:val="standardContextual"/>
             </w:rPr>
           </w:pPr>
-          <w:hyperlink w:anchor="_Toc241789771" w:history="1">
+          <w:hyperlink w:anchor="_Toc241791393" w:history="1">
             <w:r>
               <w:rPr>
                 <w:rStyle w:val="Hyperlink"/>
@@ -2494,7 +2494,7 @@
               <w:rPr>
                 <w:noProof/>
               </w:rPr>
-              <w:instrText xml:space="preserve"> PAGEREF _Toc241789771 \h </w:instrText>
+              <w:instrText xml:space="preserve"> PAGEREF _Toc241791393 \h </w:instrText>
             </w:r>
             <w:r>
               <w:rPr>
@@ -2537,7 +2537,7 @@
               <w14:ligatures w14:val="standardContextual"/>
             </w:rPr>
           </w:pPr>
-          <w:hyperlink w:anchor="_Toc241789772" w:history="1">
+          <w:hyperlink w:anchor="_Toc241791394" w:history="1">
             <w:r>
               <w:rPr>
                 <w:rStyle w:val="Hyperlink"/>
@@ -2561,7 +2561,7 @@
               <w:rPr>
                 <w:noProof/>
               </w:rPr>
-              <w:instrText xml:space="preserve"> PAGEREF _Toc241789772 \h </w:instrText>
+              <w:instrText xml:space="preserve"> PAGEREF _Toc241791394 \h </w:instrText>
             </w:r>
             <w:r>
               <w:rPr>
@@ -2604,7 +2604,7 @@
               <w14:ligatures w14:val="standardContextual"/>
             </w:rPr>
           </w:pPr>
-          <w:hyperlink w:anchor="_Toc241789773" w:history="1">
+          <w:hyperlink w:anchor="_Toc241791395" w:history="1">
             <w:r>
               <w:rPr>
                 <w:rStyle w:val="Hyperlink"/>
@@ -2628,7 +2628,7 @@
               <w:rPr>
                 <w:noProof/>
               </w:rPr>
-              <w:instrText xml:space="preserve"> PAGEREF _Toc241789773 \h </w:instrText>
+              <w:instrText xml:space="preserve"> PAGEREF _Toc241791395 \h </w:instrText>
             </w:r>
             <w:r>
               <w:rPr>
@@ -2671,7 +2671,7 @@
               <w14:ligatures w14:val="standardContextual"/>
             </w:rPr>
           </w:pPr>
-          <w:hyperlink w:anchor="_Toc241789774" w:history="1">
+          <w:hyperlink w:anchor="_Toc241791396" w:history="1">
             <w:r>
               <w:rPr>
                 <w:rStyle w:val="Hyperlink"/>
@@ -2695,7 +2695,7 @@
               <w:rPr>
                 <w:noProof/>
               </w:rPr>
-              <w:instrText xml:space="preserve"> PAGEREF _Toc241789774 \h </w:instrText>
+              <w:instrText xml:space="preserve"> PAGEREF _Toc241791396 \h </w:instrText>
             </w:r>
             <w:r>
               <w:rPr>
@@ -2712,7 +2712,7 @@
               <w:rPr>
                 <w:noProof/>
               </w:rPr>
-              <w:t>28</w:t>
+              <w:t>27</w:t>
             </w:r>
             <w:r>
               <w:rPr>
@@ -2738,7 +2738,7 @@
               <w14:ligatures w14:val="standardContextual"/>
             </w:rPr>
           </w:pPr>
-          <w:hyperlink w:anchor="_Toc241789775" w:history="1">
+          <w:hyperlink w:anchor="_Toc241791397" w:history="1">
             <w:r>
               <w:rPr>
                 <w:rStyle w:val="Hyperlink"/>
@@ -2762,7 +2762,7 @@
               <w:rPr>
                 <w:noProof/>
               </w:rPr>
-              <w:instrText xml:space="preserve"> PAGEREF _Toc241789775 \h </w:instrText>
+              <w:instrText xml:space="preserve"> PAGEREF _Toc241791397 \h </w:instrText>
             </w:r>
             <w:r>
               <w:rPr>
@@ -2805,7 +2805,7 @@
               <w14:ligatures w14:val="standardContextual"/>
             </w:rPr>
           </w:pPr>
-          <w:hyperlink w:anchor="_Toc241789776" w:history="1">
+          <w:hyperlink w:anchor="_Toc241791398" w:history="1">
             <w:r>
               <w:rPr>
                 <w:rStyle w:val="Hyperlink"/>
@@ -2829,7 +2829,7 @@
               <w:rPr>
                 <w:noProof/>
               </w:rPr>
-              <w:instrText xml:space="preserve"> PAGEREF _Toc241789776 \h </w:instrText>
+              <w:instrText xml:space="preserve"> PAGEREF _Toc241791398 \h </w:instrText>
             </w:r>
             <w:r>
               <w:rPr>
@@ -2872,7 +2872,7 @@
               <w14:ligatures w14:val="standardContextual"/>
             </w:rPr>
           </w:pPr>
-          <w:hyperlink w:anchor="_Toc241789777" w:history="1">
+          <w:hyperlink w:anchor="_Toc241791399" w:history="1">
             <w:r>
               <w:rPr>
                 <w:rStyle w:val="Hyperlink"/>
@@ -2896,7 +2896,7 @@
               <w:rPr>
                 <w:noProof/>
               </w:rPr>
-              <w:instrText xml:space="preserve"> PAGEREF _Toc241789777 \h </w:instrText>
+              <w:instrText xml:space="preserve"> PAGEREF _Toc241791399 \h </w:instrText>
             </w:r>
             <w:r>
               <w:rPr>
@@ -2939,7 +2939,7 @@
               <w14:ligatures w14:val="standardContextual"/>
             </w:rPr>
           </w:pPr>
-          <w:hyperlink w:anchor="_Toc241789778" w:history="1">
+          <w:hyperlink w:anchor="_Toc241791400" w:history="1">
             <w:r>
               <w:rPr>
                 <w:rStyle w:val="Hyperlink"/>
@@ -2963,7 +2963,7 @@
               <w:rPr>
                 <w:noProof/>
               </w:rPr>
-              <w:instrText xml:space="preserve"> PAGEREF _Toc241789778 \h </w:instrText>
+              <w:instrText xml:space="preserve"> PAGEREF _Toc241791400 \h </w:instrText>
             </w:r>
             <w:r>
               <w:rPr>
@@ -3002,7 +3002,7 @@
         <w:pStyle w:val="Heading1"/>
         <w:pageBreakBefore/>
       </w:pPr>
-      <w:bookmarkStart w:id="0" w:name="_Toc241789736"/>
+      <w:bookmarkStart w:id="0" w:name="_Toc241791358"/>
       <w:r>
         <w:t>1. The system at a glance</w:t>
       </w:r>
@@ -3642,7 +3642,7 @@
         <w:keepNext/>
         <w:keepLines/>
       </w:pPr>
-      <w:bookmarkStart w:id="1" w:name="_Toc241789737"/>
+      <w:bookmarkStart w:id="1" w:name="_Toc241791359"/>
       <w:r>
         <w:t>How the pieces fit</w:t>
       </w:r>
@@ -3769,7 +3769,7 @@
         <w:pStyle w:val="Heading1"/>
         <w:pageBreakBefore/>
       </w:pPr>
-      <w:bookmarkStart w:id="2" w:name="_Toc241789738"/>
+      <w:bookmarkStart w:id="2" w:name="_Toc241791360"/>
       <w:r>
         <w:t>2. Signing in</w:t>
       </w:r>
@@ -3781,7 +3781,7 @@
         <w:keepNext/>
         <w:keepLines/>
       </w:pPr>
-      <w:bookmarkStart w:id="3" w:name="_Toc241789739"/>
+      <w:bookmarkStart w:id="3" w:name="_Toc241791361"/>
       <w:r>
         <w:t>Three separate sign-ins</w:t>
       </w:r>
@@ -3982,7 +3982,7 @@
               <w:spacing w:after="40" w:line="270" w:lineRule="auto"/>
             </w:pPr>
             <w:r>
-              <w:t>Anyone, as a client</w:t>
+              <w:t>Clients the firm has added under Clients</w:t>
             </w:r>
           </w:p>
         </w:tc>
@@ -4286,7 +4286,7 @@
         <w:keepNext/>
         <w:keepLines/>
       </w:pPr>
-      <w:bookmarkStart w:id="4" w:name="_Toc241789740"/>
+      <w:bookmarkStart w:id="4" w:name="_Toc241791362"/>
       <w:r>
         <w:t>How people prove who they are</w:t>
       </w:r>
@@ -4471,7 +4471,7 @@
               <w:spacing w:after="40" w:line="270" w:lineRule="auto"/>
             </w:pPr>
             <w:r>
-              <w:t>Any mobile number. A new number creates a new client account; a known one signs in.</w:t>
+              <w:t>Only the mobile number saved for them under Clients.</w:t>
             </w:r>
           </w:p>
         </w:tc>
@@ -4496,7 +4496,7 @@
               <w:spacing w:after="40" w:line="270" w:lineRule="auto"/>
             </w:pPr>
             <w:r>
-              <w:t>Any Google account. A new one creates a client account and is asked once to add and confirm a mobile number.</w:t>
+              <w:t>Only the email saved for them under Clients. Asked once to add and confirm a mobile number if none is saved.</w:t>
             </w:r>
           </w:p>
         </w:tc>
@@ -4604,10 +4604,10 @@
           <w:b/>
           <w:bCs/>
         </w:rPr>
-        <w:t>Firm members are never created by signing in.</w:t>
-      </w:r>
-      <w:r>
-        <w:t xml:space="preserve"> An owner or administrator adds them first on the Team page, with their email and mobile number, and chooses their access (Owner, Admin, Lawyer, Editor or No sign-in).</w:t>
+        <w:t>Nobody signs themselves up.</w:t>
+      </w:r>
+      <w:r>
+        <w:t xml:space="preserve"> Clients, lawyers and everyone else are added by an owner or administrator: clients under Clients, firm members on the Team page. Someone not added who tries the client sign-in is told they are not registered as a client yet, to contact the firm first, and is taken to the Contact page.</w:t>
       </w:r>
     </w:p>
     <w:p>
@@ -4624,10 +4624,10 @@
           <w:b/>
           <w:bCs/>
         </w:rPr>
-        <w:t>Someone not on the Team page</w:t>
-      </w:r>
-      <w:r>
-        <w:t>, or whose access does not allow that page, is told the email or number is not registered with the firm and to ask the administrator.</w:t>
+        <w:t>Firm members are never created by signing in.</w:t>
+      </w:r>
+      <w:r>
+        <w:t xml:space="preserve"> An owner or administrator adds them first on the Team page, with their email and mobile number, and chooses their access (Owner, Admin, Lawyer, Editor or No sign-in).</w:t>
       </w:r>
     </w:p>
     <w:p>
@@ -4644,10 +4644,10 @@
           <w:b/>
           <w:bCs/>
         </w:rPr>
-        <w:t>The first owner</w:t>
-      </w:r>
-      <w:r>
-        <w:t xml:space="preserve"> is created automatically the first time an email listed in the server setting ADMIN_EMAILS signs in at the admin page.</w:t>
+        <w:t>Someone not on the Team page</w:t>
+      </w:r>
+      <w:r>
+        <w:t>, or whose access does not allow that page, is told the email or number is not registered with the firm and to ask the administrator.</w:t>
       </w:r>
     </w:p>
     <w:p>
@@ -4660,50 +4660,15 @@
         <w:spacing w:after="80" w:line="290" w:lineRule="auto"/>
       </w:pPr>
       <w:r>
-        <w:t>There are no passwords to send, reset or leak.</w:t>
-      </w:r>
-    </w:p>
-    <w:p>
-      <w:pPr>
-        <w:pStyle w:val="Heading2"/>
-        <w:keepNext/>
-        <w:keepLines/>
-      </w:pPr>
-      <w:bookmarkStart w:id="5" w:name="_Toc241789741"/>
-      <w:r>
-        <w:t>Who can sign in: the Team page panel</w:t>
-      </w:r>
-      <w:bookmarkEnd w:id="5"/>
-    </w:p>
-    <w:p>
-      <w:pPr>
-        <w:spacing w:after="140" w:line="300" w:lineRule="auto"/>
-      </w:pPr>
-      <w:r>
-        <w:t xml:space="preserve">Admin console → Team (Lawyers) opens with a </w:t>
-      </w:r>
-      <w:r>
         <w:rPr>
           <w:b/>
           <w:bCs/>
         </w:rPr>
-        <w:t>Who can sign in</w:t>
-      </w:r>
-      <w:r>
-        <w:t xml:space="preserve"> panel. It lists every email that can open the admin console and every email that can open the lawyer workspace (lawyers, administrators and owners), with each person's access and when they last signed in, plus any ADMIN_EMAILS that have not signed in yet. To give or remove access, change the person's access with Edit; it applies on their next click, without them signing out.</w:t>
-      </w:r>
-    </w:p>
-    <w:p>
-      <w:pPr>
-        <w:pStyle w:val="Heading2"/>
-        <w:keepNext/>
-        <w:keepLines/>
-      </w:pPr>
-      <w:bookmarkStart w:id="6" w:name="_Toc241789742"/>
-      <w:r>
-        <w:t>Staying signed in, and stopping access</w:t>
-      </w:r>
-      <w:bookmarkEnd w:id="6"/>
+        <w:t>The first owner</w:t>
+      </w:r>
+      <w:r>
+        <w:t xml:space="preserve"> is created automatically the first time an email listed in the server setting ADMIN_EMAILS signs in at the admin page.</w:t>
+      </w:r>
     </w:p>
     <w:p>
       <w:pPr>
@@ -4715,8 +4680,50 @@
         <w:spacing w:after="80" w:line="290" w:lineRule="auto"/>
       </w:pPr>
       <w:r>
-        <w:t>Firm sessions last 12 hours; client sessions last 7 days.</w:t>
-      </w:r>
+        <w:t>There are no passwords to send, reset or leak.</w:t>
+      </w:r>
+    </w:p>
+    <w:p>
+      <w:pPr>
+        <w:pStyle w:val="Heading2"/>
+        <w:keepNext/>
+        <w:keepLines/>
+      </w:pPr>
+      <w:bookmarkStart w:id="5" w:name="_Toc241791363"/>
+      <w:r>
+        <w:t>Who can sign in: the Team page panel</w:t>
+      </w:r>
+      <w:bookmarkEnd w:id="5"/>
+    </w:p>
+    <w:p>
+      <w:pPr>
+        <w:spacing w:after="140" w:line="300" w:lineRule="auto"/>
+      </w:pPr>
+      <w:r>
+        <w:t xml:space="preserve">Admin console → Team (Lawyers) opens with a </w:t>
+      </w:r>
+      <w:r>
+        <w:rPr>
+          <w:b/>
+          <w:bCs/>
+        </w:rPr>
+        <w:t>Who can sign in</w:t>
+      </w:r>
+      <w:r>
+        <w:t xml:space="preserve"> panel. It lists every email that can open the admin console and every email that can open the lawyer workspace (lawyers, administrators and owners), with each person's access and when they last signed in, plus any ADMIN_EMAILS that have not signed in yet. To give or remove access, change the person's access with Edit; it applies on their next click, without them signing out.</w:t>
+      </w:r>
+    </w:p>
+    <w:p>
+      <w:pPr>
+        <w:pStyle w:val="Heading2"/>
+        <w:keepNext/>
+        <w:keepLines/>
+      </w:pPr>
+      <w:bookmarkStart w:id="6" w:name="_Toc241791364"/>
+      <w:r>
+        <w:t>Staying signed in, and stopping access</w:t>
+      </w:r>
+      <w:bookmarkEnd w:id="6"/>
     </w:p>
     <w:p>
       <w:pPr>
@@ -4728,6 +4735,19 @@
         <w:spacing w:after="80" w:line="290" w:lineRule="auto"/>
       </w:pPr>
       <w:r>
+        <w:t>Firm sessions last 12 hours; client sessions last 7 days.</w:t>
+      </w:r>
+    </w:p>
+    <w:p>
+      <w:pPr>
+        <w:pStyle w:val="ListParagraph"/>
+        <w:numPr>
+          <w:ilvl w:val="0"/>
+          <w:numId w:val="2"/>
+        </w:numPr>
+        <w:spacing w:after="80" w:line="290" w:lineRule="auto"/>
+      </w:pPr>
+      <w:r>
         <w:t>Deactivating an account (Team or Clients → Edit → Account → Deactivated) signs that person out of every area at once. Their history is kept.</w:t>
       </w:r>
     </w:p>
@@ -4736,7 +4756,7 @@
         <w:pStyle w:val="Heading1"/>
         <w:pageBreakBefore/>
       </w:pPr>
-      <w:bookmarkStart w:id="7" w:name="_Toc241789743"/>
+      <w:bookmarkStart w:id="7" w:name="_Toc241791365"/>
       <w:r>
         <w:t>3. Who can do what</w:t>
       </w:r>
@@ -5468,7 +5488,7 @@
         <w:pStyle w:val="Heading1"/>
         <w:pageBreakBefore/>
       </w:pPr>
-      <w:bookmarkStart w:id="8" w:name="_Toc241789744"/>
+      <w:bookmarkStart w:id="8" w:name="_Toc241791366"/>
       <w:r>
         <w:t>4. The public website</w:t>
       </w:r>
@@ -5480,7 +5500,7 @@
         <w:keepNext/>
         <w:keepLines/>
       </w:pPr>
-      <w:bookmarkStart w:id="9" w:name="_Toc241789745"/>
+      <w:bookmarkStart w:id="9" w:name="_Toc241791367"/>
       <w:r>
         <w:t>What visitors see</w:t>
       </w:r>
@@ -6288,7 +6308,7 @@
         <w:keepNext/>
         <w:keepLines/>
       </w:pPr>
-      <w:bookmarkStart w:id="10" w:name="_Toc241789746"/>
+      <w:bookmarkStart w:id="10" w:name="_Toc241791368"/>
       <w:r>
         <w:t>Rules the website follows</w:t>
       </w:r>
@@ -6351,7 +6371,7 @@
         <w:pStyle w:val="Heading1"/>
         <w:pageBreakBefore/>
       </w:pPr>
-      <w:bookmarkStart w:id="11" w:name="_Toc241789747"/>
+      <w:bookmarkStart w:id="11" w:name="_Toc241791369"/>
       <w:r>
         <w:t>5. The admin console, section by section</w:t>
       </w:r>
@@ -6371,7 +6391,7 @@
         <w:keepNext/>
         <w:keepLines/>
       </w:pPr>
-      <w:bookmarkStart w:id="12" w:name="_Toc241789748"/>
+      <w:bookmarkStart w:id="12" w:name="_Toc241791370"/>
       <w:r>
         <w:t>Clients &amp; court cases</w:t>
       </w:r>
@@ -6645,7 +6665,7 @@
         <w:keepNext/>
         <w:keepLines/>
       </w:pPr>
-      <w:bookmarkStart w:id="13" w:name="_Toc241789749"/>
+      <w:bookmarkStart w:id="13" w:name="_Toc241791371"/>
       <w:r>
         <w:t>Website</w:t>
       </w:r>
@@ -7099,7 +7119,7 @@
         <w:pStyle w:val="Heading1"/>
         <w:pageBreakBefore/>
       </w:pPr>
-      <w:bookmarkStart w:id="14" w:name="_Toc241789750"/>
+      <w:bookmarkStart w:id="14" w:name="_Toc241791372"/>
       <w:r>
         <w:t>6. Cases and the court's own record</w:t>
       </w:r>
@@ -7136,7 +7156,7 @@
         <w:keepNext/>
         <w:keepLines/>
       </w:pPr>
-      <w:bookmarkStart w:id="15" w:name="_Toc241789751"/>
+      <w:bookmarkStart w:id="15" w:name="_Toc241791373"/>
       <w:r>
         <w:t>How to add a case</w:t>
       </w:r>
@@ -7232,7 +7252,7 @@
           <w:noProof/>
         </w:rPr>
         <w:drawing>
-          <wp:inline distT="0" distB="0" distL="0" distR="0" wp14:anchorId="15FF7D0D" wp14:editId="056D22C2">
+          <wp:inline distT="0" distB="0" distL="0" distR="0" wp14:anchorId="1621DBB6" wp14:editId="2BF69735">
             <wp:extent cx="5810250" cy="2543175"/>
             <wp:effectExtent l="0" t="0" r="0" b="0"/>
             <wp:docPr id="1" name="cases-page" descr="Admin console → Cases. The New case button is at the top right." title="Admin console → Cases. The New case button is at the top right."/>
@@ -7431,7 +7451,7 @@
           <w:noProof/>
         </w:rPr>
         <w:drawing>
-          <wp:inline distT="0" distB="0" distL="0" distR="0" wp14:anchorId="46DB2772" wp14:editId="60851861">
+          <wp:inline distT="0" distB="0" distL="0" distR="0" wp14:anchorId="2E1387AC" wp14:editId="3E48ACE6">
             <wp:extent cx="4953000" cy="2219325"/>
             <wp:effectExtent l="0" t="0" r="0" b="0"/>
             <wp:docPr id="2" name="newcase-cnr" descr="The first screen of New case: type the CNR, or fill in the details by hand." title="The first screen of New case: type the CNR, or fill in the details by hand."/>
@@ -7640,7 +7660,7 @@
           <w:noProof/>
         </w:rPr>
         <w:drawing>
-          <wp:inline distT="0" distB="0" distL="0" distR="0" wp14:anchorId="6D052484" wp14:editId="7956CFA4">
+          <wp:inline distT="0" distB="0" distL="0" distR="0" wp14:anchorId="051DBE1D" wp14:editId="611307BE">
             <wp:extent cx="4095750" cy="6324600"/>
             <wp:effectExtent l="0" t="0" r="0" b="0"/>
             <wp:docPr id="3" name="newcase-manual-top" descr="Filling in a case by hand: the case, the court, the parties, the law." title="Filling in a case by hand: the case, the court, the parties, the law."/>
@@ -7817,7 +7837,7 @@
           <w:noProof/>
         </w:rPr>
         <w:drawing>
-          <wp:inline distT="0" distB="0" distL="0" distR="0" wp14:anchorId="1268B1CE" wp14:editId="5579DC9D">
+          <wp:inline distT="0" distB="0" distL="0" distR="0" wp14:anchorId="321D007B" wp14:editId="1DA83D36">
             <wp:extent cx="4095750" cy="6324600"/>
             <wp:effectExtent l="0" t="0" r="0" b="0"/>
             <wp:docPr id="4" name="newcase-manual-team" descr="The end of the New case window: lawyers, client account, Create case." title="The end of the New case window: lawyers, client account, Create case."/>
@@ -7878,7 +7898,7 @@
         <w:keepNext/>
         <w:keepLines/>
       </w:pPr>
-      <w:bookmarkStart w:id="16" w:name="_Toc241789752"/>
+      <w:bookmarkStart w:id="16" w:name="_Toc241791374"/>
       <w:r>
         <w:t>How to add a client</w:t>
       </w:r>
@@ -8143,7 +8163,7 @@
           <w:noProof/>
         </w:rPr>
         <w:drawing>
-          <wp:inline distT="0" distB="0" distL="0" distR="0" wp14:anchorId="3F115664" wp14:editId="172C0EA0">
+          <wp:inline distT="0" distB="0" distL="0" distR="0" wp14:anchorId="5A4101E1" wp14:editId="0AF1F699">
             <wp:extent cx="3619500" cy="3533775"/>
             <wp:effectExtent l="0" t="0" r="0" b="0"/>
             <wp:docPr id="5" name="clients-add" descr="Add a client: an individual." title="Add a client: an individual."/>
@@ -8209,7 +8229,7 @@
           <w:noProof/>
         </w:rPr>
         <w:drawing>
-          <wp:inline distT="0" distB="0" distL="0" distR="0" wp14:anchorId="1039D0DE" wp14:editId="150E85BB">
+          <wp:inline distT="0" distB="0" distL="0" distR="0" wp14:anchorId="7F8E0799" wp14:editId="06C66562">
             <wp:extent cx="3619500" cy="4791075"/>
             <wp:effectExtent l="0" t="0" r="0" b="0"/>
             <wp:docPr id="6" name="clients-add-org" descr="Add a client: an organisation, with its contact person and office address." title="Add a client: an organisation, with its contact person and office address."/>
@@ -8278,26 +8298,6 @@
           <w:b/>
           <w:bCs/>
         </w:rPr>
-        <w:t>Clients can also sign themselves up.</w:t>
-      </w:r>
-      <w:r>
-        <w:t xml:space="preserve"> Anyone who signs in at the website's Login with a new mobile number or Google account gets a client account. They then appear in Clients, and you link their case to them.</w:t>
-      </w:r>
-    </w:p>
-    <w:p>
-      <w:pPr>
-        <w:pStyle w:val="ListParagraph"/>
-        <w:numPr>
-          <w:ilvl w:val="0"/>
-          <w:numId w:val="2"/>
-        </w:numPr>
-        <w:spacing w:after="80" w:line="290" w:lineRule="auto"/>
-      </w:pPr>
-      <w:r>
-        <w:rPr>
-          <w:b/>
-          <w:bCs/>
-        </w:rPr>
         <w:t>Changing a client later:</w:t>
       </w:r>
       <w:r>
@@ -8330,7 +8330,7 @@
         <w:keepNext/>
         <w:keepLines/>
       </w:pPr>
-      <w:bookmarkStart w:id="17" w:name="_Toc241789753"/>
+      <w:bookmarkStart w:id="17" w:name="_Toc241791375"/>
       <w:r>
         <w:t>How to add a lawyer (or anyone at the firm)</w:t>
       </w:r>
@@ -8569,7 +8569,7 @@
           <w:noProof/>
         </w:rPr>
         <w:drawing>
-          <wp:inline distT="0" distB="0" distL="0" distR="0" wp14:anchorId="692D096F" wp14:editId="7FCFD17E">
+          <wp:inline distT="0" distB="0" distL="0" distR="0" wp14:anchorId="042C0A31" wp14:editId="288FA603">
             <wp:extent cx="4953000" cy="3790950"/>
             <wp:effectExtent l="0" t="0" r="0" b="0"/>
             <wp:docPr id="7" name="staff-add" descr="Add a person: who they are, how they sign in, and what they may open." title="Add a person: who they are, how they sign in, and what they may open."/>
@@ -9037,7 +9037,7 @@
         <w:keepNext/>
         <w:keepLines/>
       </w:pPr>
-      <w:bookmarkStart w:id="18" w:name="_Toc241789754"/>
+      <w:bookmarkStart w:id="18" w:name="_Toc241791376"/>
       <w:r>
         <w:t>How to link lawyers and clients to a case</w:t>
       </w:r>
@@ -9258,7 +9258,7 @@
           <w:noProof/>
         </w:rPr>
         <w:drawing>
-          <wp:inline distT="0" distB="0" distL="0" distR="0" wp14:anchorId="62A4DDBC" wp14:editId="69DB6503">
+          <wp:inline distT="0" distB="0" distL="0" distR="0" wp14:anchorId="29E07B03" wp14:editId="23DBE53A">
             <wp:extent cx="3238500" cy="3400425"/>
             <wp:effectExtent l="0" t="0" r="0" b="0"/>
             <wp:docPr id="8" name="case-lawyers" descr="Lawyers on this case, after clicking Change." title="Lawyers on this case, after clicking Change."/>
@@ -9324,7 +9324,7 @@
           <w:noProof/>
         </w:rPr>
         <w:drawing>
-          <wp:inline distT="0" distB="0" distL="0" distR="0" wp14:anchorId="20BF1DA0" wp14:editId="5EE04E6D">
+          <wp:inline distT="0" distB="0" distL="0" distR="0" wp14:anchorId="45F5B252" wp14:editId="7DC6BBDE">
             <wp:extent cx="3238500" cy="2667000"/>
             <wp:effectExtent l="0" t="0" r="0" b="0"/>
             <wp:docPr id="9" name="case-clients" descr="Client accounts, after clicking Change." title="Client accounts, after clicking Change."/>
@@ -9669,7 +9669,7 @@
         <w:keepNext/>
         <w:keepLines/>
       </w:pPr>
-      <w:bookmarkStart w:id="19" w:name="_Toc241789755"/>
+      <w:bookmarkStart w:id="19" w:name="_Toc241791377"/>
       <w:r>
         <w:t>Checking who has access</w:t>
       </w:r>
@@ -9704,7 +9704,7 @@
           <w:noProof/>
         </w:rPr>
         <w:drawing>
-          <wp:inline distT="0" distB="0" distL="0" distR="0" wp14:anchorId="5E2D9A7D" wp14:editId="168CA706">
+          <wp:inline distT="0" distB="0" distL="0" distR="0" wp14:anchorId="4C2229CF" wp14:editId="55AAD545">
             <wp:extent cx="5334000" cy="2686050"/>
             <wp:effectExtent l="0" t="0" r="0" b="0"/>
             <wp:docPr id="10" name="who-can-sign-in" descr="The Who can sign in panel at the top of Team (Lawyers)." title="The Who can sign in panel at the top of Team (Lawyers)."/>
@@ -9855,7 +9855,7 @@
         <w:keepNext/>
         <w:keepLines/>
       </w:pPr>
-      <w:bookmarkStart w:id="20" w:name="_Toc241789756"/>
+      <w:bookmarkStart w:id="20" w:name="_Toc241791378"/>
       <w:r>
         <w:t>Updating a case from the court</w:t>
       </w:r>
@@ -9965,7 +9965,7 @@
         <w:keepNext/>
         <w:keepLines/>
       </w:pPr>
-      <w:bookmarkStart w:id="21" w:name="_Toc241789757"/>
+      <w:bookmarkStart w:id="21" w:name="_Toc241791379"/>
       <w:r>
         <w:t>Things worth knowing</w:t>
       </w:r>
@@ -10076,7 +10076,7 @@
         <w:pStyle w:val="Heading1"/>
         <w:pageBreakBefore/>
       </w:pPr>
-      <w:bookmarkStart w:id="22" w:name="_Toc241789758"/>
+      <w:bookmarkStart w:id="22" w:name="_Toc241791380"/>
       <w:r>
         <w:t>7. Documents</w:t>
       </w:r>
@@ -10088,7 +10088,7 @@
         <w:keepNext/>
         <w:keepLines/>
       </w:pPr>
-      <w:bookmarkStart w:id="23" w:name="_Toc241789759"/>
+      <w:bookmarkStart w:id="23" w:name="_Toc241791381"/>
       <w:r>
         <w:t>Folders</w:t>
       </w:r>
@@ -10538,7 +10538,7 @@
         <w:keepNext/>
         <w:keepLines/>
       </w:pPr>
-      <w:bookmarkStart w:id="24" w:name="_Toc241789760"/>
+      <w:bookmarkStart w:id="24" w:name="_Toc241791382"/>
       <w:r>
         <w:t>Safety</w:t>
       </w:r>
@@ -10588,7 +10588,7 @@
         <w:pStyle w:val="Heading1"/>
         <w:pageBreakBefore/>
       </w:pPr>
-      <w:bookmarkStart w:id="25" w:name="_Toc241789761"/>
+      <w:bookmarkStart w:id="25" w:name="_Toc241791383"/>
       <w:r>
         <w:t>8. The lawyer workspace</w:t>
       </w:r>
@@ -10704,7 +10704,7 @@
         <w:pStyle w:val="Heading1"/>
         <w:pageBreakBefore/>
       </w:pPr>
-      <w:bookmarkStart w:id="26" w:name="_Toc241789762"/>
+      <w:bookmarkStart w:id="26" w:name="_Toc241791384"/>
       <w:r>
         <w:t>9. The client dashboard</w:t>
       </w:r>
@@ -10804,7 +10804,7 @@
         <w:keepNext/>
         <w:keepLines/>
       </w:pPr>
-      <w:bookmarkStart w:id="27" w:name="_Toc241789763"/>
+      <w:bookmarkStart w:id="27" w:name="_Toc241791385"/>
       <w:r>
         <w:t>What a client cannot do</w:t>
       </w:r>
@@ -10863,7 +10863,7 @@
         <w:keepNext/>
         <w:keepLines/>
       </w:pPr>
-      <w:bookmarkStart w:id="28" w:name="_Toc241789764"/>
+      <w:bookmarkStart w:id="28" w:name="_Toc241791386"/>
       <w:r>
         <w:t>On phones</w:t>
       </w:r>
@@ -10882,7 +10882,7 @@
         <w:pStyle w:val="Heading1"/>
         <w:pageBreakBefore/>
       </w:pPr>
-      <w:bookmarkStart w:id="29" w:name="_Toc241789765"/>
+      <w:bookmarkStart w:id="29" w:name="_Toc241791387"/>
       <w:r>
         <w:t>10. Articles and AI</w:t>
       </w:r>
@@ -10894,7 +10894,7 @@
         <w:keepNext/>
         <w:keepLines/>
       </w:pPr>
-      <w:bookmarkStart w:id="30" w:name="_Toc241789766"/>
+      <w:bookmarkStart w:id="30" w:name="_Toc241791388"/>
       <w:r>
         <w:t>Finding topics: trending leads</w:t>
       </w:r>
@@ -10914,7 +10914,7 @@
         <w:keepNext/>
         <w:keepLines/>
       </w:pPr>
-      <w:bookmarkStart w:id="31" w:name="_Toc241789767"/>
+      <w:bookmarkStart w:id="31" w:name="_Toc241791389"/>
       <w:r>
         <w:t>Drafts</w:t>
       </w:r>
@@ -10999,7 +10999,7 @@
         <w:keepNext/>
         <w:keepLines/>
       </w:pPr>
-      <w:bookmarkStart w:id="32" w:name="_Toc241789768"/>
+      <w:bookmarkStart w:id="32" w:name="_Toc241791390"/>
       <w:r>
         <w:t>Cover images</w:t>
       </w:r>
@@ -11102,7 +11102,7 @@
         <w:pStyle w:val="Heading1"/>
         <w:pageBreakBefore/>
       </w:pPr>
-      <w:bookmarkStart w:id="33" w:name="_Toc241789769"/>
+      <w:bookmarkStart w:id="33" w:name="_Toc241791391"/>
       <w:r>
         <w:t>11. What it costs to run</w:t>
       </w:r>
@@ -12172,7 +12172,7 @@
         <w:pStyle w:val="Heading1"/>
         <w:pageBreakBefore/>
       </w:pPr>
-      <w:bookmarkStart w:id="34" w:name="_Toc241789770"/>
+      <w:bookmarkStart w:id="34" w:name="_Toc241791392"/>
       <w:r>
         <w:t>12. Behind the scenes, in plain terms</w:t>
       </w:r>
@@ -12184,7 +12184,7 @@
         <w:keepNext/>
         <w:keepLines/>
       </w:pPr>
-      <w:bookmarkStart w:id="35" w:name="_Toc241789771"/>
+      <w:bookmarkStart w:id="35" w:name="_Toc241791393"/>
       <w:r>
         <w:t>What happens when someone presses a button</w:t>
       </w:r>
@@ -12248,7 +12248,7 @@
         <w:keepNext/>
         <w:keepLines/>
       </w:pPr>
-      <w:bookmarkStart w:id="36" w:name="_Toc241789772"/>
+      <w:bookmarkStart w:id="36" w:name="_Toc241791394"/>
       <w:r>
         <w:t>Jobs that run by themselves</w:t>
       </w:r>
@@ -12484,7 +12484,7 @@
         <w:keepNext/>
         <w:keepLines/>
       </w:pPr>
-      <w:bookmarkStart w:id="37" w:name="_Toc241789773"/>
+      <w:bookmarkStart w:id="37" w:name="_Toc241791395"/>
       <w:r>
         <w:t>Settings that change behaviour</w:t>
       </w:r>
@@ -12678,7 +12678,7 @@
               <w:spacing w:after="40" w:line="270" w:lineRule="auto"/>
             </w:pPr>
             <w:r>
-              <w:t>ALLOW_CLIENT_SIGNUP</w:t>
+              <w:t>ECOURTS_BACKUP</w:t>
             </w:r>
           </w:p>
         </w:tc>
@@ -12703,7 +12703,7 @@
               <w:spacing w:after="40" w:line="270" w:lineRule="auto"/>
             </w:pPr>
             <w:r>
-              <w:t>Whether new clients can create their own account by signing in.</w:t>
+              <w:t>Whether the paid eCourtsIndia backup is offered to staff (true / false).</w:t>
             </w:r>
           </w:p>
         </w:tc>
@@ -12736,7 +12736,7 @@
               <w:spacing w:after="40" w:line="270" w:lineRule="auto"/>
             </w:pPr>
             <w:r>
-              <w:t>ECOURTS_BACKUP</w:t>
+              <w:t>GEMINI_API_KEY, GEMINI_MODEL</w:t>
             </w:r>
           </w:p>
         </w:tc>
@@ -12761,7 +12761,7 @@
               <w:spacing w:after="40" w:line="270" w:lineRule="auto"/>
             </w:pPr>
             <w:r>
-              <w:t>Whether the paid eCourtsIndia backup is offered to staff (true / false).</w:t>
+              <w:t>The Google AI key and model used for article drafts.</w:t>
             </w:r>
           </w:p>
         </w:tc>
@@ -12794,7 +12794,7 @@
               <w:spacing w:after="40" w:line="270" w:lineRule="auto"/>
             </w:pPr>
             <w:r>
-              <w:t>GEMINI_API_KEY, GEMINI_MODEL</w:t>
+              <w:t>GEMINI_IMAGE_MODEL</w:t>
             </w:r>
           </w:p>
         </w:tc>
@@ -12819,7 +12819,7 @@
               <w:spacing w:after="40" w:line="270" w:lineRule="auto"/>
             </w:pPr>
             <w:r>
-              <w:t>The Google AI key and model used for article drafts.</w:t>
+              <w:t>The model used for cover images (default: the cheapest, about $0.034 each).</w:t>
             </w:r>
           </w:p>
         </w:tc>
@@ -12852,64 +12852,6 @@
               <w:spacing w:after="40" w:line="270" w:lineRule="auto"/>
             </w:pPr>
             <w:r>
-              <w:t>GEMINI_IMAGE_MODEL</w:t>
-            </w:r>
-          </w:p>
-        </w:tc>
-        <w:tc>
-          <w:tcPr>
-            <w:tcW w:w="6514" w:type="dxa"/>
-            <w:tcBorders>
-              <w:top w:val="single" w:sz="4" w:space="0" w:color="D5D9E0"/>
-              <w:left w:val="single" w:sz="4" w:space="0" w:color="D5D9E0"/>
-              <w:bottom w:val="single" w:sz="4" w:space="0" w:color="D5D9E0"/>
-              <w:right w:val="single" w:sz="4" w:space="0" w:color="D5D9E0"/>
-            </w:tcBorders>
-            <w:tcMar>
-              <w:top w:w="80" w:type="dxa"/>
-              <w:left w:w="120" w:type="dxa"/>
-              <w:bottom w:w="80" w:type="dxa"/>
-              <w:right w:w="120" w:type="dxa"/>
-            </w:tcMar>
-          </w:tcPr>
-          <w:p>
-            <w:pPr>
-              <w:spacing w:after="40" w:line="270" w:lineRule="auto"/>
-            </w:pPr>
-            <w:r>
-              <w:t>The model used for cover images (default: the cheapest, about $0.034 each).</w:t>
-            </w:r>
-          </w:p>
-        </w:tc>
-      </w:tr>
-      <w:tr>
-        <w:tblPrEx>
-          <w:tblCellMar>
-            <w:top w:w="0" w:type="dxa"/>
-            <w:bottom w:w="0" w:type="dxa"/>
-          </w:tblCellMar>
-        </w:tblPrEx>
-        <w:tc>
-          <w:tcPr>
-            <w:tcW w:w="2792" w:type="dxa"/>
-            <w:tcBorders>
-              <w:top w:val="single" w:sz="4" w:space="0" w:color="D5D9E0"/>
-              <w:left w:val="single" w:sz="4" w:space="0" w:color="D5D9E0"/>
-              <w:bottom w:val="single" w:sz="4" w:space="0" w:color="D5D9E0"/>
-              <w:right w:val="single" w:sz="4" w:space="0" w:color="D5D9E0"/>
-            </w:tcBorders>
-            <w:tcMar>
-              <w:top w:w="80" w:type="dxa"/>
-              <w:left w:w="120" w:type="dxa"/>
-              <w:bottom w:w="80" w:type="dxa"/>
-              <w:right w:w="120" w:type="dxa"/>
-            </w:tcMar>
-          </w:tcPr>
-          <w:p>
-            <w:pPr>
-              <w:spacing w:after="40" w:line="270" w:lineRule="auto"/>
-            </w:pPr>
-            <w:r>
               <w:t>JOBS_ENABLED</w:t>
             </w:r>
           </w:p>
@@ -12969,7 +12911,7 @@
         <w:keepNext/>
         <w:keepLines/>
       </w:pPr>
-      <w:bookmarkStart w:id="38" w:name="_Toc241789774"/>
+      <w:bookmarkStart w:id="38" w:name="_Toc241791396"/>
       <w:r>
         <w:t>Safeguards</w:t>
       </w:r>
@@ -13045,7 +12987,7 @@
         <w:pStyle w:val="Heading1"/>
         <w:pageBreakBefore/>
       </w:pPr>
-      <w:bookmarkStart w:id="39" w:name="_Toc241789775"/>
+      <w:bookmarkStart w:id="39" w:name="_Toc241791397"/>
       <w:r>
         <w:t>13. Where things are kept in the project</w:t>
       </w:r>
@@ -13513,7 +13455,7 @@
         <w:keepNext/>
         <w:keepLines/>
       </w:pPr>
-      <w:bookmarkStart w:id="40" w:name="_Toc241789776"/>
+      <w:bookmarkStart w:id="40" w:name="_Toc241791398"/>
       <w:r>
         <w:t>How changes are published</w:t>
       </w:r>
@@ -13563,7 +13505,7 @@
         <w:pStyle w:val="Heading1"/>
         <w:pageBreakBefore/>
       </w:pPr>
-      <w:bookmarkStart w:id="41" w:name="_Toc241789777"/>
+      <w:bookmarkStart w:id="41" w:name="_Toc241791399"/>
       <w:r>
         <w:t>14. Current limits and next steps</w:t>
       </w:r>
@@ -13654,7 +13596,7 @@
         <w:pStyle w:val="Heading1"/>
         <w:pageBreakBefore/>
       </w:pPr>
-      <w:bookmarkStart w:id="42" w:name="_Toc241789778"/>
+      <w:bookmarkStart w:id="42" w:name="_Toc241791400"/>
       <w:r>
         <w:t>15. Glossary</w:t>
       </w:r>
@@ -14466,10 +14408,10 @@
 <file path=word/numbering.xml><?xml version="1.0" encoding="utf-8"?>
 <w:numbering xmlns:wpc="http://schemas.microsoft.com/office/word/2010/wordprocessingCanvas" xmlns:cx="http://schemas.microsoft.com/office/drawing/2014/chartex" xmlns:cx1="http://schemas.microsoft.com/office/drawing/2015/9/8/chartex" xmlns:cx2="http://schemas.microsoft.com/office/drawing/2015/10/21/chartex" xmlns:cx3="http://schemas.microsoft.com/office/drawing/2016/5/9/chartex" xmlns:cx4="http://schemas.microsoft.com/office/drawing/2016/5/10/chartex" xmlns:cx5="http://schemas.microsoft.com/office/drawing/2016/5/11/chartex" xmlns:cx6="http://schemas.microsoft.com/office/drawing/2016/5/12/chartex" xmlns:cx7="http://schemas.microsoft.com/office/drawing/2016/5/13/chartex" xmlns:cx8="http://schemas.microsoft.com/office/drawing/2016/5/14/chartex" xmlns:mc="http://schemas.openxmlformats.org/markup-compatibility/2006" xmlns:aink="http://schemas.microsoft.com/office/drawing/2016/ink" xmlns:am3d="http://schemas.microsoft.com/office/drawing/2017/model3d" xmlns:o="urn:schemas-microsoft-com:office:office" xmlns:oel="http://schemas.microsoft.com/office/2019/extlst" xmlns:r="http://schemas.openxmlformats.org/officeDocument/2006/relationships" xmlns:m="http://schemas.openxmlformats.org/officeDocument/2006/math" xmlns:v="urn:schemas-microsoft-com:vml" xmlns:wp14="http://schemas.microsoft.com/office/word/2010/wordprocessingDrawing" xmlns:wp="http://schemas.openxmlformats.org/drawingml/2006/wordprocessingDrawing" xmlns:w10="urn:schemas-microsoft-com:office:word" xmlns:w="http://schemas.openxmlformats.org/wordprocessingml/2006/main" xmlns:w14="http://schemas.microsoft.com/office/word/2010/wordml" xmlns:w15="http://schemas.microsoft.com/office/word/2012/wordml" xmlns:w16cex="http://schemas.microsoft.com/office/word/2018/wordml/cex" xmlns:w16cid="http://schemas.microsoft.com/office/word/2016/wordml/cid" xmlns:w16="http://schemas.microsoft.com/office/word/2018/wordml" xmlns:w16du="http://schemas.microsoft.com/office/word/2023/wordml/word16du" xmlns:w16sdtdh="http://schemas.microsoft.com/office/word/2020/wordml/sdtdatahash" xmlns:w16sdtfl="http://schemas.microsoft.com/office/word/2024/wordml/sdtformatlock" xmlns:w16se="http://schemas.microsoft.com/office/word/2015/wordml/symex" xmlns:wpg="http://schemas.microsoft.com/office/word/2010/wordprocessingGroup" xmlns:wpi="http://schemas.microsoft.com/office/word/2010/wordprocessingInk" xmlns:wne="http://schemas.microsoft.com/office/word/2006/wordml" xmlns:wps="http://schemas.microsoft.com/office/word/2010/wordprocessingShape" mc:Ignorable="w14 w15 w16se w16cid w16 w16cex w16sdtdh w16sdtfl w16du wp14">
   <w:abstractNum w:abstractNumId="0" w15:restartNumberingAfterBreak="0">
-    <w:nsid w:val="093023CF"/>
+    <w:nsid w:val="13705523"/>
     <w:multiLevelType w:val="hybridMultilevel"/>
-    <w:tmpl w:val="D3120C14"/>
-    <w:lvl w:ilvl="0" w:tplc="CF14BA8A">
+    <w:tmpl w:val="AB9C1942"/>
+    <w:lvl w:ilvl="0" w:tplc="3B60426C">
       <w:start w:val="1"/>
       <w:numFmt w:val="decimal"/>
       <w:lvlText w:val="%1."/>
@@ -14478,52 +14420,52 @@
         <w:ind w:left="540" w:hanging="300"/>
       </w:pPr>
     </w:lvl>
-    <w:lvl w:ilvl="1" w:tplc="D64CD8D2">
+    <w:lvl w:ilvl="1" w:tplc="825A1EFC">
       <w:numFmt w:val="decimal"/>
       <w:lvlText w:val=""/>
       <w:lvlJc w:val="left"/>
     </w:lvl>
-    <w:lvl w:ilvl="2" w:tplc="AC42D3AE">
+    <w:lvl w:ilvl="2" w:tplc="EED28290">
       <w:numFmt w:val="decimal"/>
       <w:lvlText w:val=""/>
       <w:lvlJc w:val="left"/>
     </w:lvl>
-    <w:lvl w:ilvl="3" w:tplc="7A36EF50">
+    <w:lvl w:ilvl="3" w:tplc="5016F300">
       <w:numFmt w:val="decimal"/>
       <w:lvlText w:val=""/>
       <w:lvlJc w:val="left"/>
     </w:lvl>
-    <w:lvl w:ilvl="4" w:tplc="983A5006">
+    <w:lvl w:ilvl="4" w:tplc="EBBC34B6">
       <w:numFmt w:val="decimal"/>
       <w:lvlText w:val=""/>
       <w:lvlJc w:val="left"/>
     </w:lvl>
-    <w:lvl w:ilvl="5" w:tplc="607AC160">
+    <w:lvl w:ilvl="5" w:tplc="A90CDD22">
       <w:numFmt w:val="decimal"/>
       <w:lvlText w:val=""/>
       <w:lvlJc w:val="left"/>
     </w:lvl>
-    <w:lvl w:ilvl="6" w:tplc="0D3628C4">
+    <w:lvl w:ilvl="6" w:tplc="E3329240">
       <w:numFmt w:val="decimal"/>
       <w:lvlText w:val=""/>
       <w:lvlJc w:val="left"/>
     </w:lvl>
-    <w:lvl w:ilvl="7" w:tplc="311E9772">
+    <w:lvl w:ilvl="7" w:tplc="38EC0688">
       <w:numFmt w:val="decimal"/>
       <w:lvlText w:val=""/>
       <w:lvlJc w:val="left"/>
     </w:lvl>
-    <w:lvl w:ilvl="8" w:tplc="56F2D7F0">
+    <w:lvl w:ilvl="8" w:tplc="F0381B12">
       <w:numFmt w:val="decimal"/>
       <w:lvlText w:val=""/>
       <w:lvlJc w:val="left"/>
     </w:lvl>
   </w:abstractNum>
   <w:abstractNum w:abstractNumId="1" w15:restartNumberingAfterBreak="0">
-    <w:nsid w:val="23355D28"/>
+    <w:nsid w:val="15CF4EB2"/>
     <w:multiLevelType w:val="hybridMultilevel"/>
-    <w:tmpl w:val="17E867C2"/>
-    <w:lvl w:ilvl="0" w:tplc="D4CC283C">
+    <w:tmpl w:val="A292543C"/>
+    <w:lvl w:ilvl="0" w:tplc="F4C4A068">
       <w:start w:val="1"/>
       <w:numFmt w:val="decimal"/>
       <w:lvlText w:val="%1."/>
@@ -14532,52 +14474,52 @@
         <w:ind w:left="540" w:hanging="300"/>
       </w:pPr>
     </w:lvl>
-    <w:lvl w:ilvl="1" w:tplc="EABCE5B0">
+    <w:lvl w:ilvl="1" w:tplc="2A543E66">
       <w:numFmt w:val="decimal"/>
       <w:lvlText w:val=""/>
       <w:lvlJc w:val="left"/>
     </w:lvl>
-    <w:lvl w:ilvl="2" w:tplc="1C623D8C">
+    <w:lvl w:ilvl="2" w:tplc="5DF26D72">
       <w:numFmt w:val="decimal"/>
       <w:lvlText w:val=""/>
       <w:lvlJc w:val="left"/>
     </w:lvl>
-    <w:lvl w:ilvl="3" w:tplc="751E6CF2">
+    <w:lvl w:ilvl="3" w:tplc="2F0C5CDA">
       <w:numFmt w:val="decimal"/>
       <w:lvlText w:val=""/>
       <w:lvlJc w:val="left"/>
     </w:lvl>
-    <w:lvl w:ilvl="4" w:tplc="D7EC2F56">
+    <w:lvl w:ilvl="4" w:tplc="9AE4BA44">
       <w:numFmt w:val="decimal"/>
       <w:lvlText w:val=""/>
       <w:lvlJc w:val="left"/>
     </w:lvl>
-    <w:lvl w:ilvl="5" w:tplc="41A23D7E">
+    <w:lvl w:ilvl="5" w:tplc="6840CE2C">
       <w:numFmt w:val="decimal"/>
       <w:lvlText w:val=""/>
       <w:lvlJc w:val="left"/>
     </w:lvl>
-    <w:lvl w:ilvl="6" w:tplc="65667266">
+    <w:lvl w:ilvl="6" w:tplc="18086B16">
       <w:numFmt w:val="decimal"/>
       <w:lvlText w:val=""/>
       <w:lvlJc w:val="left"/>
     </w:lvl>
-    <w:lvl w:ilvl="7" w:tplc="29F29D9E">
+    <w:lvl w:ilvl="7" w:tplc="96C81796">
       <w:numFmt w:val="decimal"/>
       <w:lvlText w:val=""/>
       <w:lvlJc w:val="left"/>
     </w:lvl>
-    <w:lvl w:ilvl="8" w:tplc="3B2A1BEA">
+    <w:lvl w:ilvl="8" w:tplc="18A01CC2">
       <w:numFmt w:val="decimal"/>
       <w:lvlText w:val=""/>
       <w:lvlJc w:val="left"/>
     </w:lvl>
   </w:abstractNum>
   <w:abstractNum w:abstractNumId="2" w15:restartNumberingAfterBreak="0">
-    <w:nsid w:val="52B657D9"/>
+    <w:nsid w:val="1C826476"/>
     <w:multiLevelType w:val="hybridMultilevel"/>
-    <w:tmpl w:val="F4B42F62"/>
-    <w:lvl w:ilvl="0" w:tplc="4B14AC3E">
+    <w:tmpl w:val="9F6C9D82"/>
+    <w:lvl w:ilvl="0" w:tplc="1784659E">
       <w:start w:val="1"/>
       <w:numFmt w:val="decimal"/>
       <w:lvlText w:val="%1."/>
@@ -14586,110 +14528,106 @@
         <w:ind w:left="540" w:hanging="300"/>
       </w:pPr>
     </w:lvl>
-    <w:lvl w:ilvl="1" w:tplc="6CB8702A">
+    <w:lvl w:ilvl="1" w:tplc="DA28DB44">
       <w:numFmt w:val="decimal"/>
       <w:lvlText w:val=""/>
       <w:lvlJc w:val="left"/>
     </w:lvl>
-    <w:lvl w:ilvl="2" w:tplc="9A762894">
+    <w:lvl w:ilvl="2" w:tplc="43A80EC0">
       <w:numFmt w:val="decimal"/>
       <w:lvlText w:val=""/>
       <w:lvlJc w:val="left"/>
     </w:lvl>
-    <w:lvl w:ilvl="3" w:tplc="0F50B4FE">
+    <w:lvl w:ilvl="3" w:tplc="44F62420">
       <w:numFmt w:val="decimal"/>
       <w:lvlText w:val=""/>
       <w:lvlJc w:val="left"/>
     </w:lvl>
-    <w:lvl w:ilvl="4" w:tplc="2BE8CA14">
+    <w:lvl w:ilvl="4" w:tplc="4AD2D2AA">
       <w:numFmt w:val="decimal"/>
       <w:lvlText w:val=""/>
       <w:lvlJc w:val="left"/>
     </w:lvl>
-    <w:lvl w:ilvl="5" w:tplc="0B982240">
+    <w:lvl w:ilvl="5" w:tplc="771E23EC">
       <w:numFmt w:val="decimal"/>
       <w:lvlText w:val=""/>
       <w:lvlJc w:val="left"/>
     </w:lvl>
-    <w:lvl w:ilvl="6" w:tplc="6AA6D338">
+    <w:lvl w:ilvl="6" w:tplc="7F88F12A">
       <w:numFmt w:val="decimal"/>
       <w:lvlText w:val=""/>
       <w:lvlJc w:val="left"/>
     </w:lvl>
-    <w:lvl w:ilvl="7" w:tplc="933CC952">
+    <w:lvl w:ilvl="7" w:tplc="7B480398">
       <w:numFmt w:val="decimal"/>
       <w:lvlText w:val=""/>
       <w:lvlJc w:val="left"/>
     </w:lvl>
-    <w:lvl w:ilvl="8" w:tplc="EE42F03A">
+    <w:lvl w:ilvl="8" w:tplc="3BCA3F4A">
       <w:numFmt w:val="decimal"/>
       <w:lvlText w:val=""/>
       <w:lvlJc w:val="left"/>
     </w:lvl>
   </w:abstractNum>
   <w:abstractNum w:abstractNumId="3" w15:restartNumberingAfterBreak="0">
-    <w:nsid w:val="59C9345D"/>
+    <w:nsid w:val="1E794D63"/>
     <w:multiLevelType w:val="hybridMultilevel"/>
-    <w:tmpl w:val="35D0E03E"/>
-    <w:lvl w:ilvl="0" w:tplc="4DD2E976">
+    <w:tmpl w:val="44EEBAEA"/>
+    <w:lvl w:ilvl="0" w:tplc="13EE0AF8">
       <w:start w:val="1"/>
-      <w:numFmt w:val="bullet"/>
-      <w:lvlText w:val="•"/>
+      <w:numFmt w:val="decimal"/>
+      <w:lvlText w:val="%1."/>
       <w:lvlJc w:val="left"/>
       <w:pPr>
         <w:ind w:left="540" w:hanging="300"/>
       </w:pPr>
     </w:lvl>
-    <w:lvl w:ilvl="1" w:tplc="FE3AB3D0">
-      <w:start w:val="1"/>
-      <w:numFmt w:val="bullet"/>
-      <w:lvlText w:val="–"/>
-      <w:lvlJc w:val="left"/>
-      <w:pPr>
-        <w:ind w:left="1000" w:hanging="300"/>
-      </w:pPr>
-    </w:lvl>
-    <w:lvl w:ilvl="2" w:tplc="C2ACB2CE">
+    <w:lvl w:ilvl="1" w:tplc="11C058D2">
       <w:numFmt w:val="decimal"/>
       <w:lvlText w:val=""/>
       <w:lvlJc w:val="left"/>
     </w:lvl>
-    <w:lvl w:ilvl="3" w:tplc="371481F0">
+    <w:lvl w:ilvl="2" w:tplc="EF6CA090">
       <w:numFmt w:val="decimal"/>
       <w:lvlText w:val=""/>
       <w:lvlJc w:val="left"/>
     </w:lvl>
-    <w:lvl w:ilvl="4" w:tplc="3DD4810A">
+    <w:lvl w:ilvl="3" w:tplc="4D4CC370">
       <w:numFmt w:val="decimal"/>
       <w:lvlText w:val=""/>
       <w:lvlJc w:val="left"/>
     </w:lvl>
-    <w:lvl w:ilvl="5" w:tplc="E986534A">
+    <w:lvl w:ilvl="4" w:tplc="1688E21C">
       <w:numFmt w:val="decimal"/>
       <w:lvlText w:val=""/>
       <w:lvlJc w:val="left"/>
     </w:lvl>
-    <w:lvl w:ilvl="6" w:tplc="C3F2AC0C">
+    <w:lvl w:ilvl="5" w:tplc="FA70290E">
       <w:numFmt w:val="decimal"/>
       <w:lvlText w:val=""/>
       <w:lvlJc w:val="left"/>
     </w:lvl>
-    <w:lvl w:ilvl="7" w:tplc="F1C0168A">
+    <w:lvl w:ilvl="6" w:tplc="74E626FC">
       <w:numFmt w:val="decimal"/>
       <w:lvlText w:val=""/>
       <w:lvlJc w:val="left"/>
     </w:lvl>
-    <w:lvl w:ilvl="8" w:tplc="EEB41CE2">
+    <w:lvl w:ilvl="7" w:tplc="163690BC">
+      <w:numFmt w:val="decimal"/>
+      <w:lvlText w:val=""/>
+      <w:lvlJc w:val="left"/>
+    </w:lvl>
+    <w:lvl w:ilvl="8" w:tplc="FB6046D4">
       <w:numFmt w:val="decimal"/>
       <w:lvlText w:val=""/>
       <w:lvlJc w:val="left"/>
     </w:lvl>
   </w:abstractNum>
   <w:abstractNum w:abstractNumId="4" w15:restartNumberingAfterBreak="0">
-    <w:nsid w:val="5EE719E7"/>
+    <w:nsid w:val="33933B68"/>
     <w:multiLevelType w:val="hybridMultilevel"/>
-    <w:tmpl w:val="D5DA8C9A"/>
-    <w:lvl w:ilvl="0" w:tplc="9A1CD200">
+    <w:tmpl w:val="A7AAAF26"/>
+    <w:lvl w:ilvl="0" w:tplc="E5B0493E">
       <w:start w:val="1"/>
       <w:numFmt w:val="decimal"/>
       <w:lvlText w:val="%1."/>
@@ -14698,138 +14636,110 @@
         <w:ind w:left="540" w:hanging="300"/>
       </w:pPr>
     </w:lvl>
-    <w:lvl w:ilvl="1" w:tplc="F5B4B3FC">
+    <w:lvl w:ilvl="1" w:tplc="37DC7932">
       <w:numFmt w:val="decimal"/>
       <w:lvlText w:val=""/>
       <w:lvlJc w:val="left"/>
     </w:lvl>
-    <w:lvl w:ilvl="2" w:tplc="4D287D62">
+    <w:lvl w:ilvl="2" w:tplc="023633AE">
       <w:numFmt w:val="decimal"/>
       <w:lvlText w:val=""/>
       <w:lvlJc w:val="left"/>
     </w:lvl>
-    <w:lvl w:ilvl="3" w:tplc="8050E5EA">
+    <w:lvl w:ilvl="3" w:tplc="F050DD50">
       <w:numFmt w:val="decimal"/>
       <w:lvlText w:val=""/>
       <w:lvlJc w:val="left"/>
     </w:lvl>
-    <w:lvl w:ilvl="4" w:tplc="F6C0D28C">
+    <w:lvl w:ilvl="4" w:tplc="DAC2EC8E">
       <w:numFmt w:val="decimal"/>
       <w:lvlText w:val=""/>
       <w:lvlJc w:val="left"/>
     </w:lvl>
-    <w:lvl w:ilvl="5" w:tplc="EF181C7C">
+    <w:lvl w:ilvl="5" w:tplc="826613D0">
       <w:numFmt w:val="decimal"/>
       <w:lvlText w:val=""/>
       <w:lvlJc w:val="left"/>
     </w:lvl>
-    <w:lvl w:ilvl="6" w:tplc="3EBAD72E">
+    <w:lvl w:ilvl="6" w:tplc="9440EE62">
       <w:numFmt w:val="decimal"/>
       <w:lvlText w:val=""/>
       <w:lvlJc w:val="left"/>
     </w:lvl>
-    <w:lvl w:ilvl="7" w:tplc="92425DC2">
+    <w:lvl w:ilvl="7" w:tplc="ECB6BA84">
       <w:numFmt w:val="decimal"/>
       <w:lvlText w:val=""/>
       <w:lvlJc w:val="left"/>
     </w:lvl>
-    <w:lvl w:ilvl="8" w:tplc="53C896F8">
+    <w:lvl w:ilvl="8" w:tplc="0B6EE5D4">
       <w:numFmt w:val="decimal"/>
       <w:lvlText w:val=""/>
       <w:lvlJc w:val="left"/>
     </w:lvl>
   </w:abstractNum>
   <w:abstractNum w:abstractNumId="5" w15:restartNumberingAfterBreak="0">
-    <w:nsid w:val="6A4E06BB"/>
+    <w:nsid w:val="33E21232"/>
     <w:multiLevelType w:val="hybridMultilevel"/>
-    <w:tmpl w:val="14F6A3A4"/>
-    <w:lvl w:ilvl="0" w:tplc="5E7C1B36" w:tentative="1">
+    <w:tmpl w:val="58620AB4"/>
+    <w:lvl w:ilvl="0" w:tplc="0276B450">
       <w:start w:val="1"/>
       <w:numFmt w:val="bullet"/>
-      <w:lvlText w:val="●"/>
+      <w:lvlText w:val="•"/>
       <w:lvlJc w:val="left"/>
       <w:pPr>
-        <w:ind w:left="720" w:hanging="360"/>
+        <w:ind w:left="540" w:hanging="300"/>
       </w:pPr>
     </w:lvl>
-    <w:lvl w:ilvl="1" w:tplc="577808B8" w:tentative="1">
+    <w:lvl w:ilvl="1" w:tplc="CE52B22A">
       <w:start w:val="1"/>
       <w:numFmt w:val="bullet"/>
-      <w:lvlText w:val="○"/>
+      <w:lvlText w:val="–"/>
       <w:lvlJc w:val="left"/>
       <w:pPr>
-        <w:ind w:left="1440" w:hanging="360"/>
+        <w:ind w:left="1000" w:hanging="300"/>
       </w:pPr>
     </w:lvl>
-    <w:lvl w:ilvl="2" w:tplc="E304C63C" w:tentative="1">
-      <w:start w:val="1"/>
-      <w:numFmt w:val="bullet"/>
-      <w:lvlText w:val="■"/>
+    <w:lvl w:ilvl="2" w:tplc="72B2A52A">
+      <w:numFmt w:val="decimal"/>
+      <w:lvlText w:val=""/>
       <w:lvlJc w:val="left"/>
-      <w:pPr>
-        <w:ind w:left="2160" w:hanging="360"/>
-      </w:pPr>
     </w:lvl>
-    <w:lvl w:ilvl="3" w:tplc="92066B46" w:tentative="1">
-      <w:start w:val="1"/>
-      <w:numFmt w:val="bullet"/>
-      <w:lvlText w:val="●"/>
+    <w:lvl w:ilvl="3" w:tplc="EA1AAFDA">
+      <w:numFmt w:val="decimal"/>
+      <w:lvlText w:val=""/>
       <w:lvlJc w:val="left"/>
-      <w:pPr>
-        <w:ind w:left="2880" w:hanging="360"/>
-      </w:pPr>
     </w:lvl>
-    <w:lvl w:ilvl="4" w:tplc="D1E4D7D8" w:tentative="1">
-      <w:start w:val="1"/>
-      <w:numFmt w:val="bullet"/>
-      <w:lvlText w:val="○"/>
+    <w:lvl w:ilvl="4" w:tplc="AD2CF358">
+      <w:numFmt w:val="decimal"/>
+      <w:lvlText w:val=""/>
       <w:lvlJc w:val="left"/>
-      <w:pPr>
-        <w:ind w:left="3600" w:hanging="360"/>
-      </w:pPr>
     </w:lvl>
-    <w:lvl w:ilvl="5" w:tplc="3118B50A" w:tentative="1">
-      <w:start w:val="1"/>
-      <w:numFmt w:val="bullet"/>
-      <w:lvlText w:val="■"/>
+    <w:lvl w:ilvl="5" w:tplc="0568B4B0">
+      <w:numFmt w:val="decimal"/>
+      <w:lvlText w:val=""/>
       <w:lvlJc w:val="left"/>
-      <w:pPr>
-        <w:ind w:left="4320" w:hanging="360"/>
-      </w:pPr>
     </w:lvl>
-    <w:lvl w:ilvl="6" w:tplc="EB4A308C" w:tentative="1">
-      <w:start w:val="1"/>
-      <w:numFmt w:val="bullet"/>
-      <w:lvlText w:val="●"/>
+    <w:lvl w:ilvl="6" w:tplc="6D00026C">
+      <w:numFmt w:val="decimal"/>
+      <w:lvlText w:val=""/>
       <w:lvlJc w:val="left"/>
-      <w:pPr>
-        <w:ind w:left="5040" w:hanging="360"/>
-      </w:pPr>
     </w:lvl>
-    <w:lvl w:ilvl="7" w:tplc="BE3C9B06" w:tentative="1">
-      <w:start w:val="1"/>
-      <w:numFmt w:val="bullet"/>
-      <w:lvlText w:val="●"/>
+    <w:lvl w:ilvl="7" w:tplc="648A8DFC">
+      <w:numFmt w:val="decimal"/>
+      <w:lvlText w:val=""/>
       <w:lvlJc w:val="left"/>
-      <w:pPr>
-        <w:ind w:left="5760" w:hanging="360"/>
-      </w:pPr>
     </w:lvl>
-    <w:lvl w:ilvl="8" w:tplc="9B1C0AC0" w:tentative="1">
-      <w:start w:val="1"/>
-      <w:numFmt w:val="bullet"/>
-      <w:lvlText w:val="●"/>
+    <w:lvl w:ilvl="8" w:tplc="84869840">
+      <w:numFmt w:val="decimal"/>
+      <w:lvlText w:val=""/>
       <w:lvlJc w:val="left"/>
-      <w:pPr>
-        <w:ind w:left="6480" w:hanging="360"/>
-      </w:pPr>
     </w:lvl>
   </w:abstractNum>
   <w:abstractNum w:abstractNumId="6" w15:restartNumberingAfterBreak="0">
-    <w:nsid w:val="6E186350"/>
+    <w:nsid w:val="4366517E"/>
     <w:multiLevelType w:val="hybridMultilevel"/>
-    <w:tmpl w:val="94CA9A4A"/>
-    <w:lvl w:ilvl="0" w:tplc="815A02F8">
+    <w:tmpl w:val="1982FEDE"/>
+    <w:lvl w:ilvl="0" w:tplc="5978E870">
       <w:start w:val="1"/>
       <w:numFmt w:val="decimal"/>
       <w:lvlText w:val="%1."/>
@@ -14838,52 +14748,52 @@
         <w:ind w:left="540" w:hanging="300"/>
       </w:pPr>
     </w:lvl>
-    <w:lvl w:ilvl="1" w:tplc="3C167C50">
+    <w:lvl w:ilvl="1" w:tplc="D9261498">
       <w:numFmt w:val="decimal"/>
       <w:lvlText w:val=""/>
       <w:lvlJc w:val="left"/>
     </w:lvl>
-    <w:lvl w:ilvl="2" w:tplc="7548AD86">
+    <w:lvl w:ilvl="2" w:tplc="521ED846">
       <w:numFmt w:val="decimal"/>
       <w:lvlText w:val=""/>
       <w:lvlJc w:val="left"/>
     </w:lvl>
-    <w:lvl w:ilvl="3" w:tplc="809C82F2">
+    <w:lvl w:ilvl="3" w:tplc="AF1094FA">
       <w:numFmt w:val="decimal"/>
       <w:lvlText w:val=""/>
       <w:lvlJc w:val="left"/>
     </w:lvl>
-    <w:lvl w:ilvl="4" w:tplc="1FA8B458">
+    <w:lvl w:ilvl="4" w:tplc="CDBE9160">
       <w:numFmt w:val="decimal"/>
       <w:lvlText w:val=""/>
       <w:lvlJc w:val="left"/>
     </w:lvl>
-    <w:lvl w:ilvl="5" w:tplc="05E20FEC">
+    <w:lvl w:ilvl="5" w:tplc="71B0F154">
       <w:numFmt w:val="decimal"/>
       <w:lvlText w:val=""/>
       <w:lvlJc w:val="left"/>
     </w:lvl>
-    <w:lvl w:ilvl="6" w:tplc="27F42B50">
+    <w:lvl w:ilvl="6" w:tplc="CF34A87C">
       <w:numFmt w:val="decimal"/>
       <w:lvlText w:val=""/>
       <w:lvlJc w:val="left"/>
     </w:lvl>
-    <w:lvl w:ilvl="7" w:tplc="05108004">
+    <w:lvl w:ilvl="7" w:tplc="3F7496E2">
       <w:numFmt w:val="decimal"/>
       <w:lvlText w:val=""/>
       <w:lvlJc w:val="left"/>
     </w:lvl>
-    <w:lvl w:ilvl="8" w:tplc="9388485A">
+    <w:lvl w:ilvl="8" w:tplc="C3867C72">
       <w:numFmt w:val="decimal"/>
       <w:lvlText w:val=""/>
       <w:lvlJc w:val="left"/>
     </w:lvl>
   </w:abstractNum>
   <w:abstractNum w:abstractNumId="7" w15:restartNumberingAfterBreak="0">
-    <w:nsid w:val="78D14C14"/>
+    <w:nsid w:val="4D81181A"/>
     <w:multiLevelType w:val="hybridMultilevel"/>
-    <w:tmpl w:val="BA980F3A"/>
-    <w:lvl w:ilvl="0" w:tplc="82B25C82">
+    <w:tmpl w:val="BD26CA88"/>
+    <w:lvl w:ilvl="0" w:tplc="5E52F4CA">
       <w:start w:val="1"/>
       <w:numFmt w:val="decimal"/>
       <w:lvlText w:val="%1."/>
@@ -14892,52 +14802,52 @@
         <w:ind w:left="540" w:hanging="300"/>
       </w:pPr>
     </w:lvl>
-    <w:lvl w:ilvl="1" w:tplc="525AC1C6">
+    <w:lvl w:ilvl="1" w:tplc="869ED204">
       <w:numFmt w:val="decimal"/>
       <w:lvlText w:val=""/>
       <w:lvlJc w:val="left"/>
     </w:lvl>
-    <w:lvl w:ilvl="2" w:tplc="83D066FE">
+    <w:lvl w:ilvl="2" w:tplc="A3742E7A">
       <w:numFmt w:val="decimal"/>
       <w:lvlText w:val=""/>
       <w:lvlJc w:val="left"/>
     </w:lvl>
-    <w:lvl w:ilvl="3" w:tplc="96B2ACB6">
+    <w:lvl w:ilvl="3" w:tplc="5EC87D30">
       <w:numFmt w:val="decimal"/>
       <w:lvlText w:val=""/>
       <w:lvlJc w:val="left"/>
     </w:lvl>
-    <w:lvl w:ilvl="4" w:tplc="65EED440">
+    <w:lvl w:ilvl="4" w:tplc="08AC23D2">
       <w:numFmt w:val="decimal"/>
       <w:lvlText w:val=""/>
       <w:lvlJc w:val="left"/>
     </w:lvl>
-    <w:lvl w:ilvl="5" w:tplc="2E361AF4">
+    <w:lvl w:ilvl="5" w:tplc="B518D214">
       <w:numFmt w:val="decimal"/>
       <w:lvlText w:val=""/>
       <w:lvlJc w:val="left"/>
     </w:lvl>
-    <w:lvl w:ilvl="6" w:tplc="7E8AD502">
+    <w:lvl w:ilvl="6" w:tplc="EA3C85E0">
       <w:numFmt w:val="decimal"/>
       <w:lvlText w:val=""/>
       <w:lvlJc w:val="left"/>
     </w:lvl>
-    <w:lvl w:ilvl="7" w:tplc="4C0A9094">
+    <w:lvl w:ilvl="7" w:tplc="42947CB4">
       <w:numFmt w:val="decimal"/>
       <w:lvlText w:val=""/>
       <w:lvlJc w:val="left"/>
     </w:lvl>
-    <w:lvl w:ilvl="8" w:tplc="E58A98BA">
+    <w:lvl w:ilvl="8" w:tplc="775C6B6E">
       <w:numFmt w:val="decimal"/>
       <w:lvlText w:val=""/>
       <w:lvlJc w:val="left"/>
     </w:lvl>
   </w:abstractNum>
   <w:abstractNum w:abstractNumId="8" w15:restartNumberingAfterBreak="0">
-    <w:nsid w:val="7A2D6826"/>
+    <w:nsid w:val="4E6536F0"/>
     <w:multiLevelType w:val="hybridMultilevel"/>
-    <w:tmpl w:val="9A7C01F8"/>
-    <w:lvl w:ilvl="0" w:tplc="D5EA12AA">
+    <w:tmpl w:val="C47A30A6"/>
+    <w:lvl w:ilvl="0" w:tplc="DF42668C">
       <w:start w:val="1"/>
       <w:numFmt w:val="decimal"/>
       <w:lvlText w:val="%1."/>
@@ -14946,52 +14856,52 @@
         <w:ind w:left="540" w:hanging="300"/>
       </w:pPr>
     </w:lvl>
-    <w:lvl w:ilvl="1" w:tplc="802EC8E8">
+    <w:lvl w:ilvl="1" w:tplc="929AC4F0">
       <w:numFmt w:val="decimal"/>
       <w:lvlText w:val=""/>
       <w:lvlJc w:val="left"/>
     </w:lvl>
-    <w:lvl w:ilvl="2" w:tplc="F9FE1330">
+    <w:lvl w:ilvl="2" w:tplc="B32C3604">
       <w:numFmt w:val="decimal"/>
       <w:lvlText w:val=""/>
       <w:lvlJc w:val="left"/>
     </w:lvl>
-    <w:lvl w:ilvl="3" w:tplc="678CC16E">
+    <w:lvl w:ilvl="3" w:tplc="95DCA7CC">
       <w:numFmt w:val="decimal"/>
       <w:lvlText w:val=""/>
       <w:lvlJc w:val="left"/>
     </w:lvl>
-    <w:lvl w:ilvl="4" w:tplc="375055FC">
+    <w:lvl w:ilvl="4" w:tplc="CFB87C36">
       <w:numFmt w:val="decimal"/>
       <w:lvlText w:val=""/>
       <w:lvlJc w:val="left"/>
     </w:lvl>
-    <w:lvl w:ilvl="5" w:tplc="3D44D2A4">
+    <w:lvl w:ilvl="5" w:tplc="A3E4DF22">
       <w:numFmt w:val="decimal"/>
       <w:lvlText w:val=""/>
       <w:lvlJc w:val="left"/>
     </w:lvl>
-    <w:lvl w:ilvl="6" w:tplc="56741720">
+    <w:lvl w:ilvl="6" w:tplc="9760E2B6">
       <w:numFmt w:val="decimal"/>
       <w:lvlText w:val=""/>
       <w:lvlJc w:val="left"/>
     </w:lvl>
-    <w:lvl w:ilvl="7" w:tplc="9BBABF26">
+    <w:lvl w:ilvl="7" w:tplc="19B69C82">
       <w:numFmt w:val="decimal"/>
       <w:lvlText w:val=""/>
       <w:lvlJc w:val="left"/>
     </w:lvl>
-    <w:lvl w:ilvl="8" w:tplc="C994C00C">
+    <w:lvl w:ilvl="8" w:tplc="D0E8F994">
       <w:numFmt w:val="decimal"/>
       <w:lvlText w:val=""/>
       <w:lvlJc w:val="left"/>
     </w:lvl>
   </w:abstractNum>
   <w:abstractNum w:abstractNumId="9" w15:restartNumberingAfterBreak="0">
-    <w:nsid w:val="7B774B43"/>
+    <w:nsid w:val="652B778A"/>
     <w:multiLevelType w:val="hybridMultilevel"/>
-    <w:tmpl w:val="0CF2DD90"/>
-    <w:lvl w:ilvl="0" w:tplc="90C2C71E">
+    <w:tmpl w:val="552AB7F0"/>
+    <w:lvl w:ilvl="0" w:tplc="140097CC">
       <w:start w:val="1"/>
       <w:numFmt w:val="decimal"/>
       <w:lvlText w:val="%1."/>
@@ -15000,163 +14910,195 @@
         <w:ind w:left="540" w:hanging="300"/>
       </w:pPr>
     </w:lvl>
-    <w:lvl w:ilvl="1" w:tplc="48AC6F4C">
+    <w:lvl w:ilvl="1" w:tplc="F1A29724">
       <w:numFmt w:val="decimal"/>
       <w:lvlText w:val=""/>
       <w:lvlJc w:val="left"/>
     </w:lvl>
-    <w:lvl w:ilvl="2" w:tplc="4100FB42">
+    <w:lvl w:ilvl="2" w:tplc="C47C4548">
       <w:numFmt w:val="decimal"/>
       <w:lvlText w:val=""/>
       <w:lvlJc w:val="left"/>
     </w:lvl>
-    <w:lvl w:ilvl="3" w:tplc="9B3CEE32">
+    <w:lvl w:ilvl="3" w:tplc="68421D34">
       <w:numFmt w:val="decimal"/>
       <w:lvlText w:val=""/>
       <w:lvlJc w:val="left"/>
     </w:lvl>
-    <w:lvl w:ilvl="4" w:tplc="9DE61218">
+    <w:lvl w:ilvl="4" w:tplc="DE4A66BE">
       <w:numFmt w:val="decimal"/>
       <w:lvlText w:val=""/>
       <w:lvlJc w:val="left"/>
     </w:lvl>
-    <w:lvl w:ilvl="5" w:tplc="906CF3B0">
+    <w:lvl w:ilvl="5" w:tplc="F824069E">
       <w:numFmt w:val="decimal"/>
       <w:lvlText w:val=""/>
       <w:lvlJc w:val="left"/>
     </w:lvl>
-    <w:lvl w:ilvl="6" w:tplc="4A78723E">
+    <w:lvl w:ilvl="6" w:tplc="3D0428DA">
       <w:numFmt w:val="decimal"/>
       <w:lvlText w:val=""/>
       <w:lvlJc w:val="left"/>
     </w:lvl>
-    <w:lvl w:ilvl="7" w:tplc="51C465D4">
+    <w:lvl w:ilvl="7" w:tplc="7B201644">
       <w:numFmt w:val="decimal"/>
       <w:lvlText w:val=""/>
       <w:lvlJc w:val="left"/>
     </w:lvl>
-    <w:lvl w:ilvl="8" w:tplc="CB7A99B6">
+    <w:lvl w:ilvl="8" w:tplc="89CE2824">
       <w:numFmt w:val="decimal"/>
       <w:lvlText w:val=""/>
       <w:lvlJc w:val="left"/>
     </w:lvl>
   </w:abstractNum>
   <w:abstractNum w:abstractNumId="10" w15:restartNumberingAfterBreak="0">
-    <w:nsid w:val="7DD22259"/>
+    <w:nsid w:val="762B16DF"/>
     <w:multiLevelType w:val="hybridMultilevel"/>
-    <w:tmpl w:val="D28AB150"/>
-    <w:lvl w:ilvl="0" w:tplc="F8E873FA">
+    <w:tmpl w:val="D800199E"/>
+    <w:lvl w:ilvl="0" w:tplc="222C33DC" w:tentative="1">
       <w:start w:val="1"/>
-      <w:numFmt w:val="decimal"/>
-      <w:lvlText w:val="%1."/>
+      <w:numFmt w:val="bullet"/>
+      <w:lvlText w:val="●"/>
       <w:lvlJc w:val="left"/>
       <w:pPr>
-        <w:ind w:left="540" w:hanging="300"/>
+        <w:ind w:left="720" w:hanging="360"/>
       </w:pPr>
     </w:lvl>
-    <w:lvl w:ilvl="1" w:tplc="E0128F54">
-      <w:numFmt w:val="decimal"/>
-      <w:lvlText w:val=""/>
+    <w:lvl w:ilvl="1" w:tplc="D2DCC418" w:tentative="1">
+      <w:start w:val="1"/>
+      <w:numFmt w:val="bullet"/>
+      <w:lvlText w:val="○"/>
       <w:lvlJc w:val="left"/>
+      <w:pPr>
+        <w:ind w:left="1440" w:hanging="360"/>
+      </w:pPr>
     </w:lvl>
-    <w:lvl w:ilvl="2" w:tplc="11AA09E6">
-      <w:numFmt w:val="decimal"/>
-      <w:lvlText w:val=""/>
+    <w:lvl w:ilvl="2" w:tplc="7BAE320C" w:tentative="1">
+      <w:start w:val="1"/>
+      <w:numFmt w:val="bullet"/>
+      <w:lvlText w:val="■"/>
       <w:lvlJc w:val="left"/>
+      <w:pPr>
+        <w:ind w:left="2160" w:hanging="360"/>
+      </w:pPr>
     </w:lvl>
-    <w:lvl w:ilvl="3" w:tplc="281E4A36">
-      <w:numFmt w:val="decimal"/>
-      <w:lvlText w:val=""/>
+    <w:lvl w:ilvl="3" w:tplc="85F220E4" w:tentative="1">
+      <w:start w:val="1"/>
+      <w:numFmt w:val="bullet"/>
+      <w:lvlText w:val="●"/>
       <w:lvlJc w:val="left"/>
+      <w:pPr>
+        <w:ind w:left="2880" w:hanging="360"/>
+      </w:pPr>
     </w:lvl>
-    <w:lvl w:ilvl="4" w:tplc="5C30132A">
-      <w:numFmt w:val="decimal"/>
-      <w:lvlText w:val=""/>
+    <w:lvl w:ilvl="4" w:tplc="447EE4FE" w:tentative="1">
+      <w:start w:val="1"/>
+      <w:numFmt w:val="bullet"/>
+      <w:lvlText w:val="○"/>
       <w:lvlJc w:val="left"/>
+      <w:pPr>
+        <w:ind w:left="3600" w:hanging="360"/>
+      </w:pPr>
     </w:lvl>
-    <w:lvl w:ilvl="5" w:tplc="A6F813BA">
-      <w:numFmt w:val="decimal"/>
-      <w:lvlText w:val=""/>
+    <w:lvl w:ilvl="5" w:tplc="71DA239E" w:tentative="1">
+      <w:start w:val="1"/>
+      <w:numFmt w:val="bullet"/>
+      <w:lvlText w:val="■"/>
       <w:lvlJc w:val="left"/>
+      <w:pPr>
+        <w:ind w:left="4320" w:hanging="360"/>
+      </w:pPr>
     </w:lvl>
-    <w:lvl w:ilvl="6" w:tplc="45BC8B1C">
-      <w:numFmt w:val="decimal"/>
-      <w:lvlText w:val=""/>
+    <w:lvl w:ilvl="6" w:tplc="CFBE41CA" w:tentative="1">
+      <w:start w:val="1"/>
+      <w:numFmt w:val="bullet"/>
+      <w:lvlText w:val="●"/>
       <w:lvlJc w:val="left"/>
+      <w:pPr>
+        <w:ind w:left="5040" w:hanging="360"/>
+      </w:pPr>
     </w:lvl>
-    <w:lvl w:ilvl="7" w:tplc="39747316">
-      <w:numFmt w:val="decimal"/>
-      <w:lvlText w:val=""/>
+    <w:lvl w:ilvl="7" w:tplc="72D4C660" w:tentative="1">
+      <w:start w:val="1"/>
+      <w:numFmt w:val="bullet"/>
+      <w:lvlText w:val="●"/>
       <w:lvlJc w:val="left"/>
+      <w:pPr>
+        <w:ind w:left="5760" w:hanging="360"/>
+      </w:pPr>
     </w:lvl>
-    <w:lvl w:ilvl="8" w:tplc="AA44A20E">
-      <w:numFmt w:val="decimal"/>
-      <w:lvlText w:val=""/>
+    <w:lvl w:ilvl="8" w:tplc="DE70EFF0" w:tentative="1">
+      <w:start w:val="1"/>
+      <w:numFmt w:val="bullet"/>
+      <w:lvlText w:val="●"/>
       <w:lvlJc w:val="left"/>
+      <w:pPr>
+        <w:ind w:left="6480" w:hanging="360"/>
+      </w:pPr>
     </w:lvl>
   </w:abstractNum>
-  <w:num w:numId="1" w16cid:durableId="796143472">
+  <w:num w:numId="1" w16cid:durableId="1031298265">
+    <w:abstractNumId w:val="10"/>
+    <w:lvlOverride w:ilvl="0">
+      <w:startOverride w:val="1"/>
+    </w:lvlOverride>
+  </w:num>
+  <w:num w:numId="2" w16cid:durableId="1456413974">
     <w:abstractNumId w:val="5"/>
     <w:lvlOverride w:ilvl="0">
       <w:startOverride w:val="1"/>
     </w:lvlOverride>
   </w:num>
-  <w:num w:numId="2" w16cid:durableId="1594045873">
+  <w:num w:numId="3" w16cid:durableId="1062756855">
+    <w:abstractNumId w:val="0"/>
+    <w:lvlOverride w:ilvl="0">
+      <w:startOverride w:val="1"/>
+    </w:lvlOverride>
+  </w:num>
+  <w:num w:numId="4" w16cid:durableId="272711391">
+    <w:abstractNumId w:val="7"/>
+    <w:lvlOverride w:ilvl="0">
+      <w:startOverride w:val="1"/>
+    </w:lvlOverride>
+  </w:num>
+  <w:num w:numId="5" w16cid:durableId="500852243">
+    <w:abstractNumId w:val="9"/>
+    <w:lvlOverride w:ilvl="0">
+      <w:startOverride w:val="1"/>
+    </w:lvlOverride>
+  </w:num>
+  <w:num w:numId="6" w16cid:durableId="1313603724">
+    <w:abstractNumId w:val="2"/>
+    <w:lvlOverride w:ilvl="0">
+      <w:startOverride w:val="1"/>
+    </w:lvlOverride>
+  </w:num>
+  <w:num w:numId="7" w16cid:durableId="1897427928">
+    <w:abstractNumId w:val="1"/>
+    <w:lvlOverride w:ilvl="0">
+      <w:startOverride w:val="1"/>
+    </w:lvlOverride>
+  </w:num>
+  <w:num w:numId="8" w16cid:durableId="137576063">
     <w:abstractNumId w:val="3"/>
     <w:lvlOverride w:ilvl="0">
       <w:startOverride w:val="1"/>
     </w:lvlOverride>
   </w:num>
-  <w:num w:numId="3" w16cid:durableId="2111506402">
+  <w:num w:numId="9" w16cid:durableId="1841843786">
     <w:abstractNumId w:val="6"/>
     <w:lvlOverride w:ilvl="0">
       <w:startOverride w:val="1"/>
     </w:lvlOverride>
   </w:num>
-  <w:num w:numId="4" w16cid:durableId="165413014">
-    <w:abstractNumId w:val="0"/>
-    <w:lvlOverride w:ilvl="0">
-      <w:startOverride w:val="1"/>
-    </w:lvlOverride>
-  </w:num>
-  <w:num w:numId="5" w16cid:durableId="1279608327">
-    <w:abstractNumId w:val="8"/>
-    <w:lvlOverride w:ilvl="0">
-      <w:startOverride w:val="1"/>
-    </w:lvlOverride>
-  </w:num>
-  <w:num w:numId="6" w16cid:durableId="1859076834">
-    <w:abstractNumId w:val="7"/>
-    <w:lvlOverride w:ilvl="0">
-      <w:startOverride w:val="1"/>
-    </w:lvlOverride>
-  </w:num>
-  <w:num w:numId="7" w16cid:durableId="214778169">
-    <w:abstractNumId w:val="10"/>
-    <w:lvlOverride w:ilvl="0">
-      <w:startOverride w:val="1"/>
-    </w:lvlOverride>
-  </w:num>
-  <w:num w:numId="8" w16cid:durableId="1206913709">
-    <w:abstractNumId w:val="1"/>
-    <w:lvlOverride w:ilvl="0">
-      <w:startOverride w:val="1"/>
-    </w:lvlOverride>
-  </w:num>
-  <w:num w:numId="9" w16cid:durableId="1599144872">
-    <w:abstractNumId w:val="2"/>
-    <w:lvlOverride w:ilvl="0">
-      <w:startOverride w:val="1"/>
-    </w:lvlOverride>
-  </w:num>
-  <w:num w:numId="10" w16cid:durableId="2058815368">
+  <w:num w:numId="10" w16cid:durableId="967124078">
     <w:abstractNumId w:val="4"/>
     <w:lvlOverride w:ilvl="0">
       <w:startOverride w:val="1"/>
     </w:lvlOverride>
   </w:num>
-  <w:num w:numId="11" w16cid:durableId="956833568">
-    <w:abstractNumId w:val="9"/>
+  <w:num w:numId="11" w16cid:durableId="830146824">
+    <w:abstractNumId w:val="8"/>
     <w:lvlOverride w:ilvl="0">
       <w:startOverride w:val="1"/>
     </w:lvlOverride>
@@ -15796,7 +15738,7 @@
     <w:autoRedefine/>
     <w:uiPriority w:val="39"/>
     <w:unhideWhenUsed/>
-    <w:rsid w:val="00D855EA"/>
+    <w:rsid w:val="00386DC3"/>
     <w:pPr>
       <w:spacing w:after="100"/>
     </w:pPr>
@@ -15808,7 +15750,7 @@
     <w:autoRedefine/>
     <w:uiPriority w:val="39"/>
     <w:unhideWhenUsed/>
-    <w:rsid w:val="00D855EA"/>
+    <w:rsid w:val="00386DC3"/>
     <w:pPr>
       <w:spacing w:after="100"/>
       <w:ind w:left="220"/>

</xml_diff>